<commit_message>
crew 1.0: onboard and migrate generate path-scoped rules
crew_instructions.py rules had no caller. /crew:onboard (step 6, also after
--refresh) and /crew:migrate (--check in preview, generation after --apply)
now run it. check_instructions.py reports a hand-written file at a generated
rule path under its own label instead of as drift. Tests run the exact
command lines from the command files against fixture repos.
</commit_message>
<xml_diff>
--- a/docs/guides/crew/crew-1.0-memory-and-obsidian.docx
+++ b/docs/guides/crew/crew-1.0-memory-and-obsidian.docx
@@ -2286,14 +2286,268 @@
     </w:p>
     <w:p>
       <w:pPr>
+        <w:pStyle w:val="Heading3"/>
+        <w:bidi w:val="0"/>
+        <w:ind w:hanging="0" w:left="0" w:right="0"/>
+        <w:jc w:val="left"/>
+        <w:rPr/>
+      </w:pPr>
+      <w:bookmarkStart w:id="11" w:name="path-scoped-rules-from-the-code-map"/>
+      <w:bookmarkEnd w:id="11"/>
+      <w:r>
+        <w:rPr/>
+        <w:t>Path-Scoped Rules from the Code Map</w:t>
+      </w:r>
+    </w:p>
+    <w:p>
+      <w:pPr>
+        <w:pStyle w:val="BodyText"/>
+        <w:bidi w:val="0"/>
+        <w:jc w:val="left"/>
+        <w:rPr/>
+      </w:pPr>
+      <w:r>
+        <w:rPr/>
+        <w:t xml:space="preserve">The code map also reaches a session with no hook at all, as </w:t>
+      </w:r>
+      <w:r>
+        <w:rPr>
+          <w:rStyle w:val="SourceText"/>
+        </w:rPr>
+        <w:t>.claude/rules/&lt;subsystem&gt;.md</w:t>
+      </w:r>
+      <w:r>
+        <w:rPr/>
+        <w:t xml:space="preserve"> files:</w:t>
+      </w:r>
+    </w:p>
+    <w:p>
+      <w:pPr>
+        <w:pStyle w:val="BodyText"/>
+        <w:numPr>
+          <w:ilvl w:val="0"/>
+          <w:numId w:val="3"/>
+        </w:numPr>
+        <w:tabs>
+          <w:tab w:val="clear" w:pos="1134"/>
+          <w:tab w:val="left" w:pos="829" w:leader="none"/>
+        </w:tabs>
+        <w:bidi w:val="0"/>
+        <w:spacing w:before="120" w:after="0"/>
+        <w:ind w:hanging="283" w:left="829"/>
+        <w:jc w:val="left"/>
+        <w:rPr/>
+      </w:pPr>
+      <w:r>
+        <w:rPr>
+          <w:rStyle w:val="Strong"/>
+        </w:rPr>
+        <w:t xml:space="preserve">Generated by </w:t>
+      </w:r>
+      <w:r>
+        <w:rPr>
+          <w:rStyle w:val="SourceText"/>
+        </w:rPr>
+        <w:t>/crew:onboard</w:t>
+      </w:r>
+      <w:r>
+        <w:rPr>
+          <w:rStyle w:val="Strong"/>
+        </w:rPr>
+        <w:t xml:space="preserve"> and </w:t>
+      </w:r>
+      <w:r>
+        <w:rPr>
+          <w:rStyle w:val="SourceText"/>
+        </w:rPr>
+        <w:t>/crew:migrate</w:t>
+      </w:r>
+      <w:r>
+        <w:rPr>
+          <w:rStyle w:val="Strong"/>
+        </w:rPr>
+        <w:t>.</w:t>
+      </w:r>
+      <w:r>
+        <w:rPr/>
+        <w:t xml:space="preserve"> After it writes or refreshes a note, </w:t>
+      </w:r>
+      <w:r>
+        <w:rPr>
+          <w:rStyle w:val="SourceText"/>
+        </w:rPr>
+        <w:t>/crew:onboard</w:t>
+      </w:r>
+      <w:r>
+        <w:rPr/>
+        <w:t xml:space="preserve"> (including </w:t>
+      </w:r>
+      <w:r>
+        <w:rPr>
+          <w:rStyle w:val="SourceText"/>
+        </w:rPr>
+        <w:t>--refresh &lt;subsystem&gt;</w:t>
+      </w:r>
+      <w:r>
+        <w:rPr/>
+        <w:t xml:space="preserve">) runs </w:t>
+      </w:r>
+      <w:r>
+        <w:rPr>
+          <w:rStyle w:val="SourceText"/>
+        </w:rPr>
+        <w:t>crew_instructions.py rules</w:t>
+      </w:r>
+      <w:r>
+        <w:rPr/>
+        <w:t xml:space="preserve">. </w:t>
+      </w:r>
+      <w:r>
+        <w:rPr>
+          <w:rStyle w:val="SourceText"/>
+        </w:rPr>
+        <w:t>/crew:migrate</w:t>
+      </w:r>
+      <w:r>
+        <w:rPr/>
+        <w:t xml:space="preserve"> lists the rules in its preview and writes them after </w:t>
+      </w:r>
+      <w:r>
+        <w:rPr>
+          <w:rStyle w:val="SourceText"/>
+        </w:rPr>
+        <w:t>--apply</w:t>
+      </w:r>
+      <w:r>
+        <w:rPr/>
+        <w:t xml:space="preserve">. Each rule is at most 30 lines: a </w:t>
+      </w:r>
+      <w:r>
+        <w:rPr>
+          <w:rStyle w:val="SourceText"/>
+        </w:rPr>
+        <w:t>paths:</w:t>
+      </w:r>
+      <w:r>
+        <w:rPr/>
+        <w:t xml:space="preserve"> list, the note's landmines, and the sha256 of the note it came from. A hand-written file already at that path is reported and left alone. </w:t>
+      </w:r>
+    </w:p>
+    <w:p>
+      <w:pPr>
+        <w:pStyle w:val="BodyText"/>
+        <w:numPr>
+          <w:ilvl w:val="0"/>
+          <w:numId w:val="3"/>
+        </w:numPr>
+        <w:tabs>
+          <w:tab w:val="clear" w:pos="1134"/>
+          <w:tab w:val="left" w:pos="829" w:leader="none"/>
+        </w:tabs>
+        <w:bidi w:val="0"/>
+        <w:spacing w:before="120" w:after="0"/>
+        <w:ind w:hanging="283" w:left="829"/>
+        <w:jc w:val="left"/>
+        <w:rPr/>
+      </w:pPr>
+      <w:r>
+        <w:rPr>
+          <w:rStyle w:val="Strong"/>
+        </w:rPr>
+        <w:t>Loaded by Claude Code when a matching path is touched.</w:t>
+      </w:r>
+      <w:r>
+        <w:rPr/>
+        <w:t xml:space="preserve"> Claude Code's memory docs say a </w:t>
+      </w:r>
+      <w:r>
+        <w:rPr>
+          <w:rStyle w:val="SourceText"/>
+        </w:rPr>
+        <w:t>paths:</w:t>
+      </w:r>
+      <w:r>
+        <w:rPr/>
+        <w:t xml:space="preserve"> rule loads when Claude reads a file matching one of its patterns, so a subsystem's landmines arrive only in sessions that touch that subsystem. That is from the docs; this guide has not measured it. </w:t>
+      </w:r>
+    </w:p>
+    <w:p>
+      <w:pPr>
+        <w:pStyle w:val="BodyText"/>
+        <w:numPr>
+          <w:ilvl w:val="0"/>
+          <w:numId w:val="3"/>
+        </w:numPr>
+        <w:tabs>
+          <w:tab w:val="clear" w:pos="1134"/>
+          <w:tab w:val="left" w:pos="829" w:leader="none"/>
+        </w:tabs>
+        <w:bidi w:val="0"/>
+        <w:ind w:hanging="283" w:left="829"/>
+        <w:jc w:val="left"/>
+        <w:rPr/>
+      </w:pPr>
+      <w:r>
+        <w:rPr>
+          <w:rStyle w:val="Strong"/>
+        </w:rPr>
+        <w:t>Checked for drift in CI.</w:t>
+      </w:r>
+      <w:r>
+        <w:rPr/>
+        <w:t xml:space="preserve"> </w:t>
+      </w:r>
+      <w:r>
+        <w:rPr>
+          <w:rStyle w:val="SourceText"/>
+        </w:rPr>
+        <w:t>scripts/check_instructions.py</w:t>
+      </w:r>
+      <w:r>
+        <w:rPr/>
+        <w:t xml:space="preserve"> runs </w:t>
+      </w:r>
+      <w:r>
+        <w:rPr>
+          <w:rStyle w:val="SourceText"/>
+        </w:rPr>
+        <w:t>crew_instructions.py rules --check</w:t>
+      </w:r>
+      <w:r>
+        <w:rPr/>
+        <w:t xml:space="preserve">. A note edited without regenerating its rule fails as </w:t>
+      </w:r>
+      <w:r>
+        <w:rPr>
+          <w:rStyle w:val="SourceText"/>
+        </w:rPr>
+        <w:t>stale</w:t>
+      </w:r>
+      <w:r>
+        <w:rPr/>
+        <w:t xml:space="preserve">. A hand-written file at a generated path fails under its own label, not as drift. Commit the rules with the notes, and re-run </w:t>
+      </w:r>
+      <w:r>
+        <w:rPr>
+          <w:rStyle w:val="SourceText"/>
+        </w:rPr>
+        <w:t>/crew:onboard --refresh &lt;subsystem&gt;</w:t>
+      </w:r>
+      <w:r>
+        <w:rPr/>
+        <w:t xml:space="preserve"> to fix drift. </w:t>
+      </w:r>
+    </w:p>
+    <w:p>
+      <w:pPr>
         <w:pStyle w:val="Heading2"/>
         <w:bidi w:val="0"/>
         <w:ind w:hanging="0" w:left="0" w:right="0"/>
         <w:jc w:val="left"/>
         <w:rPr/>
       </w:pPr>
-      <w:bookmarkStart w:id="11" w:name="confirming-recall-reaches-your-sessions_"/>
-      <w:bookmarkEnd w:id="11"/>
+      <w:bookmarkStart w:id="12" w:name="confirming-recall-reaches-your-sessions_"/>
+      <w:bookmarkEnd w:id="12"/>
       <w:r>
         <w:rPr/>
         <w:t>Confirming Recall Reaches Your Sessions</w:t>
@@ -2373,14 +2627,76 @@
     </w:p>
     <w:p>
       <w:pPr>
+        <w:pStyle w:val="BodyText"/>
+        <w:bidi w:val="0"/>
+        <w:jc w:val="left"/>
+        <w:rPr/>
+      </w:pPr>
+      <w:r>
+        <w:rPr/>
+        <w:t xml:space="preserve">A third channel needs no hook: </w:t>
+      </w:r>
+      <w:r>
+        <w:rPr>
+          <w:rStyle w:val="SourceText"/>
+        </w:rPr>
+        <w:t>/crew:onboard</w:t>
+      </w:r>
+      <w:r>
+        <w:rPr/>
+        <w:t xml:space="preserve"> and </w:t>
+      </w:r>
+      <w:r>
+        <w:rPr>
+          <w:rStyle w:val="SourceText"/>
+        </w:rPr>
+        <w:t>/crew:migrate</w:t>
+      </w:r>
+      <w:r>
+        <w:rPr/>
+        <w:t xml:space="preserve"> generate </w:t>
+      </w:r>
+      <w:r>
+        <w:rPr>
+          <w:rStyle w:val="SourceText"/>
+        </w:rPr>
+        <w:t>.claude/rules/&lt;subsystem&gt;.md</w:t>
+      </w:r>
+      <w:r>
+        <w:rPr/>
+        <w:t xml:space="preserve"> from the same code map, and Claude Code loads each rule when a file matching its </w:t>
+      </w:r>
+      <w:r>
+        <w:rPr>
+          <w:rStyle w:val="SourceText"/>
+        </w:rPr>
+        <w:t>paths:</w:t>
+      </w:r>
+      <w:r>
+        <w:rPr/>
+        <w:t xml:space="preserve"> is read. This page does not test that channel; the drift check in </w:t>
+      </w:r>
+      <w:r>
+        <w:rPr>
+          <w:rStyle w:val="SourceText"/>
+        </w:rPr>
+        <w:t>scripts/check_instructions.py</w:t>
+      </w:r>
+      <w:r>
+        <w:rPr/>
+        <w:t xml:space="preserve"> covers whether the rules match their notes.</w:t>
+      </w:r>
+    </w:p>
+    <w:p>
+      <w:pPr>
         <w:pStyle w:val="Heading3"/>
         <w:bidi w:val="0"/>
         <w:ind w:hanging="0" w:left="0" w:right="0"/>
         <w:jc w:val="left"/>
         <w:rPr/>
       </w:pPr>
-      <w:bookmarkStart w:id="12" w:name="which-channel-reaches-which-agent"/>
-      <w:bookmarkEnd w:id="12"/>
+      <w:bookmarkStart w:id="13" w:name="which-channel-reaches-which-agent"/>
+      <w:bookmarkEnd w:id="13"/>
       <w:r>
         <w:rPr/>
         <w:t>Which Channel Reaches Which Agent</w:t>
@@ -2852,243 +3168,11 @@
         <w:jc w:val="left"/>
         <w:rPr/>
       </w:pPr>
-      <w:bookmarkStart w:id="13" w:name="where-recall-comes-from"/>
-      <w:bookmarkEnd w:id="13"/>
+      <w:bookmarkStart w:id="14" w:name="where-recall-comes-from"/>
+      <w:bookmarkEnd w:id="14"/>
       <w:r>
         <w:rPr/>
         <w:t>Where Recall Comes From</w:t>
-      </w:r>
-    </w:p>
-    <w:p>
-      <w:pPr>
-        <w:pStyle w:val="BodyText"/>
-        <w:numPr>
-          <w:ilvl w:val="0"/>
-          <w:numId w:val="3"/>
-        </w:numPr>
-        <w:tabs>
-          <w:tab w:val="clear" w:pos="1134"/>
-          <w:tab w:val="left" w:pos="829" w:leader="none"/>
-        </w:tabs>
-        <w:bidi w:val="0"/>
-        <w:spacing w:before="120" w:after="0"/>
-        <w:ind w:hanging="283" w:left="829"/>
-        <w:jc w:val="left"/>
-        <w:rPr/>
-      </w:pPr>
-      <w:r>
-        <w:rPr/>
-        <w:t xml:space="preserve">The vaults and their roles come from </w:t>
-      </w:r>
-      <w:r>
-        <w:rPr>
-          <w:rStyle w:val="SourceText"/>
-        </w:rPr>
-        <w:t>~/.claude/obsidian/config.json</w:t>
-      </w:r>
-      <w:r>
-        <w:rPr/>
-        <w:t xml:space="preserve">. Each vault has a </w:t>
-      </w:r>
-      <w:r>
-        <w:rPr>
-          <w:rStyle w:val="SourceText"/>
-        </w:rPr>
-        <w:t>role</w:t>
-      </w:r>
-      <w:r>
-        <w:rPr/>
-        <w:t xml:space="preserve">: </w:t>
-      </w:r>
-      <w:r>
-        <w:rPr>
-          <w:rStyle w:val="SourceText"/>
-        </w:rPr>
-        <w:t>primary</w:t>
-      </w:r>
-      <w:r>
-        <w:rPr/>
-        <w:t xml:space="preserve">, </w:t>
-      </w:r>
-      <w:r>
-        <w:rPr>
-          <w:rStyle w:val="SourceText"/>
-        </w:rPr>
-        <w:t>recall</w:t>
-      </w:r>
-      <w:r>
-        <w:rPr/>
-        <w:t xml:space="preserve"> or </w:t>
-      </w:r>
-      <w:r>
-        <w:rPr>
-          <w:rStyle w:val="SourceText"/>
-        </w:rPr>
-        <w:t>ignore</w:t>
-      </w:r>
-      <w:r>
-        <w:rPr/>
-        <w:t xml:space="preserve">. A vault with no role is </w:t>
-      </w:r>
-      <w:r>
-        <w:rPr>
-          <w:rStyle w:val="SourceText"/>
-        </w:rPr>
-        <w:t>primary</w:t>
-      </w:r>
-      <w:r>
-        <w:rPr/>
-        <w:t xml:space="preserve"> if it is the default and </w:t>
-      </w:r>
-      <w:r>
-        <w:rPr>
-          <w:rStyle w:val="SourceText"/>
-        </w:rPr>
-        <w:t>recall</w:t>
-      </w:r>
-      <w:r>
-        <w:rPr/>
-        <w:t xml:space="preserve"> otherwise. crew </w:t>
-      </w:r>
-      <w:r>
-        <w:rPr>
-          <w:rStyle w:val="Strong"/>
-        </w:rPr>
-        <w:t>never</w:t>
-      </w:r>
-      <w:r>
-        <w:rPr/>
-        <w:t xml:space="preserve"> asks an </w:t>
-      </w:r>
-      <w:r>
-        <w:rPr>
-          <w:rStyle w:val="SourceText"/>
-        </w:rPr>
-        <w:t>ignore</w:t>
-      </w:r>
-      <w:r>
-        <w:rPr/>
-        <w:t xml:space="preserve"> vault, even if the repo lists it. </w:t>
-      </w:r>
-    </w:p>
-    <w:p>
-      <w:pPr>
-        <w:pStyle w:val="BodyText"/>
-        <w:numPr>
-          <w:ilvl w:val="0"/>
-          <w:numId w:val="3"/>
-        </w:numPr>
-        <w:tabs>
-          <w:tab w:val="clear" w:pos="1134"/>
-          <w:tab w:val="left" w:pos="829" w:leader="none"/>
-        </w:tabs>
-        <w:bidi w:val="0"/>
-        <w:spacing w:before="120" w:after="0"/>
-        <w:ind w:hanging="283" w:left="829"/>
-        <w:jc w:val="left"/>
-        <w:rPr/>
-      </w:pPr>
-      <w:r>
-        <w:rPr/>
-        <w:t xml:space="preserve">A repo can set its own order in its crew config: </w:t>
-      </w:r>
-      <w:r>
-        <w:rPr>
-          <w:rStyle w:val="SourceText"/>
-        </w:rPr>
-        <w:t>memory.recall.vaults</w:t>
-      </w:r>
-      <w:r>
-        <w:rPr/>
-        <w:t xml:space="preserve"> (an ordered list of names) and </w:t>
-      </w:r>
-      <w:r>
-        <w:rPr>
-          <w:rStyle w:val="SourceText"/>
-        </w:rPr>
-        <w:t>memory.recall.maxChars</w:t>
-      </w:r>
-      <w:r>
-        <w:rPr/>
-        <w:t xml:space="preserve"> (default 800). Snippets come back in that vault order first, then in the order the search ranked them. </w:t>
-      </w:r>
-    </w:p>
-    <w:p>
-      <w:pPr>
-        <w:pStyle w:val="BodyText"/>
-        <w:numPr>
-          <w:ilvl w:val="0"/>
-          <w:numId w:val="3"/>
-        </w:numPr>
-        <w:tabs>
-          <w:tab w:val="clear" w:pos="1134"/>
-          <w:tab w:val="left" w:pos="829" w:leader="none"/>
-        </w:tabs>
-        <w:bidi w:val="0"/>
-        <w:spacing w:before="120" w:after="0"/>
-        <w:ind w:hanging="283" w:left="829"/>
-        <w:jc w:val="left"/>
-        <w:rPr/>
-      </w:pPr>
-      <w:r>
-        <w:rPr/>
-        <w:t xml:space="preserve">crew calls obsidian-vault's read-only CLI: </w:t>
-      </w:r>
-      <w:r>
-        <w:rPr>
-          <w:rStyle w:val="SourceText"/>
-        </w:rPr>
-        <w:t>vault_ops.py recall --query ... --vaults a,b --max-chars N --json</w:t>
-      </w:r>
-      <w:r>
-        <w:rPr/>
-        <w:t xml:space="preserve">. If the plugin is missing, or the CLI fails, times out or prints something other than JSON, the session goes on without recall and the log records a miss with the reason. </w:t>
-      </w:r>
-    </w:p>
-    <w:p>
-      <w:pPr>
-        <w:pStyle w:val="BodyText"/>
-        <w:numPr>
-          <w:ilvl w:val="0"/>
-          <w:numId w:val="3"/>
-        </w:numPr>
-        <w:tabs>
-          <w:tab w:val="clear" w:pos="1134"/>
-          <w:tab w:val="left" w:pos="829" w:leader="none"/>
-        </w:tabs>
-        <w:bidi w:val="0"/>
-        <w:ind w:hanging="283" w:left="829"/>
-        <w:jc w:val="left"/>
-        <w:rPr/>
-      </w:pPr>
-      <w:r>
-        <w:rPr/>
-        <w:t xml:space="preserve">Every recall line starts with the vault's name: </w:t>
-      </w:r>
-      <w:r>
-        <w:rPr>
-          <w:rStyle w:val="SourceText"/>
-        </w:rPr>
-        <w:t>- [vault:&lt;name&gt;] &lt;note path&gt;: &lt;text&gt;</w:t>
-      </w:r>
-      <w:r>
-        <w:rPr/>
-        <w:t xml:space="preserve">. Any snippet the CLI returns without a vault name is dropped. </w:t>
-      </w:r>
-    </w:p>
-    <w:p>
-      <w:pPr>
-        <w:pStyle w:val="Heading3"/>
-        <w:bidi w:val="0"/>
-        <w:ind w:hanging="0" w:left="0" w:right="0"/>
-        <w:jc w:val="left"/>
-        <w:rPr/>
-      </w:pPr>
-      <w:bookmarkStart w:id="14" w:name="the-seeded-note-proof"/>
-      <w:bookmarkEnd w:id="14"/>
-      <w:r>
-        <w:rPr/>
-        <w:t>The Seeded-Note Proof</w:t>
       </w:r>
     </w:p>
     <w:p>
@@ -3110,17 +3194,97 @@
       </w:pPr>
       <w:r>
         <w:rPr/>
-        <w:t xml:space="preserve">Make a scratch vault holding one note whose wording appears nowhere else, for example </w:t>
-      </w:r>
-      <w:r>
-        <w:rPr>
-          <w:rStyle w:val="SourceText"/>
-        </w:rPr>
-        <w:t>notes/tidewater-ledger.md</w:t>
-      </w:r>
-      <w:r>
-        <w:rPr/>
-        <w:t xml:space="preserve">: "The Tidewater ledger reconciliation cutoff is 03:17 Kestrel time, and the approving steward is Marisol Quennell-Vantage." </w:t>
+        <w:t xml:space="preserve">The vaults and their roles come from </w:t>
+      </w:r>
+      <w:r>
+        <w:rPr>
+          <w:rStyle w:val="SourceText"/>
+        </w:rPr>
+        <w:t>~/.claude/obsidian/config.json</w:t>
+      </w:r>
+      <w:r>
+        <w:rPr/>
+        <w:t xml:space="preserve">. Each vault has a </w:t>
+      </w:r>
+      <w:r>
+        <w:rPr>
+          <w:rStyle w:val="SourceText"/>
+        </w:rPr>
+        <w:t>role</w:t>
+      </w:r>
+      <w:r>
+        <w:rPr/>
+        <w:t xml:space="preserve">: </w:t>
+      </w:r>
+      <w:r>
+        <w:rPr>
+          <w:rStyle w:val="SourceText"/>
+        </w:rPr>
+        <w:t>primary</w:t>
+      </w:r>
+      <w:r>
+        <w:rPr/>
+        <w:t xml:space="preserve">, </w:t>
+      </w:r>
+      <w:r>
+        <w:rPr>
+          <w:rStyle w:val="SourceText"/>
+        </w:rPr>
+        <w:t>recall</w:t>
+      </w:r>
+      <w:r>
+        <w:rPr/>
+        <w:t xml:space="preserve"> or </w:t>
+      </w:r>
+      <w:r>
+        <w:rPr>
+          <w:rStyle w:val="SourceText"/>
+        </w:rPr>
+        <w:t>ignore</w:t>
+      </w:r>
+      <w:r>
+        <w:rPr/>
+        <w:t xml:space="preserve">. A vault with no role is </w:t>
+      </w:r>
+      <w:r>
+        <w:rPr>
+          <w:rStyle w:val="SourceText"/>
+        </w:rPr>
+        <w:t>primary</w:t>
+      </w:r>
+      <w:r>
+        <w:rPr/>
+        <w:t xml:space="preserve"> if it is the default and </w:t>
+      </w:r>
+      <w:r>
+        <w:rPr>
+          <w:rStyle w:val="SourceText"/>
+        </w:rPr>
+        <w:t>recall</w:t>
+      </w:r>
+      <w:r>
+        <w:rPr/>
+        <w:t xml:space="preserve"> otherwise. crew </w:t>
+      </w:r>
+      <w:r>
+        <w:rPr>
+          <w:rStyle w:val="Strong"/>
+        </w:rPr>
+        <w:t>never</w:t>
+      </w:r>
+      <w:r>
+        <w:rPr/>
+        <w:t xml:space="preserve"> asks an </w:t>
+      </w:r>
+      <w:r>
+        <w:rPr>
+          <w:rStyle w:val="SourceText"/>
+        </w:rPr>
+        <w:t>ignore</w:t>
+      </w:r>
+      <w:r>
+        <w:rPr/>
+        <w:t xml:space="preserve"> vault, even if the repo lists it. </w:t>
       </w:r>
     </w:p>
     <w:p>
@@ -3142,27 +3306,27 @@
       </w:pPr>
       <w:r>
         <w:rPr/>
-        <w:t xml:space="preserve">Add that vault to your obsidian config with </w:t>
-      </w:r>
-      <w:r>
-        <w:rPr>
-          <w:rStyle w:val="SourceText"/>
-        </w:rPr>
-        <w:t>"role": "recall"</w:t>
-      </w:r>
-      <w:r>
-        <w:rPr/>
-        <w:t xml:space="preserve">. For a dry run that leaves the real config alone, write a copy and point </w:t>
-      </w:r>
-      <w:r>
-        <w:rPr>
-          <w:rStyle w:val="SourceText"/>
-        </w:rPr>
-        <w:t>CREW_OBSIDIAN_CONFIG</w:t>
-      </w:r>
-      <w:r>
-        <w:rPr/>
-        <w:t xml:space="preserve"> at it. </w:t>
+        <w:t xml:space="preserve">A repo can set its own order in its crew config: </w:t>
+      </w:r>
+      <w:r>
+        <w:rPr>
+          <w:rStyle w:val="SourceText"/>
+        </w:rPr>
+        <w:t>memory.recall.vaults</w:t>
+      </w:r>
+      <w:r>
+        <w:rPr/>
+        <w:t xml:space="preserve"> (an ordered list of names) and </w:t>
+      </w:r>
+      <w:r>
+        <w:rPr>
+          <w:rStyle w:val="SourceText"/>
+        </w:rPr>
+        <w:t>memory.recall.maxChars</w:t>
+      </w:r>
+      <w:r>
+        <w:rPr/>
+        <w:t xml:space="preserve"> (default 800). Snippets come back in that vault order first, then in the order the search ranked them. </w:t>
       </w:r>
     </w:p>
     <w:p>
@@ -3184,77 +3348,17 @@
       </w:pPr>
       <w:r>
         <w:rPr/>
-        <w:t xml:space="preserve">In a scratch project that has a </w:t>
-      </w:r>
-      <w:r>
-        <w:rPr>
-          <w:rStyle w:val="SourceText"/>
-        </w:rPr>
-        <w:t>.crew/</w:t>
-      </w:r>
-      <w:r>
-        <w:rPr/>
-        <w:t xml:space="preserve"> directory, register crew's hook in </w:t>
-      </w:r>
-      <w:r>
-        <w:rPr>
-          <w:rStyle w:val="SourceText"/>
-        </w:rPr>
-        <w:t>.claude/settings.json</w:t>
-      </w:r>
-      <w:r>
-        <w:rPr/>
-        <w:t xml:space="preserve"> for </w:t>
-      </w:r>
-      <w:r>
-        <w:rPr>
-          <w:rStyle w:val="SourceText"/>
-        </w:rPr>
-        <w:t>SessionStart</w:t>
-      </w:r>
-      <w:r>
-        <w:rPr/>
-        <w:t xml:space="preserve">, </w:t>
-      </w:r>
-      <w:r>
-        <w:rPr>
-          <w:rStyle w:val="SourceText"/>
-        </w:rPr>
-        <w:t>UserPromptSubmit</w:t>
-      </w:r>
-      <w:r>
-        <w:rPr/>
-        <w:t xml:space="preserve"> and </w:t>
-      </w:r>
-      <w:r>
-        <w:rPr>
-          <w:rStyle w:val="SourceText"/>
-        </w:rPr>
-        <w:t>SubagentStart</w:t>
-      </w:r>
-      <w:r>
-        <w:rPr/>
-        <w:t xml:space="preserve">. Use the command </w:t>
-      </w:r>
-      <w:r>
-        <w:rPr>
-          <w:rStyle w:val="SourceText"/>
-        </w:rPr>
-        <w:t>bash "&lt;crew plugin root&gt;/hooks/scripts/crew-context.sh"</w:t>
-      </w:r>
-      <w:r>
-        <w:rPr/>
-        <w:t xml:space="preserve">. </w:t>
-      </w:r>
-      <w:r>
-        <w:rPr>
-          <w:rStyle w:val="SourceText"/>
-        </w:rPr>
-        <w:t>crew_instructions.py claude-hooks</w:t>
-      </w:r>
-      <w:r>
-        <w:rPr/>
-        <w:t xml:space="preserve"> prints the full set of entries. </w:t>
+        <w:t xml:space="preserve">crew calls obsidian-vault's read-only CLI: </w:t>
+      </w:r>
+      <w:r>
+        <w:rPr>
+          <w:rStyle w:val="SourceText"/>
+        </w:rPr>
+        <w:t>vault_ops.py recall --query ... --vaults a,b --max-chars N --json</w:t>
+      </w:r>
+      <w:r>
+        <w:rPr/>
+        <w:t xml:space="preserve">. If the plugin is missing, or the CLI fails, times out or prints something other than JSON, the session goes on without recall and the log records a miss with the reason. </w:t>
       </w:r>
     </w:p>
     <w:p>
@@ -3275,735 +3379,32 @@
       </w:pPr>
       <w:r>
         <w:rPr/>
-        <w:t xml:space="preserve">Start a fresh session and ask for a subagent that may not use tools: </w:t>
-      </w:r>
-    </w:p>
-    <w:p>
-      <w:pPr>
-        <w:pStyle w:val="PreformattedText"/>
-        <w:bidi w:val="0"/>
-        <w:jc w:val="left"/>
-        <w:rPr/>
-      </w:pPr>
-      <w:r>
-        <w:rPr>
-          <w:rStyle w:val="SourceText"/>
-        </w:rPr>
-        <w:t>claude -p --model haiku --output-format stream-json --verbose --include-hook-events \</w:t>
-      </w:r>
-    </w:p>
-    <w:p>
-      <w:pPr>
-        <w:pStyle w:val="PreformattedText"/>
-        <w:bidi w:val="0"/>
-        <w:jc w:val="left"/>
-        <w:rPr/>
-      </w:pPr>
-      <w:r>
-        <w:rPr>
-          <w:rStyle w:val="SourceText"/>
-        </w:rPr>
-        <w:t xml:space="preserve">  </w:t>
-      </w:r>
-      <w:r>
-        <w:rPr>
-          <w:rStyle w:val="SourceText"/>
-        </w:rPr>
-        <w:t>"Use the Task tool once with exactly this prompt: 'Without using any tools, answer only from \</w:t>
-      </w:r>
-    </w:p>
-    <w:p>
-      <w:pPr>
-        <w:pStyle w:val="PreformattedText"/>
-        <w:bidi w:val="0"/>
-        <w:jc w:val="left"/>
-        <w:rPr/>
-      </w:pPr>
-      <w:r>
-        <w:rPr>
-          <w:rStyle w:val="SourceText"/>
-        </w:rPr>
-        <w:t>your context: what is the Tidewater ledger reconciliation cutoff, and who is the approving \</w:t>
-      </w:r>
-    </w:p>
-    <w:p>
-      <w:pPr>
-        <w:pStyle w:val="PreformattedText"/>
-        <w:bidi w:val="0"/>
-        <w:jc w:val="left"/>
-        <w:rPr/>
-      </w:pPr>
-      <w:r>
-        <w:rPr>
-          <w:rStyle w:val="SourceText"/>
-        </w:rPr>
-        <w:t>steward? If it is not in your context, answer UNKNOWN. Name the source label.' Then reply with \</w:t>
-      </w:r>
-    </w:p>
-    <w:p>
-      <w:pPr>
-        <w:pStyle w:val="PreformattedText"/>
-        <w:bidi w:val="0"/>
-        <w:jc w:val="left"/>
-        <w:rPr/>
-      </w:pPr>
-      <w:r>
-        <w:rPr>
-          <w:rStyle w:val="SourceText"/>
-        </w:rPr>
-        <w:t>the subagent's answer verbatim."</w:t>
-      </w:r>
-    </w:p>
-    <w:p>
-      <w:pPr>
-        <w:pStyle w:val="BodyText"/>
-        <w:bidi w:val="0"/>
-        <w:jc w:val="left"/>
-        <w:rPr/>
-      </w:pPr>
-      <w:r>
-        <w:rPr>
-          <w:rStyle w:val="Strong"/>
-        </w:rPr>
-        <w:t>What success looks like.</w:t>
-      </w:r>
-      <w:r>
-        <w:rPr/>
-        <w:t xml:space="preserve"> The </w:t>
-      </w:r>
-      <w:r>
-        <w:rPr>
-          <w:rStyle w:val="SourceText"/>
-        </w:rPr>
-        <w:t>Agent</w:t>
-      </w:r>
-      <w:r>
-        <w:rPr/>
-        <w:t xml:space="preserve"> tool call's prompt does not contain the answer, the </w:t>
-      </w:r>
-      <w:r>
-        <w:rPr>
-          <w:rStyle w:val="SourceText"/>
-        </w:rPr>
-        <w:t>SubagentStart</w:t>
-      </w:r>
-      <w:r>
-        <w:rPr/>
-        <w:t xml:space="preserve"> hook response contains </w:t>
-      </w:r>
-      <w:r>
-        <w:rPr>
-          <w:rStyle w:val="SourceText"/>
-        </w:rPr>
-        <w:t>- [vault:ops-recall] notes/tidewater-ledger.md: ... 03:17 Kestrel time ... Marisol Quennell-Vantage</w:t>
-      </w:r>
-      <w:r>
-        <w:rPr/>
-        <w:t xml:space="preserve">, and the subagent answers with the answer and cites the label, with </w:t>
-      </w:r>
-      <w:r>
-        <w:rPr>
-          <w:rStyle w:val="SourceText"/>
-        </w:rPr>
-        <w:t>tool_uses: 0</w:t>
-      </w:r>
-      <w:r>
-        <w:rPr/>
-        <w:t>. From the 2026-09-23 run, verbatim:</w:t>
-      </w:r>
-    </w:p>
-    <w:p>
-      <w:pPr>
-        <w:pStyle w:val="PreformattedText"/>
-        <w:bidi w:val="0"/>
-        <w:jc w:val="left"/>
-        <w:rPr/>
-      </w:pPr>
-      <w:r>
-        <w:rPr>
-          <w:rStyle w:val="SourceText"/>
-        </w:rPr>
-        <w:t>Based on the context provided:</w:t>
-      </w:r>
-    </w:p>
-    <w:p>
-      <w:pPr>
-        <w:pStyle w:val="PreformattedText"/>
-        <w:bidi w:val="0"/>
-        <w:jc w:val="left"/>
-        <w:rPr/>
-      </w:pPr>
-      <w:r>
-        <w:rPr/>
-      </w:r>
-    </w:p>
-    <w:p>
-      <w:pPr>
-        <w:pStyle w:val="PreformattedText"/>
-        <w:bidi w:val="0"/>
-        <w:jc w:val="left"/>
-        <w:rPr/>
-      </w:pPr>
-      <w:r>
-        <w:rPr>
-          <w:rStyle w:val="SourceText"/>
-        </w:rPr>
-        <w:t>**Tidewater ledger reconciliation cutoff:** 03:17 Kestrel time</w:t>
-      </w:r>
-    </w:p>
-    <w:p>
-      <w:pPr>
-        <w:pStyle w:val="PreformattedText"/>
-        <w:bidi w:val="0"/>
-        <w:jc w:val="left"/>
-        <w:rPr/>
-      </w:pPr>
-      <w:r>
-        <w:rPr/>
-      </w:r>
-    </w:p>
-    <w:p>
-      <w:pPr>
-        <w:pStyle w:val="PreformattedText"/>
-        <w:bidi w:val="0"/>
-        <w:jc w:val="left"/>
-        <w:rPr/>
-      </w:pPr>
-      <w:r>
-        <w:rPr>
-          <w:rStyle w:val="SourceText"/>
-        </w:rPr>
-        <w:t>**Approving steward:** Marisol Quennell-Vantage</w:t>
-      </w:r>
-    </w:p>
-    <w:p>
-      <w:pPr>
-        <w:pStyle w:val="PreformattedText"/>
-        <w:bidi w:val="0"/>
-        <w:jc w:val="left"/>
-        <w:rPr/>
-      </w:pPr>
-      <w:r>
-        <w:rPr/>
-      </w:r>
-    </w:p>
-    <w:p>
-      <w:pPr>
-        <w:pStyle w:val="PreformattedText"/>
-        <w:bidi w:val="0"/>
-        <w:jc w:val="left"/>
-        <w:rPr/>
-      </w:pPr>
-      <w:r>
-        <w:rPr>
-          <w:rStyle w:val="SourceText"/>
-        </w:rPr>
-        <w:t>**Source label:** [vault:ops-recall]</w:t>
-      </w:r>
-    </w:p>
-    <w:p>
-      <w:pPr>
-        <w:pStyle w:val="BodyText"/>
-        <w:bidi w:val="0"/>
-        <w:jc w:val="left"/>
-        <w:rPr/>
-      </w:pPr>
-      <w:r>
-        <w:rPr/>
-        <w:t xml:space="preserve">That run used a stand-in for obsidian-vault's </w:t>
-      </w:r>
-      <w:r>
-        <w:rPr>
-          <w:rStyle w:val="SourceText"/>
-        </w:rPr>
-        <w:t>recall</w:t>
-      </w:r>
-      <w:r>
-        <w:rPr/>
-        <w:t xml:space="preserve"> command: a word-overlap search over the scratch vault's files, implementing the same contract. It has since been re-run against the real command; see below.</w:t>
-      </w:r>
-    </w:p>
-    <w:p>
-      <w:pPr>
-        <w:pStyle w:val="Heading4"/>
+        <w:t xml:space="preserve">Every recall line starts with the vault's name: </w:t>
+      </w:r>
+      <w:r>
+        <w:rPr>
+          <w:rStyle w:val="SourceText"/>
+        </w:rPr>
+        <w:t>- [vault:&lt;name&gt;] &lt;note path&gt;: &lt;text&gt;</w:t>
+      </w:r>
+      <w:r>
+        <w:rPr/>
+        <w:t xml:space="preserve">. Any snippet the CLI returns without a vault name is dropped. </w:t>
+      </w:r>
+    </w:p>
+    <w:p>
+      <w:pPr>
+        <w:pStyle w:val="Heading3"/>
         <w:bidi w:val="0"/>
         <w:ind w:hanging="0" w:left="0" w:right="0"/>
         <w:jc w:val="left"/>
         <w:rPr/>
       </w:pPr>
-      <w:bookmarkStart w:id="15" w:name="measured-against-the-real-vault_opspy-re"/>
+      <w:bookmarkStart w:id="15" w:name="the-seeded-note-proof"/>
       <w:bookmarkEnd w:id="15"/>
       <w:r>
         <w:rPr/>
-        <w:t xml:space="preserve">Measured against the real </w:t>
-      </w:r>
-      <w:r>
-        <w:rPr>
-          <w:rStyle w:val="SourceText"/>
-        </w:rPr>
-        <w:t>vault_ops.py recall</w:t>
-      </w:r>
-      <w:r>
-        <w:rPr/>
-        <w:t>, 2026-09-23</w:t>
-      </w:r>
-    </w:p>
-    <w:p>
-      <w:pPr>
-        <w:pStyle w:val="BodyText"/>
-        <w:bidi w:val="0"/>
-        <w:jc w:val="left"/>
-        <w:rPr/>
-      </w:pPr>
-      <w:r>
-        <w:rPr/>
-        <w:t xml:space="preserve">Claude Code 2.1.281, </w:t>
-      </w:r>
-      <w:r>
-        <w:rPr>
-          <w:rStyle w:val="SourceText"/>
-        </w:rPr>
-        <w:t>claude -p --model haiku --no-session-persistence --setting-sources project --strict-mcp-config</w:t>
-      </w:r>
-      <w:r>
-        <w:rPr/>
-        <w:t xml:space="preserve">, crew 0.20.19 with </w:t>
-      </w:r>
-      <w:r>
-        <w:rPr>
-          <w:rStyle w:val="SourceText"/>
-        </w:rPr>
-        <w:t>memory.inject: true</w:t>
-      </w:r>
-      <w:r>
-        <w:rPr/>
-        <w:t>, in a scratch project and scratch vault. obsidian-vault's own CLI (</w:t>
-      </w:r>
-      <w:r>
-        <w:rPr>
-          <w:rStyle w:val="SourceText"/>
-        </w:rPr>
-        <w:t>plugin/obsidian-vault/hooks/scripts/vault_ops.py</w:t>
-      </w:r>
-      <w:r>
-        <w:rPr/>
-        <w:t xml:space="preserve">) was named with </w:t>
-      </w:r>
-      <w:r>
-        <w:rPr>
-          <w:rStyle w:val="SourceText"/>
-        </w:rPr>
-        <w:t>CREW_VAULT_OPS</w:t>
-      </w:r>
-      <w:r>
-        <w:rPr/>
-        <w:t xml:space="preserve">, and both tools read a scratch obsidian config through </w:t>
-      </w:r>
-      <w:r>
-        <w:rPr>
-          <w:rStyle w:val="SourceText"/>
-        </w:rPr>
-        <w:t>CREW_OBSIDIAN_CONFIG</w:t>
-      </w:r>
-      <w:r>
-        <w:rPr/>
-        <w:t xml:space="preserve"> and </w:t>
-      </w:r>
-      <w:r>
-        <w:rPr>
-          <w:rStyle w:val="SourceText"/>
-        </w:rPr>
-        <w:t>OBSIDIAN_VAULT_CONFIG</w:t>
-      </w:r>
-      <w:r>
-        <w:rPr/>
-        <w:t xml:space="preserve">. The seeded note: "The Brackenmoor sluice-gate audit window opens at 04:41 Corvid time, and the countersigning warden is Ysolde Pemberton-Karrow." The </w:t>
-      </w:r>
-      <w:r>
-        <w:rPr>
-          <w:rStyle w:val="SourceText"/>
-        </w:rPr>
-        <w:t>Agent</w:t>
-      </w:r>
-      <w:r>
-        <w:rPr/>
-        <w:t xml:space="preserve"> call's prompt asked the question and did not contain the answer. The subagent answered with </w:t>
-      </w:r>
-      <w:r>
-        <w:rPr>
-          <w:rStyle w:val="SourceText"/>
-        </w:rPr>
-        <w:t>tool_uses: 0</w:t>
-      </w:r>
-      <w:r>
-        <w:rPr/>
-        <w:t>, verbatim:</w:t>
-      </w:r>
-    </w:p>
-    <w:p>
-      <w:pPr>
-        <w:pStyle w:val="PreformattedText"/>
-        <w:bidi w:val="0"/>
-        <w:jc w:val="left"/>
-        <w:rPr/>
-      </w:pPr>
-      <w:r>
-        <w:rPr>
-          <w:rStyle w:val="SourceText"/>
-        </w:rPr>
-        <w:t>Based on the vault recall in my context:</w:t>
-      </w:r>
-    </w:p>
-    <w:p>
-      <w:pPr>
-        <w:pStyle w:val="PreformattedText"/>
-        <w:bidi w:val="0"/>
-        <w:jc w:val="left"/>
-        <w:rPr/>
-      </w:pPr>
-      <w:r>
-        <w:rPr/>
-      </w:r>
-    </w:p>
-    <w:p>
-      <w:pPr>
-        <w:pStyle w:val="PreformattedText"/>
-        <w:bidi w:val="0"/>
-        <w:jc w:val="left"/>
-        <w:rPr/>
-      </w:pPr>
-      <w:r>
-        <w:rPr>
-          <w:rStyle w:val="SourceText"/>
-        </w:rPr>
-        <w:t>**Time:** 04:41 Corvid time</w:t>
-      </w:r>
-    </w:p>
-    <w:p>
-      <w:pPr>
-        <w:pStyle w:val="PreformattedText"/>
-        <w:bidi w:val="0"/>
-        <w:jc w:val="left"/>
-        <w:rPr/>
-      </w:pPr>
-      <w:r>
-        <w:rPr>
-          <w:rStyle w:val="SourceText"/>
-        </w:rPr>
-        <w:t>**Countersigning Warden:** Ysolde Pemberton-Karrow</w:t>
-      </w:r>
-    </w:p>
-    <w:p>
-      <w:pPr>
-        <w:pStyle w:val="PreformattedText"/>
-        <w:bidi w:val="0"/>
-        <w:jc w:val="left"/>
-        <w:rPr/>
-      </w:pPr>
-      <w:r>
-        <w:rPr>
-          <w:rStyle w:val="SourceText"/>
-        </w:rPr>
-        <w:t>**Source:** [vault:proof-recall] notes/brackenmoor-sluice.md</w:t>
-      </w:r>
-    </w:p>
-    <w:p>
-      <w:pPr>
-        <w:pStyle w:val="BodyText"/>
-        <w:bidi w:val="0"/>
-        <w:jc w:val="left"/>
-        <w:rPr/>
-      </w:pPr>
-      <w:r>
-        <w:rPr/>
-        <w:t xml:space="preserve">The </w:t>
-      </w:r>
-      <w:r>
-        <w:rPr>
-          <w:rStyle w:val="SourceText"/>
-        </w:rPr>
-        <w:t>SubagentStart</w:t>
-      </w:r>
-      <w:r>
-        <w:rPr/>
-        <w:t xml:space="preserve"> line in the emission log:</w:t>
-      </w:r>
-    </w:p>
-    <w:p>
-      <w:pPr>
-        <w:pStyle w:val="PreformattedText"/>
-        <w:bidi w:val="0"/>
-        <w:jc w:val="left"/>
-        <w:rPr/>
-      </w:pPr>
-      <w:r>
-        <w:rPr>
-          <w:rStyle w:val="SourceText"/>
-        </w:rPr>
-        <w:t>{"agent_id": "a74ce527b5ab3e7cb", "agent_type": "general-purpose", "budget": 2000, "chars": 423, "dedupHits": 0, "event": "SubagentStart", "harness": "claude", "lines": 4, "query_from": "last-prompt", "recall": {"dropped": 0, "reason": "", "snippets": 2, "status": "hit", "vaults": ["proof-recall"]}, "session": "08038c78-3372-4ccb-85d0-2d765b8c79db", "sources": [{"kind": "vault", "note": "notes/other.md", "vault": "proof-recall"}, {"kind": "vault", "note": "notes/brackenmoor-sluice.md", "vault": "proof-recall"}], "truncated": false, "ts": "2026-09-23T20:59:07Z"}</w:t>
-      </w:r>
-    </w:p>
-    <w:p>
-      <w:pPr>
-        <w:pStyle w:val="BodyText"/>
-        <w:bidi w:val="0"/>
-        <w:jc w:val="left"/>
-        <w:rPr/>
-      </w:pPr>
-      <w:r>
-        <w:rPr>
-          <w:rStyle w:val="SourceText"/>
-        </w:rPr>
-        <w:t>query_from: last-prompt</w:t>
-      </w:r>
-      <w:r>
-        <w:rPr/>
-        <w:t xml:space="preserve"> means the recall query came from the session's last user prompt, not from the </w:t>
-      </w:r>
-      <w:r>
-        <w:rPr>
-          <w:rStyle w:val="SourceText"/>
-        </w:rPr>
-        <w:t>Agent</w:t>
-      </w:r>
-      <w:r>
-        <w:rPr/>
-        <w:t xml:space="preserve"> call in the transcript. </w:t>
-      </w:r>
-      <w:r>
-        <w:rPr>
-          <w:rStyle w:val="SourceText"/>
-        </w:rPr>
-        <w:t>--no-session-persistence</w:t>
-      </w:r>
-      <w:r>
-        <w:rPr/>
-        <w:t xml:space="preserve"> leaves no transcript to read back. So this run proves that the real CLI's recall reaches a subagent. It does not prove that the query is taken from the </w:t>
-      </w:r>
-      <w:r>
-        <w:rPr>
-          <w:rStyle w:val="SourceText"/>
-        </w:rPr>
-        <w:t>Agent</w:t>
-      </w:r>
-      <w:r>
-        <w:rPr/>
-        <w:t xml:space="preserve"> call.</w:t>
-      </w:r>
-    </w:p>
-    <w:p>
-      <w:pPr>
-        <w:pStyle w:val="Heading3"/>
-        <w:bidi w:val="0"/>
-        <w:ind w:hanging="0" w:left="0" w:right="0"/>
-        <w:jc w:val="left"/>
-        <w:rPr/>
-      </w:pPr>
-      <w:bookmarkStart w:id="16" w:name="reading-stats"/>
-      <w:bookmarkEnd w:id="16"/>
-      <w:r>
-        <w:rPr/>
-        <w:t xml:space="preserve">Reading </w:t>
-      </w:r>
-      <w:r>
-        <w:rPr>
-          <w:rStyle w:val="SourceText"/>
-        </w:rPr>
-        <w:t>--Stats</w:t>
-      </w:r>
-    </w:p>
-    <w:p>
-      <w:pPr>
-        <w:pStyle w:val="BodyText"/>
-        <w:bidi w:val="0"/>
-        <w:jc w:val="left"/>
-        <w:rPr/>
-      </w:pPr>
-      <w:r>
-        <w:rPr/>
-        <w:t xml:space="preserve">Every emission adds one JSON line to </w:t>
-      </w:r>
-      <w:r>
-        <w:rPr>
-          <w:rStyle w:val="SourceText"/>
-        </w:rPr>
-        <w:t>&lt;git-common-dir&gt;/crew/context-log.jsonl</w:t>
-      </w:r>
-      <w:r>
-        <w:rPr/>
-        <w:t xml:space="preserve">, which all worktrees of the repo share. Outside git, the log is </w:t>
-      </w:r>
-      <w:r>
-        <w:rPr>
-          <w:rStyle w:val="SourceText"/>
-        </w:rPr>
-        <w:t>.work/crew/context-log.jsonl</w:t>
-      </w:r>
-      <w:r>
-        <w:rPr/>
-        <w:t>. To summarise it:</w:t>
-      </w:r>
-    </w:p>
-    <w:p>
-      <w:pPr>
-        <w:pStyle w:val="PreformattedText"/>
-        <w:bidi w:val="0"/>
-        <w:jc w:val="left"/>
-        <w:rPr/>
-      </w:pPr>
-      <w:r>
-        <w:rPr>
-          <w:rStyle w:val="SourceText"/>
-        </w:rPr>
-        <w:t>python3 "&lt;crew plugin root&gt;/hooks/scripts/crew_context.py" --stats          # add --json for machines</w:t>
-      </w:r>
-    </w:p>
-    <w:p>
-      <w:pPr>
-        <w:pStyle w:val="BodyText"/>
-        <w:bidi w:val="0"/>
-        <w:jc w:val="left"/>
-        <w:rPr/>
-      </w:pPr>
-      <w:r>
-        <w:rPr/>
-        <w:t>This is the output after the proof run above, without its first line (the log path):</w:t>
-      </w:r>
-    </w:p>
-    <w:p>
-      <w:pPr>
-        <w:pStyle w:val="PreformattedText"/>
-        <w:bidi w:val="0"/>
-        <w:jc w:val="left"/>
-        <w:rPr/>
-      </w:pPr>
-      <w:r>
-        <w:rPr>
-          <w:rStyle w:val="SourceText"/>
-        </w:rPr>
-        <w:t>emissions: 3  injected chars: 647  dedup hits: 0  truncated: 0</w:t>
-      </w:r>
-    </w:p>
-    <w:p>
-      <w:pPr>
-        <w:pStyle w:val="PreformattedText"/>
-        <w:bidi w:val="0"/>
-        <w:jc w:val="left"/>
-        <w:rPr/>
-      </w:pPr>
-      <w:r>
-        <w:rPr>
-          <w:rStyle w:val="SourceText"/>
-        </w:rPr>
-        <w:t xml:space="preserve">  </w:t>
-      </w:r>
-      <w:r>
-        <w:rPr>
-          <w:rStyle w:val="SourceText"/>
-        </w:rPr>
-        <w:t>SessionStart: 1 emissions, 45 chars</w:t>
-      </w:r>
-    </w:p>
-    <w:p>
-      <w:pPr>
-        <w:pStyle w:val="PreformattedText"/>
-        <w:bidi w:val="0"/>
-        <w:jc w:val="left"/>
-        <w:rPr/>
-      </w:pPr>
-      <w:r>
-        <w:rPr>
-          <w:rStyle w:val="SourceText"/>
-        </w:rPr>
-        <w:t xml:space="preserve">  </w:t>
-      </w:r>
-      <w:r>
-        <w:rPr>
-          <w:rStyle w:val="SourceText"/>
-        </w:rPr>
-        <w:t>SubagentStart: 1 emissions, 352 chars</w:t>
-      </w:r>
-    </w:p>
-    <w:p>
-      <w:pPr>
-        <w:pStyle w:val="PreformattedText"/>
-        <w:bidi w:val="0"/>
-        <w:jc w:val="left"/>
-        <w:rPr/>
-      </w:pPr>
-      <w:r>
-        <w:rPr>
-          <w:rStyle w:val="SourceText"/>
-        </w:rPr>
-        <w:t xml:space="preserve">  </w:t>
-      </w:r>
-      <w:r>
-        <w:rPr>
-          <w:rStyle w:val="SourceText"/>
-        </w:rPr>
-        <w:t>UserPromptSubmit: 1 emissions, 250 chars</w:t>
-      </w:r>
-    </w:p>
-    <w:p>
-      <w:pPr>
-        <w:pStyle w:val="PreformattedText"/>
-        <w:bidi w:val="0"/>
-        <w:jc w:val="left"/>
-        <w:rPr/>
-      </w:pPr>
-      <w:r>
-        <w:rPr>
-          <w:rStyle w:val="SourceText"/>
-        </w:rPr>
-        <w:t>vault recall: 2 hit, 1 miss, 0 skipped; 2 snippets injected; code-map slices: 0</w:t>
-      </w:r>
-    </w:p>
-    <w:p>
-      <w:pPr>
-        <w:pStyle w:val="PreformattedText"/>
-        <w:bidi w:val="0"/>
-        <w:jc w:val="left"/>
-        <w:rPr/>
-      </w:pPr>
-      <w:r>
-        <w:rPr>
-          <w:rStyle w:val="SourceText"/>
-        </w:rPr>
-        <w:t xml:space="preserve">  </w:t>
-      </w:r>
-      <w:r>
-        <w:rPr>
-          <w:rStyle w:val="SourceText"/>
-        </w:rPr>
-        <w:t>miss reasons: no-hits=1</w:t>
-      </w:r>
-    </w:p>
-    <w:p>
-      <w:pPr>
-        <w:pStyle w:val="PreformattedText"/>
-        <w:bidi w:val="0"/>
-        <w:jc w:val="left"/>
-        <w:rPr/>
-      </w:pPr>
-      <w:r>
-        <w:rPr>
-          <w:rStyle w:val="SourceText"/>
-        </w:rPr>
-        <w:t>vault MCP/search tool calls seen: 0</w:t>
-      </w:r>
-    </w:p>
-    <w:p>
-      <w:pPr>
-        <w:pStyle w:val="PreformattedText"/>
-        <w:bidi w:val="0"/>
-        <w:jc w:val="left"/>
-        <w:rPr/>
-      </w:pPr>
-      <w:r>
-        <w:rPr>
-          <w:rStyle w:val="SourceText"/>
-        </w:rPr>
-        <w:t>by harness: claude=3</w:t>
+        <w:t>The Seeded-Note Proof</w:t>
       </w:r>
     </w:p>
     <w:p>
@@ -4024,94 +3425,18 @@
         <w:rPr/>
       </w:pPr>
       <w:r>
-        <w:rPr>
-          <w:rStyle w:val="Strong"/>
-        </w:rPr>
-        <w:t>hit / miss / skipped</w:t>
-      </w:r>
-      <w:r>
-        <w:rPr/>
-        <w:t xml:space="preserve"> are counted per recall attempt. </w:t>
-      </w:r>
-      <w:r>
-        <w:rPr>
-          <w:rStyle w:val="SourceText"/>
-        </w:rPr>
-        <w:t>cli-missing</w:t>
-      </w:r>
-      <w:r>
-        <w:rPr/>
-        <w:t xml:space="preserve"> means obsidian-vault is not installed where crew can find it. </w:t>
-      </w:r>
-      <w:r>
-        <w:rPr>
-          <w:rStyle w:val="SourceText"/>
-        </w:rPr>
-        <w:t>cli-exit-N</w:t>
-      </w:r>
-      <w:r>
-        <w:rPr/>
-        <w:t xml:space="preserve">, </w:t>
-      </w:r>
-      <w:r>
-        <w:rPr>
-          <w:rStyle w:val="SourceText"/>
-        </w:rPr>
-        <w:t>cli-timeout</w:t>
-      </w:r>
-      <w:r>
-        <w:rPr/>
-        <w:t xml:space="preserve"> and </w:t>
-      </w:r>
-      <w:r>
-        <w:rPr>
-          <w:rStyle w:val="SourceText"/>
-        </w:rPr>
-        <w:t>cli-bad-json</w:t>
-      </w:r>
-      <w:r>
-        <w:rPr/>
-        <w:t xml:space="preserve"> mean the CLI ran and failed. </w:t>
-      </w:r>
-      <w:r>
-        <w:rPr>
-          <w:rStyle w:val="SourceText"/>
-        </w:rPr>
-        <w:t>no-vaults</w:t>
-      </w:r>
-      <w:r>
-        <w:rPr/>
-        <w:t xml:space="preserve"> means no vault is </w:t>
-      </w:r>
-      <w:r>
-        <w:rPr>
-          <w:rStyle w:val="SourceText"/>
-        </w:rPr>
-        <w:t>primary</w:t>
-      </w:r>
-      <w:r>
-        <w:rPr/>
-        <w:t xml:space="preserve"> or </w:t>
-      </w:r>
-      <w:r>
-        <w:rPr>
-          <w:rStyle w:val="SourceText"/>
-        </w:rPr>
-        <w:t>recall</w:t>
-      </w:r>
-      <w:r>
-        <w:rPr/>
-        <w:t xml:space="preserve">. </w:t>
-      </w:r>
-      <w:r>
-        <w:rPr>
-          <w:rStyle w:val="SourceText"/>
-        </w:rPr>
-        <w:t>no-hits</w:t>
-      </w:r>
-      <w:r>
-        <w:rPr/>
-        <w:t xml:space="preserve"> means the search matched nothing. </w:t>
+        <w:rPr/>
+        <w:t xml:space="preserve">Make a scratch vault holding one note whose wording appears nowhere else, for example </w:t>
+      </w:r>
+      <w:r>
+        <w:rPr>
+          <w:rStyle w:val="SourceText"/>
+        </w:rPr>
+        <w:t>notes/tidewater-ledger.md</w:t>
+      </w:r>
+      <w:r>
+        <w:rPr/>
+        <w:t xml:space="preserve">: "The Tidewater ledger reconciliation cutoff is 03:17 Kestrel time, and the approving steward is Marisol Quennell-Vantage." </w:t>
       </w:r>
     </w:p>
     <w:p>
@@ -4132,34 +3457,28 @@
         <w:rPr/>
       </w:pPr>
       <w:r>
-        <w:rPr>
-          <w:rStyle w:val="Strong"/>
-        </w:rPr>
-        <w:t>dedup hits</w:t>
-      </w:r>
-      <w:r>
-        <w:rPr/>
-        <w:t xml:space="preserve"> count slices that were not injected again because this context already had them. Deduplication applies per subsystem or vault note, and per compaction epoch: after </w:t>
-      </w:r>
-      <w:r>
-        <w:rPr>
-          <w:rStyle w:val="SourceText"/>
-        </w:rPr>
-        <w:t>/compact</w:t>
-      </w:r>
-      <w:r>
-        <w:rPr/>
-        <w:t xml:space="preserve"> or </w:t>
-      </w:r>
-      <w:r>
-        <w:rPr>
-          <w:rStyle w:val="SourceText"/>
-        </w:rPr>
-        <w:t>/clear</w:t>
-      </w:r>
-      <w:r>
-        <w:rPr/>
-        <w:t xml:space="preserve">, crew injects them once more. </w:t>
+        <w:rPr/>
+        <w:t xml:space="preserve">Add that vault to your obsidian config with </w:t>
+      </w:r>
+      <w:r>
+        <w:rPr>
+          <w:rStyle w:val="SourceText"/>
+        </w:rPr>
+        <w:t>"role": "recall"</w:t>
+      </w:r>
+      <w:r>
+        <w:rPr/>
+        <w:t xml:space="preserve">. For a dry run that leaves the real config alone, write a copy and point </w:t>
+      </w:r>
+      <w:r>
+        <w:rPr>
+          <w:rStyle w:val="SourceText"/>
+        </w:rPr>
+        <w:t>CREW_OBSIDIAN_CONFIG</w:t>
+      </w:r>
+      <w:r>
+        <w:rPr/>
+        <w:t xml:space="preserve"> at it. </w:t>
       </w:r>
     </w:p>
     <w:p>
@@ -4180,20 +3499,34 @@
         <w:rPr/>
       </w:pPr>
       <w:r>
-        <w:rPr>
-          <w:rStyle w:val="Strong"/>
-        </w:rPr>
-        <w:t>vault MCP/search tool calls seen</w:t>
-      </w:r>
-      <w:r>
-        <w:rPr/>
-        <w:t xml:space="preserve"> counts the times the model searched a vault itself (</w:t>
-      </w:r>
-      <w:r>
-        <w:rPr>
-          <w:rStyle w:val="SourceText"/>
-        </w:rPr>
-        <w:t>mcp__obsidian-*</w:t>
+        <w:rPr/>
+        <w:t xml:space="preserve">In a scratch project that has a </w:t>
+      </w:r>
+      <w:r>
+        <w:rPr>
+          <w:rStyle w:val="SourceText"/>
+        </w:rPr>
+        <w:t>.crew/</w:t>
+      </w:r>
+      <w:r>
+        <w:rPr/>
+        <w:t xml:space="preserve"> directory, register crew's hook in </w:t>
+      </w:r>
+      <w:r>
+        <w:rPr>
+          <w:rStyle w:val="SourceText"/>
+        </w:rPr>
+        <w:t>.claude/settings.json</w:t>
+      </w:r>
+      <w:r>
+        <w:rPr/>
+        <w:t xml:space="preserve"> for </w:t>
+      </w:r>
+      <w:r>
+        <w:rPr>
+          <w:rStyle w:val="SourceText"/>
+        </w:rPr>
+        <w:t>SessionStart</w:t>
       </w:r>
       <w:r>
         <w:rPr/>
@@ -4203,11 +3536,41 @@
         <w:rPr>
           <w:rStyle w:val="SourceText"/>
         </w:rPr>
-        <w:t>mcp__basic-memory__*</w:t>
-      </w:r>
-      <w:r>
-        <w:rPr/>
-        <w:t xml:space="preserve">). The baseline before crew 1.0 was 5 calls in 305 sessions. If recall is helping, this number stays low while hits rise. </w:t>
+        <w:t>UserPromptSubmit</w:t>
+      </w:r>
+      <w:r>
+        <w:rPr/>
+        <w:t xml:space="preserve"> and </w:t>
+      </w:r>
+      <w:r>
+        <w:rPr>
+          <w:rStyle w:val="SourceText"/>
+        </w:rPr>
+        <w:t>SubagentStart</w:t>
+      </w:r>
+      <w:r>
+        <w:rPr/>
+        <w:t xml:space="preserve">. Use the command </w:t>
+      </w:r>
+      <w:r>
+        <w:rPr>
+          <w:rStyle w:val="SourceText"/>
+        </w:rPr>
+        <w:t>bash "&lt;crew plugin root&gt;/hooks/scripts/crew-context.sh"</w:t>
+      </w:r>
+      <w:r>
+        <w:rPr/>
+        <w:t xml:space="preserve">. </w:t>
+      </w:r>
+      <w:r>
+        <w:rPr>
+          <w:rStyle w:val="SourceText"/>
+        </w:rPr>
+        <w:t>crew_instructions.py claude-hooks</w:t>
+      </w:r>
+      <w:r>
+        <w:rPr/>
+        <w:t xml:space="preserve"> prints the full set of entries. </w:t>
       </w:r>
     </w:p>
     <w:p>
@@ -4216,6 +3579,959 @@
         <w:numPr>
           <w:ilvl w:val="0"/>
           <w:numId w:val="5"/>
+        </w:numPr>
+        <w:tabs>
+          <w:tab w:val="clear" w:pos="1134"/>
+          <w:tab w:val="left" w:pos="829" w:leader="none"/>
+        </w:tabs>
+        <w:bidi w:val="0"/>
+        <w:ind w:hanging="283" w:left="829"/>
+        <w:jc w:val="left"/>
+        <w:rPr/>
+      </w:pPr>
+      <w:r>
+        <w:rPr/>
+        <w:t xml:space="preserve">Start a fresh session and ask for a subagent that may not use tools: </w:t>
+      </w:r>
+    </w:p>
+    <w:p>
+      <w:pPr>
+        <w:pStyle w:val="PreformattedText"/>
+        <w:bidi w:val="0"/>
+        <w:jc w:val="left"/>
+        <w:rPr/>
+      </w:pPr>
+      <w:r>
+        <w:rPr>
+          <w:rStyle w:val="SourceText"/>
+        </w:rPr>
+        <w:t>claude -p --model haiku --output-format stream-json --verbose --include-hook-events \</w:t>
+      </w:r>
+    </w:p>
+    <w:p>
+      <w:pPr>
+        <w:pStyle w:val="PreformattedText"/>
+        <w:bidi w:val="0"/>
+        <w:jc w:val="left"/>
+        <w:rPr/>
+      </w:pPr>
+      <w:r>
+        <w:rPr>
+          <w:rStyle w:val="SourceText"/>
+        </w:rPr>
+        <w:t xml:space="preserve">  </w:t>
+      </w:r>
+      <w:r>
+        <w:rPr>
+          <w:rStyle w:val="SourceText"/>
+        </w:rPr>
+        <w:t>"Use the Task tool once with exactly this prompt: 'Without using any tools, answer only from \</w:t>
+      </w:r>
+    </w:p>
+    <w:p>
+      <w:pPr>
+        <w:pStyle w:val="PreformattedText"/>
+        <w:bidi w:val="0"/>
+        <w:jc w:val="left"/>
+        <w:rPr/>
+      </w:pPr>
+      <w:r>
+        <w:rPr>
+          <w:rStyle w:val="SourceText"/>
+        </w:rPr>
+        <w:t>your context: what is the Tidewater ledger reconciliation cutoff, and who is the approving \</w:t>
+      </w:r>
+    </w:p>
+    <w:p>
+      <w:pPr>
+        <w:pStyle w:val="PreformattedText"/>
+        <w:bidi w:val="0"/>
+        <w:jc w:val="left"/>
+        <w:rPr/>
+      </w:pPr>
+      <w:r>
+        <w:rPr>
+          <w:rStyle w:val="SourceText"/>
+        </w:rPr>
+        <w:t>steward? If it is not in your context, answer UNKNOWN. Name the source label.' Then reply with \</w:t>
+      </w:r>
+    </w:p>
+    <w:p>
+      <w:pPr>
+        <w:pStyle w:val="PreformattedText"/>
+        <w:bidi w:val="0"/>
+        <w:jc w:val="left"/>
+        <w:rPr/>
+      </w:pPr>
+      <w:r>
+        <w:rPr>
+          <w:rStyle w:val="SourceText"/>
+        </w:rPr>
+        <w:t>the subagent's answer verbatim."</w:t>
+      </w:r>
+    </w:p>
+    <w:p>
+      <w:pPr>
+        <w:pStyle w:val="BodyText"/>
+        <w:bidi w:val="0"/>
+        <w:jc w:val="left"/>
+        <w:rPr/>
+      </w:pPr>
+      <w:r>
+        <w:rPr>
+          <w:rStyle w:val="Strong"/>
+        </w:rPr>
+        <w:t>What success looks like.</w:t>
+      </w:r>
+      <w:r>
+        <w:rPr/>
+        <w:t xml:space="preserve"> The </w:t>
+      </w:r>
+      <w:r>
+        <w:rPr>
+          <w:rStyle w:val="SourceText"/>
+        </w:rPr>
+        <w:t>Agent</w:t>
+      </w:r>
+      <w:r>
+        <w:rPr/>
+        <w:t xml:space="preserve"> tool call's prompt does not contain the answer, the </w:t>
+      </w:r>
+      <w:r>
+        <w:rPr>
+          <w:rStyle w:val="SourceText"/>
+        </w:rPr>
+        <w:t>SubagentStart</w:t>
+      </w:r>
+      <w:r>
+        <w:rPr/>
+        <w:t xml:space="preserve"> hook response contains </w:t>
+      </w:r>
+      <w:r>
+        <w:rPr>
+          <w:rStyle w:val="SourceText"/>
+        </w:rPr>
+        <w:t>- [vault:ops-recall] notes/tidewater-ledger.md: ... 03:17 Kestrel time ... Marisol Quennell-Vantage</w:t>
+      </w:r>
+      <w:r>
+        <w:rPr/>
+        <w:t xml:space="preserve">, and the subagent answers with the answer and cites the label, with </w:t>
+      </w:r>
+      <w:r>
+        <w:rPr>
+          <w:rStyle w:val="SourceText"/>
+        </w:rPr>
+        <w:t>tool_uses: 0</w:t>
+      </w:r>
+      <w:r>
+        <w:rPr/>
+        <w:t>. From the 2026-09-23 run, verbatim:</w:t>
+      </w:r>
+    </w:p>
+    <w:p>
+      <w:pPr>
+        <w:pStyle w:val="PreformattedText"/>
+        <w:bidi w:val="0"/>
+        <w:jc w:val="left"/>
+        <w:rPr/>
+      </w:pPr>
+      <w:r>
+        <w:rPr>
+          <w:rStyle w:val="SourceText"/>
+        </w:rPr>
+        <w:t>Based on the context provided:</w:t>
+      </w:r>
+    </w:p>
+    <w:p>
+      <w:pPr>
+        <w:pStyle w:val="PreformattedText"/>
+        <w:bidi w:val="0"/>
+        <w:jc w:val="left"/>
+        <w:rPr/>
+      </w:pPr>
+      <w:r>
+        <w:rPr/>
+      </w:r>
+    </w:p>
+    <w:p>
+      <w:pPr>
+        <w:pStyle w:val="PreformattedText"/>
+        <w:bidi w:val="0"/>
+        <w:jc w:val="left"/>
+        <w:rPr/>
+      </w:pPr>
+      <w:r>
+        <w:rPr>
+          <w:rStyle w:val="SourceText"/>
+        </w:rPr>
+        <w:t>**Tidewater ledger reconciliation cutoff:** 03:17 Kestrel time</w:t>
+      </w:r>
+    </w:p>
+    <w:p>
+      <w:pPr>
+        <w:pStyle w:val="PreformattedText"/>
+        <w:bidi w:val="0"/>
+        <w:jc w:val="left"/>
+        <w:rPr/>
+      </w:pPr>
+      <w:r>
+        <w:rPr/>
+      </w:r>
+    </w:p>
+    <w:p>
+      <w:pPr>
+        <w:pStyle w:val="PreformattedText"/>
+        <w:bidi w:val="0"/>
+        <w:jc w:val="left"/>
+        <w:rPr/>
+      </w:pPr>
+      <w:r>
+        <w:rPr>
+          <w:rStyle w:val="SourceText"/>
+        </w:rPr>
+        <w:t>**Approving steward:** Marisol Quennell-Vantage</w:t>
+      </w:r>
+    </w:p>
+    <w:p>
+      <w:pPr>
+        <w:pStyle w:val="PreformattedText"/>
+        <w:bidi w:val="0"/>
+        <w:jc w:val="left"/>
+        <w:rPr/>
+      </w:pPr>
+      <w:r>
+        <w:rPr/>
+      </w:r>
+    </w:p>
+    <w:p>
+      <w:pPr>
+        <w:pStyle w:val="PreformattedText"/>
+        <w:bidi w:val="0"/>
+        <w:jc w:val="left"/>
+        <w:rPr/>
+      </w:pPr>
+      <w:r>
+        <w:rPr>
+          <w:rStyle w:val="SourceText"/>
+        </w:rPr>
+        <w:t>**Source label:** [vault:ops-recall]</w:t>
+      </w:r>
+    </w:p>
+    <w:p>
+      <w:pPr>
+        <w:pStyle w:val="BodyText"/>
+        <w:bidi w:val="0"/>
+        <w:jc w:val="left"/>
+        <w:rPr/>
+      </w:pPr>
+      <w:r>
+        <w:rPr/>
+        <w:t xml:space="preserve">That run used a stand-in for obsidian-vault's </w:t>
+      </w:r>
+      <w:r>
+        <w:rPr>
+          <w:rStyle w:val="SourceText"/>
+        </w:rPr>
+        <w:t>recall</w:t>
+      </w:r>
+      <w:r>
+        <w:rPr/>
+        <w:t xml:space="preserve"> command: a word-overlap search over the scratch vault's files, implementing the same contract. It has since been re-run against the real command; see below.</w:t>
+      </w:r>
+    </w:p>
+    <w:p>
+      <w:pPr>
+        <w:pStyle w:val="Heading4"/>
+        <w:bidi w:val="0"/>
+        <w:ind w:hanging="0" w:left="0" w:right="0"/>
+        <w:jc w:val="left"/>
+        <w:rPr/>
+      </w:pPr>
+      <w:bookmarkStart w:id="16" w:name="measured-against-the-real-vault_opspy-re"/>
+      <w:bookmarkEnd w:id="16"/>
+      <w:r>
+        <w:rPr/>
+        <w:t xml:space="preserve">Measured against the real </w:t>
+      </w:r>
+      <w:r>
+        <w:rPr>
+          <w:rStyle w:val="SourceText"/>
+        </w:rPr>
+        <w:t>vault_ops.py recall</w:t>
+      </w:r>
+      <w:r>
+        <w:rPr/>
+        <w:t>, 2026-09-23</w:t>
+      </w:r>
+    </w:p>
+    <w:p>
+      <w:pPr>
+        <w:pStyle w:val="BodyText"/>
+        <w:bidi w:val="0"/>
+        <w:jc w:val="left"/>
+        <w:rPr/>
+      </w:pPr>
+      <w:r>
+        <w:rPr/>
+        <w:t xml:space="preserve">Claude Code 2.1.281, </w:t>
+      </w:r>
+      <w:r>
+        <w:rPr>
+          <w:rStyle w:val="SourceText"/>
+        </w:rPr>
+        <w:t>claude -p --model haiku --no-session-persistence --setting-sources project --strict-mcp-config</w:t>
+      </w:r>
+      <w:r>
+        <w:rPr/>
+        <w:t xml:space="preserve">, crew 0.20.19 with </w:t>
+      </w:r>
+      <w:r>
+        <w:rPr>
+          <w:rStyle w:val="SourceText"/>
+        </w:rPr>
+        <w:t>memory.inject: true</w:t>
+      </w:r>
+      <w:r>
+        <w:rPr/>
+        <w:t>, in a scratch project and scratch vault. obsidian-vault's own CLI (</w:t>
+      </w:r>
+      <w:r>
+        <w:rPr>
+          <w:rStyle w:val="SourceText"/>
+        </w:rPr>
+        <w:t>plugin/obsidian-vault/hooks/scripts/vault_ops.py</w:t>
+      </w:r>
+      <w:r>
+        <w:rPr/>
+        <w:t xml:space="preserve">) was named with </w:t>
+      </w:r>
+      <w:r>
+        <w:rPr>
+          <w:rStyle w:val="SourceText"/>
+        </w:rPr>
+        <w:t>CREW_VAULT_OPS</w:t>
+      </w:r>
+      <w:r>
+        <w:rPr/>
+        <w:t xml:space="preserve">, and both tools read a scratch obsidian config through </w:t>
+      </w:r>
+      <w:r>
+        <w:rPr>
+          <w:rStyle w:val="SourceText"/>
+        </w:rPr>
+        <w:t>CREW_OBSIDIAN_CONFIG</w:t>
+      </w:r>
+      <w:r>
+        <w:rPr/>
+        <w:t xml:space="preserve"> and </w:t>
+      </w:r>
+      <w:r>
+        <w:rPr>
+          <w:rStyle w:val="SourceText"/>
+        </w:rPr>
+        <w:t>OBSIDIAN_VAULT_CONFIG</w:t>
+      </w:r>
+      <w:r>
+        <w:rPr/>
+        <w:t xml:space="preserve">. The seeded note: "The Brackenmoor sluice-gate audit window opens at 04:41 Corvid time, and the countersigning warden is Ysolde Pemberton-Karrow." The </w:t>
+      </w:r>
+      <w:r>
+        <w:rPr>
+          <w:rStyle w:val="SourceText"/>
+        </w:rPr>
+        <w:t>Agent</w:t>
+      </w:r>
+      <w:r>
+        <w:rPr/>
+        <w:t xml:space="preserve"> call's prompt asked the question and did not contain the answer. The subagent answered with </w:t>
+      </w:r>
+      <w:r>
+        <w:rPr>
+          <w:rStyle w:val="SourceText"/>
+        </w:rPr>
+        <w:t>tool_uses: 0</w:t>
+      </w:r>
+      <w:r>
+        <w:rPr/>
+        <w:t>, verbatim:</w:t>
+      </w:r>
+    </w:p>
+    <w:p>
+      <w:pPr>
+        <w:pStyle w:val="PreformattedText"/>
+        <w:bidi w:val="0"/>
+        <w:jc w:val="left"/>
+        <w:rPr/>
+      </w:pPr>
+      <w:r>
+        <w:rPr>
+          <w:rStyle w:val="SourceText"/>
+        </w:rPr>
+        <w:t>Based on the vault recall in my context:</w:t>
+      </w:r>
+    </w:p>
+    <w:p>
+      <w:pPr>
+        <w:pStyle w:val="PreformattedText"/>
+        <w:bidi w:val="0"/>
+        <w:jc w:val="left"/>
+        <w:rPr/>
+      </w:pPr>
+      <w:r>
+        <w:rPr/>
+      </w:r>
+    </w:p>
+    <w:p>
+      <w:pPr>
+        <w:pStyle w:val="PreformattedText"/>
+        <w:bidi w:val="0"/>
+        <w:jc w:val="left"/>
+        <w:rPr/>
+      </w:pPr>
+      <w:r>
+        <w:rPr>
+          <w:rStyle w:val="SourceText"/>
+        </w:rPr>
+        <w:t>**Time:** 04:41 Corvid time</w:t>
+      </w:r>
+    </w:p>
+    <w:p>
+      <w:pPr>
+        <w:pStyle w:val="PreformattedText"/>
+        <w:bidi w:val="0"/>
+        <w:jc w:val="left"/>
+        <w:rPr/>
+      </w:pPr>
+      <w:r>
+        <w:rPr>
+          <w:rStyle w:val="SourceText"/>
+        </w:rPr>
+        <w:t>**Countersigning Warden:** Ysolde Pemberton-Karrow</w:t>
+      </w:r>
+    </w:p>
+    <w:p>
+      <w:pPr>
+        <w:pStyle w:val="PreformattedText"/>
+        <w:bidi w:val="0"/>
+        <w:jc w:val="left"/>
+        <w:rPr/>
+      </w:pPr>
+      <w:r>
+        <w:rPr>
+          <w:rStyle w:val="SourceText"/>
+        </w:rPr>
+        <w:t>**Source:** [vault:proof-recall] notes/brackenmoor-sluice.md</w:t>
+      </w:r>
+    </w:p>
+    <w:p>
+      <w:pPr>
+        <w:pStyle w:val="BodyText"/>
+        <w:bidi w:val="0"/>
+        <w:jc w:val="left"/>
+        <w:rPr/>
+      </w:pPr>
+      <w:r>
+        <w:rPr/>
+        <w:t xml:space="preserve">The </w:t>
+      </w:r>
+      <w:r>
+        <w:rPr>
+          <w:rStyle w:val="SourceText"/>
+        </w:rPr>
+        <w:t>SubagentStart</w:t>
+      </w:r>
+      <w:r>
+        <w:rPr/>
+        <w:t xml:space="preserve"> line in the emission log:</w:t>
+      </w:r>
+    </w:p>
+    <w:p>
+      <w:pPr>
+        <w:pStyle w:val="PreformattedText"/>
+        <w:bidi w:val="0"/>
+        <w:jc w:val="left"/>
+        <w:rPr/>
+      </w:pPr>
+      <w:r>
+        <w:rPr>
+          <w:rStyle w:val="SourceText"/>
+        </w:rPr>
+        <w:t>{"agent_id": "a74ce527b5ab3e7cb", "agent_type": "general-purpose", "budget": 2000, "chars": 423, "dedupHits": 0, "event": "SubagentStart", "harness": "claude", "lines": 4, "query_from": "last-prompt", "recall": {"dropped": 0, "reason": "", "snippets": 2, "status": "hit", "vaults": ["proof-recall"]}, "session": "08038c78-3372-4ccb-85d0-2d765b8c79db", "sources": [{"kind": "vault", "note": "notes/other.md", "vault": "proof-recall"}, {"kind": "vault", "note": "notes/brackenmoor-sluice.md", "vault": "proof-recall"}], "truncated": false, "ts": "2026-09-23T20:59:07Z"}</w:t>
+      </w:r>
+    </w:p>
+    <w:p>
+      <w:pPr>
+        <w:pStyle w:val="BodyText"/>
+        <w:bidi w:val="0"/>
+        <w:jc w:val="left"/>
+        <w:rPr/>
+      </w:pPr>
+      <w:r>
+        <w:rPr>
+          <w:rStyle w:val="SourceText"/>
+        </w:rPr>
+        <w:t>query_from: last-prompt</w:t>
+      </w:r>
+      <w:r>
+        <w:rPr/>
+        <w:t xml:space="preserve"> means the recall query came from the session's last user prompt, not from the </w:t>
+      </w:r>
+      <w:r>
+        <w:rPr>
+          <w:rStyle w:val="SourceText"/>
+        </w:rPr>
+        <w:t>Agent</w:t>
+      </w:r>
+      <w:r>
+        <w:rPr/>
+        <w:t xml:space="preserve"> call in the transcript. </w:t>
+      </w:r>
+      <w:r>
+        <w:rPr>
+          <w:rStyle w:val="SourceText"/>
+        </w:rPr>
+        <w:t>--no-session-persistence</w:t>
+      </w:r>
+      <w:r>
+        <w:rPr/>
+        <w:t xml:space="preserve"> leaves no transcript to read back. So this run proves that the real CLI's recall reaches a subagent. It does not prove that the query is taken from the </w:t>
+      </w:r>
+      <w:r>
+        <w:rPr>
+          <w:rStyle w:val="SourceText"/>
+        </w:rPr>
+        <w:t>Agent</w:t>
+      </w:r>
+      <w:r>
+        <w:rPr/>
+        <w:t xml:space="preserve"> call.</w:t>
+      </w:r>
+    </w:p>
+    <w:p>
+      <w:pPr>
+        <w:pStyle w:val="Heading3"/>
+        <w:bidi w:val="0"/>
+        <w:ind w:hanging="0" w:left="0" w:right="0"/>
+        <w:jc w:val="left"/>
+        <w:rPr/>
+      </w:pPr>
+      <w:bookmarkStart w:id="17" w:name="reading-stats"/>
+      <w:bookmarkEnd w:id="17"/>
+      <w:r>
+        <w:rPr/>
+        <w:t xml:space="preserve">Reading </w:t>
+      </w:r>
+      <w:r>
+        <w:rPr>
+          <w:rStyle w:val="SourceText"/>
+        </w:rPr>
+        <w:t>--Stats</w:t>
+      </w:r>
+    </w:p>
+    <w:p>
+      <w:pPr>
+        <w:pStyle w:val="BodyText"/>
+        <w:bidi w:val="0"/>
+        <w:jc w:val="left"/>
+        <w:rPr/>
+      </w:pPr>
+      <w:r>
+        <w:rPr/>
+        <w:t xml:space="preserve">Every emission adds one JSON line to </w:t>
+      </w:r>
+      <w:r>
+        <w:rPr>
+          <w:rStyle w:val="SourceText"/>
+        </w:rPr>
+        <w:t>&lt;git-common-dir&gt;/crew/context-log.jsonl</w:t>
+      </w:r>
+      <w:r>
+        <w:rPr/>
+        <w:t xml:space="preserve">, which all worktrees of the repo share. Outside git, the log is </w:t>
+      </w:r>
+      <w:r>
+        <w:rPr>
+          <w:rStyle w:val="SourceText"/>
+        </w:rPr>
+        <w:t>.work/crew/context-log.jsonl</w:t>
+      </w:r>
+      <w:r>
+        <w:rPr/>
+        <w:t>. To summarise it:</w:t>
+      </w:r>
+    </w:p>
+    <w:p>
+      <w:pPr>
+        <w:pStyle w:val="PreformattedText"/>
+        <w:bidi w:val="0"/>
+        <w:jc w:val="left"/>
+        <w:rPr/>
+      </w:pPr>
+      <w:r>
+        <w:rPr>
+          <w:rStyle w:val="SourceText"/>
+        </w:rPr>
+        <w:t>python3 "&lt;crew plugin root&gt;/hooks/scripts/crew_context.py" --stats          # add --json for machines</w:t>
+      </w:r>
+    </w:p>
+    <w:p>
+      <w:pPr>
+        <w:pStyle w:val="BodyText"/>
+        <w:bidi w:val="0"/>
+        <w:jc w:val="left"/>
+        <w:rPr/>
+      </w:pPr>
+      <w:r>
+        <w:rPr/>
+        <w:t>This is the output after the proof run above, without its first line (the log path):</w:t>
+      </w:r>
+    </w:p>
+    <w:p>
+      <w:pPr>
+        <w:pStyle w:val="PreformattedText"/>
+        <w:bidi w:val="0"/>
+        <w:jc w:val="left"/>
+        <w:rPr/>
+      </w:pPr>
+      <w:r>
+        <w:rPr>
+          <w:rStyle w:val="SourceText"/>
+        </w:rPr>
+        <w:t>emissions: 3  injected chars: 647  dedup hits: 0  truncated: 0</w:t>
+      </w:r>
+    </w:p>
+    <w:p>
+      <w:pPr>
+        <w:pStyle w:val="PreformattedText"/>
+        <w:bidi w:val="0"/>
+        <w:jc w:val="left"/>
+        <w:rPr/>
+      </w:pPr>
+      <w:r>
+        <w:rPr>
+          <w:rStyle w:val="SourceText"/>
+        </w:rPr>
+        <w:t xml:space="preserve">  </w:t>
+      </w:r>
+      <w:r>
+        <w:rPr>
+          <w:rStyle w:val="SourceText"/>
+        </w:rPr>
+        <w:t>SessionStart: 1 emissions, 45 chars</w:t>
+      </w:r>
+    </w:p>
+    <w:p>
+      <w:pPr>
+        <w:pStyle w:val="PreformattedText"/>
+        <w:bidi w:val="0"/>
+        <w:jc w:val="left"/>
+        <w:rPr/>
+      </w:pPr>
+      <w:r>
+        <w:rPr>
+          <w:rStyle w:val="SourceText"/>
+        </w:rPr>
+        <w:t xml:space="preserve">  </w:t>
+      </w:r>
+      <w:r>
+        <w:rPr>
+          <w:rStyle w:val="SourceText"/>
+        </w:rPr>
+        <w:t>SubagentStart: 1 emissions, 352 chars</w:t>
+      </w:r>
+    </w:p>
+    <w:p>
+      <w:pPr>
+        <w:pStyle w:val="PreformattedText"/>
+        <w:bidi w:val="0"/>
+        <w:jc w:val="left"/>
+        <w:rPr/>
+      </w:pPr>
+      <w:r>
+        <w:rPr>
+          <w:rStyle w:val="SourceText"/>
+        </w:rPr>
+        <w:t xml:space="preserve">  </w:t>
+      </w:r>
+      <w:r>
+        <w:rPr>
+          <w:rStyle w:val="SourceText"/>
+        </w:rPr>
+        <w:t>UserPromptSubmit: 1 emissions, 250 chars</w:t>
+      </w:r>
+    </w:p>
+    <w:p>
+      <w:pPr>
+        <w:pStyle w:val="PreformattedText"/>
+        <w:bidi w:val="0"/>
+        <w:jc w:val="left"/>
+        <w:rPr/>
+      </w:pPr>
+      <w:r>
+        <w:rPr>
+          <w:rStyle w:val="SourceText"/>
+        </w:rPr>
+        <w:t>vault recall: 2 hit, 1 miss, 0 skipped; 2 snippets injected; code-map slices: 0</w:t>
+      </w:r>
+    </w:p>
+    <w:p>
+      <w:pPr>
+        <w:pStyle w:val="PreformattedText"/>
+        <w:bidi w:val="0"/>
+        <w:jc w:val="left"/>
+        <w:rPr/>
+      </w:pPr>
+      <w:r>
+        <w:rPr>
+          <w:rStyle w:val="SourceText"/>
+        </w:rPr>
+        <w:t xml:space="preserve">  </w:t>
+      </w:r>
+      <w:r>
+        <w:rPr>
+          <w:rStyle w:val="SourceText"/>
+        </w:rPr>
+        <w:t>miss reasons: no-hits=1</w:t>
+      </w:r>
+    </w:p>
+    <w:p>
+      <w:pPr>
+        <w:pStyle w:val="PreformattedText"/>
+        <w:bidi w:val="0"/>
+        <w:jc w:val="left"/>
+        <w:rPr/>
+      </w:pPr>
+      <w:r>
+        <w:rPr>
+          <w:rStyle w:val="SourceText"/>
+        </w:rPr>
+        <w:t>vault MCP/search tool calls seen: 0</w:t>
+      </w:r>
+    </w:p>
+    <w:p>
+      <w:pPr>
+        <w:pStyle w:val="PreformattedText"/>
+        <w:bidi w:val="0"/>
+        <w:jc w:val="left"/>
+        <w:rPr/>
+      </w:pPr>
+      <w:r>
+        <w:rPr>
+          <w:rStyle w:val="SourceText"/>
+        </w:rPr>
+        <w:t>by harness: claude=3</w:t>
+      </w:r>
+    </w:p>
+    <w:p>
+      <w:pPr>
+        <w:pStyle w:val="BodyText"/>
+        <w:numPr>
+          <w:ilvl w:val="0"/>
+          <w:numId w:val="6"/>
+        </w:numPr>
+        <w:tabs>
+          <w:tab w:val="clear" w:pos="1134"/>
+          <w:tab w:val="left" w:pos="829" w:leader="none"/>
+        </w:tabs>
+        <w:bidi w:val="0"/>
+        <w:spacing w:before="120" w:after="0"/>
+        <w:ind w:hanging="283" w:left="829"/>
+        <w:jc w:val="left"/>
+        <w:rPr/>
+      </w:pPr>
+      <w:r>
+        <w:rPr>
+          <w:rStyle w:val="Strong"/>
+        </w:rPr>
+        <w:t>hit / miss / skipped</w:t>
+      </w:r>
+      <w:r>
+        <w:rPr/>
+        <w:t xml:space="preserve"> are counted per recall attempt. </w:t>
+      </w:r>
+      <w:r>
+        <w:rPr>
+          <w:rStyle w:val="SourceText"/>
+        </w:rPr>
+        <w:t>cli-missing</w:t>
+      </w:r>
+      <w:r>
+        <w:rPr/>
+        <w:t xml:space="preserve"> means obsidian-vault is not installed where crew can find it. </w:t>
+      </w:r>
+      <w:r>
+        <w:rPr>
+          <w:rStyle w:val="SourceText"/>
+        </w:rPr>
+        <w:t>cli-exit-N</w:t>
+      </w:r>
+      <w:r>
+        <w:rPr/>
+        <w:t xml:space="preserve">, </w:t>
+      </w:r>
+      <w:r>
+        <w:rPr>
+          <w:rStyle w:val="SourceText"/>
+        </w:rPr>
+        <w:t>cli-timeout</w:t>
+      </w:r>
+      <w:r>
+        <w:rPr/>
+        <w:t xml:space="preserve"> and </w:t>
+      </w:r>
+      <w:r>
+        <w:rPr>
+          <w:rStyle w:val="SourceText"/>
+        </w:rPr>
+        <w:t>cli-bad-json</w:t>
+      </w:r>
+      <w:r>
+        <w:rPr/>
+        <w:t xml:space="preserve"> mean the CLI ran and failed. </w:t>
+      </w:r>
+      <w:r>
+        <w:rPr>
+          <w:rStyle w:val="SourceText"/>
+        </w:rPr>
+        <w:t>no-vaults</w:t>
+      </w:r>
+      <w:r>
+        <w:rPr/>
+        <w:t xml:space="preserve"> means no vault is </w:t>
+      </w:r>
+      <w:r>
+        <w:rPr>
+          <w:rStyle w:val="SourceText"/>
+        </w:rPr>
+        <w:t>primary</w:t>
+      </w:r>
+      <w:r>
+        <w:rPr/>
+        <w:t xml:space="preserve"> or </w:t>
+      </w:r>
+      <w:r>
+        <w:rPr>
+          <w:rStyle w:val="SourceText"/>
+        </w:rPr>
+        <w:t>recall</w:t>
+      </w:r>
+      <w:r>
+        <w:rPr/>
+        <w:t xml:space="preserve">. </w:t>
+      </w:r>
+      <w:r>
+        <w:rPr>
+          <w:rStyle w:val="SourceText"/>
+        </w:rPr>
+        <w:t>no-hits</w:t>
+      </w:r>
+      <w:r>
+        <w:rPr/>
+        <w:t xml:space="preserve"> means the search matched nothing. </w:t>
+      </w:r>
+    </w:p>
+    <w:p>
+      <w:pPr>
+        <w:pStyle w:val="BodyText"/>
+        <w:numPr>
+          <w:ilvl w:val="0"/>
+          <w:numId w:val="6"/>
+        </w:numPr>
+        <w:tabs>
+          <w:tab w:val="clear" w:pos="1134"/>
+          <w:tab w:val="left" w:pos="829" w:leader="none"/>
+        </w:tabs>
+        <w:bidi w:val="0"/>
+        <w:spacing w:before="120" w:after="0"/>
+        <w:ind w:hanging="283" w:left="829"/>
+        <w:jc w:val="left"/>
+        <w:rPr/>
+      </w:pPr>
+      <w:r>
+        <w:rPr>
+          <w:rStyle w:val="Strong"/>
+        </w:rPr>
+        <w:t>dedup hits</w:t>
+      </w:r>
+      <w:r>
+        <w:rPr/>
+        <w:t xml:space="preserve"> count slices that were not injected again because this context already had them. Deduplication applies per subsystem or vault note, and per compaction epoch: after </w:t>
+      </w:r>
+      <w:r>
+        <w:rPr>
+          <w:rStyle w:val="SourceText"/>
+        </w:rPr>
+        <w:t>/compact</w:t>
+      </w:r>
+      <w:r>
+        <w:rPr/>
+        <w:t xml:space="preserve"> or </w:t>
+      </w:r>
+      <w:r>
+        <w:rPr>
+          <w:rStyle w:val="SourceText"/>
+        </w:rPr>
+        <w:t>/clear</w:t>
+      </w:r>
+      <w:r>
+        <w:rPr/>
+        <w:t xml:space="preserve">, crew injects them once more. </w:t>
+      </w:r>
+    </w:p>
+    <w:p>
+      <w:pPr>
+        <w:pStyle w:val="BodyText"/>
+        <w:numPr>
+          <w:ilvl w:val="0"/>
+          <w:numId w:val="6"/>
+        </w:numPr>
+        <w:tabs>
+          <w:tab w:val="clear" w:pos="1134"/>
+          <w:tab w:val="left" w:pos="829" w:leader="none"/>
+        </w:tabs>
+        <w:bidi w:val="0"/>
+        <w:spacing w:before="120" w:after="0"/>
+        <w:ind w:hanging="283" w:left="829"/>
+        <w:jc w:val="left"/>
+        <w:rPr/>
+      </w:pPr>
+      <w:r>
+        <w:rPr>
+          <w:rStyle w:val="Strong"/>
+        </w:rPr>
+        <w:t>vault MCP/search tool calls seen</w:t>
+      </w:r>
+      <w:r>
+        <w:rPr/>
+        <w:t xml:space="preserve"> counts the times the model searched a vault itself (</w:t>
+      </w:r>
+      <w:r>
+        <w:rPr>
+          <w:rStyle w:val="SourceText"/>
+        </w:rPr>
+        <w:t>mcp__obsidian-*</w:t>
+      </w:r>
+      <w:r>
+        <w:rPr/>
+        <w:t xml:space="preserve">, </w:t>
+      </w:r>
+      <w:r>
+        <w:rPr>
+          <w:rStyle w:val="SourceText"/>
+        </w:rPr>
+        <w:t>mcp__basic-memory__*</w:t>
+      </w:r>
+      <w:r>
+        <w:rPr/>
+        <w:t xml:space="preserve">). The baseline before crew 1.0 was 5 calls in 305 sessions. If recall is helping, this number stays low while hits rise. </w:t>
+      </w:r>
+    </w:p>
+    <w:p>
+      <w:pPr>
+        <w:pStyle w:val="BodyText"/>
+        <w:numPr>
+          <w:ilvl w:val="0"/>
+          <w:numId w:val="6"/>
         </w:numPr>
         <w:tabs>
           <w:tab w:val="clear" w:pos="1134"/>
@@ -4687,8 +5003,8 @@
   <w:abstractNum w:abstractNumId="4">
     <w:lvl w:ilvl="0">
       <w:start w:val="1"/>
-      <w:numFmt w:val="decimal"/>
-      <w:lvlText w:val="%1."/>
+      <w:numFmt w:val="bullet"/>
+      <w:lvlText w:val=""/>
       <w:lvlJc w:val="left"/>
       <w:pPr>
         <w:tabs>
@@ -4696,12 +5012,14 @@
         </w:tabs>
         <w:ind w:left="709" w:hanging="283"/>
       </w:pPr>
-      <w:rPr/>
+      <w:rPr>
+        <w:rFonts w:ascii="Symbol" w:hAnsi="Symbol" w:cs="Symbol" w:hint="default"/>
+      </w:rPr>
     </w:lvl>
     <w:lvl w:ilvl="1">
       <w:start w:val="1"/>
-      <w:numFmt w:val="decimal"/>
-      <w:lvlText w:val="%2."/>
+      <w:numFmt w:val="bullet"/>
+      <w:lvlText w:val=""/>
       <w:lvlJc w:val="left"/>
       <w:pPr>
         <w:tabs>
@@ -4709,12 +5027,14 @@
         </w:tabs>
         <w:ind w:left="1418" w:hanging="283"/>
       </w:pPr>
-      <w:rPr/>
+      <w:rPr>
+        <w:rFonts w:ascii="Symbol" w:hAnsi="Symbol" w:cs="Symbol" w:hint="default"/>
+      </w:rPr>
     </w:lvl>
     <w:lvl w:ilvl="2">
       <w:start w:val="1"/>
-      <w:numFmt w:val="decimal"/>
-      <w:lvlText w:val="%3."/>
+      <w:numFmt w:val="bullet"/>
+      <w:lvlText w:val=""/>
       <w:lvlJc w:val="left"/>
       <w:pPr>
         <w:tabs>
@@ -4722,12 +5042,14 @@
         </w:tabs>
         <w:ind w:left="2127" w:hanging="283"/>
       </w:pPr>
-      <w:rPr/>
+      <w:rPr>
+        <w:rFonts w:ascii="Symbol" w:hAnsi="Symbol" w:cs="Symbol" w:hint="default"/>
+      </w:rPr>
     </w:lvl>
     <w:lvl w:ilvl="3">
       <w:start w:val="1"/>
-      <w:numFmt w:val="decimal"/>
-      <w:lvlText w:val="%4."/>
+      <w:numFmt w:val="bullet"/>
+      <w:lvlText w:val=""/>
       <w:lvlJc w:val="left"/>
       <w:pPr>
         <w:tabs>
@@ -4735,12 +5057,14 @@
         </w:tabs>
         <w:ind w:left="2836" w:hanging="283"/>
       </w:pPr>
-      <w:rPr/>
+      <w:rPr>
+        <w:rFonts w:ascii="Symbol" w:hAnsi="Symbol" w:cs="Symbol" w:hint="default"/>
+      </w:rPr>
     </w:lvl>
     <w:lvl w:ilvl="4">
       <w:start w:val="1"/>
-      <w:numFmt w:val="decimal"/>
-      <w:lvlText w:val="%5."/>
+      <w:numFmt w:val="bullet"/>
+      <w:lvlText w:val=""/>
       <w:lvlJc w:val="left"/>
       <w:pPr>
         <w:tabs>
@@ -4748,12 +5072,14 @@
         </w:tabs>
         <w:ind w:left="3545" w:hanging="283"/>
       </w:pPr>
-      <w:rPr/>
+      <w:rPr>
+        <w:rFonts w:ascii="Symbol" w:hAnsi="Symbol" w:cs="Symbol" w:hint="default"/>
+      </w:rPr>
     </w:lvl>
     <w:lvl w:ilvl="5">
       <w:start w:val="1"/>
-      <w:numFmt w:val="decimal"/>
-      <w:lvlText w:val="%6."/>
+      <w:numFmt w:val="bullet"/>
+      <w:lvlText w:val=""/>
       <w:lvlJc w:val="left"/>
       <w:pPr>
         <w:tabs>
@@ -4761,12 +5087,14 @@
         </w:tabs>
         <w:ind w:left="4254" w:hanging="283"/>
       </w:pPr>
-      <w:rPr/>
+      <w:rPr>
+        <w:rFonts w:ascii="Symbol" w:hAnsi="Symbol" w:cs="Symbol" w:hint="default"/>
+      </w:rPr>
     </w:lvl>
     <w:lvl w:ilvl="6">
       <w:start w:val="1"/>
-      <w:numFmt w:val="decimal"/>
-      <w:lvlText w:val="%7."/>
+      <w:numFmt w:val="bullet"/>
+      <w:lvlText w:val=""/>
       <w:lvlJc w:val="left"/>
       <w:pPr>
         <w:tabs>
@@ -4774,12 +5102,14 @@
         </w:tabs>
         <w:ind w:left="4963" w:hanging="283"/>
       </w:pPr>
-      <w:rPr/>
+      <w:rPr>
+        <w:rFonts w:ascii="Symbol" w:hAnsi="Symbol" w:cs="Symbol" w:hint="default"/>
+      </w:rPr>
     </w:lvl>
     <w:lvl w:ilvl="7">
       <w:start w:val="1"/>
-      <w:numFmt w:val="decimal"/>
-      <w:lvlText w:val="%8."/>
+      <w:numFmt w:val="bullet"/>
+      <w:lvlText w:val=""/>
       <w:lvlJc w:val="left"/>
       <w:pPr>
         <w:tabs>
@@ -4787,12 +5117,14 @@
         </w:tabs>
         <w:ind w:left="5672" w:hanging="283"/>
       </w:pPr>
-      <w:rPr/>
+      <w:rPr>
+        <w:rFonts w:ascii="Symbol" w:hAnsi="Symbol" w:cs="Symbol" w:hint="default"/>
+      </w:rPr>
     </w:lvl>
     <w:lvl w:ilvl="8">
       <w:start w:val="1"/>
-      <w:numFmt w:val="decimal"/>
-      <w:lvlText w:val="%9."/>
+      <w:numFmt w:val="bullet"/>
+      <w:lvlText w:val=""/>
       <w:lvlJc w:val="left"/>
       <w:pPr>
         <w:tabs>
@@ -4800,12 +5132,133 @@
         </w:tabs>
         <w:ind w:left="6381" w:hanging="283"/>
       </w:pPr>
-      <w:rPr/>
+      <w:rPr>
+        <w:rFonts w:ascii="Symbol" w:hAnsi="Symbol" w:cs="Symbol" w:hint="default"/>
+      </w:rPr>
     </w:lvl>
   </w:abstractNum>
   <w:abstractNum w:abstractNumId="5">
     <w:lvl w:ilvl="0">
       <w:start w:val="1"/>
+      <w:numFmt w:val="decimal"/>
+      <w:lvlText w:val="%1."/>
+      <w:lvlJc w:val="left"/>
+      <w:pPr>
+        <w:tabs>
+          <w:tab w:val="num" w:pos="709"/>
+        </w:tabs>
+        <w:ind w:left="709" w:hanging="283"/>
+      </w:pPr>
+      <w:rPr/>
+    </w:lvl>
+    <w:lvl w:ilvl="1">
+      <w:start w:val="1"/>
+      <w:numFmt w:val="decimal"/>
+      <w:lvlText w:val="%2."/>
+      <w:lvlJc w:val="left"/>
+      <w:pPr>
+        <w:tabs>
+          <w:tab w:val="num" w:pos="1418"/>
+        </w:tabs>
+        <w:ind w:left="1418" w:hanging="283"/>
+      </w:pPr>
+      <w:rPr/>
+    </w:lvl>
+    <w:lvl w:ilvl="2">
+      <w:start w:val="1"/>
+      <w:numFmt w:val="decimal"/>
+      <w:lvlText w:val="%3."/>
+      <w:lvlJc w:val="left"/>
+      <w:pPr>
+        <w:tabs>
+          <w:tab w:val="num" w:pos="2127"/>
+        </w:tabs>
+        <w:ind w:left="2127" w:hanging="283"/>
+      </w:pPr>
+      <w:rPr/>
+    </w:lvl>
+    <w:lvl w:ilvl="3">
+      <w:start w:val="1"/>
+      <w:numFmt w:val="decimal"/>
+      <w:lvlText w:val="%4."/>
+      <w:lvlJc w:val="left"/>
+      <w:pPr>
+        <w:tabs>
+          <w:tab w:val="num" w:pos="2836"/>
+        </w:tabs>
+        <w:ind w:left="2836" w:hanging="283"/>
+      </w:pPr>
+      <w:rPr/>
+    </w:lvl>
+    <w:lvl w:ilvl="4">
+      <w:start w:val="1"/>
+      <w:numFmt w:val="decimal"/>
+      <w:lvlText w:val="%5."/>
+      <w:lvlJc w:val="left"/>
+      <w:pPr>
+        <w:tabs>
+          <w:tab w:val="num" w:pos="3545"/>
+        </w:tabs>
+        <w:ind w:left="3545" w:hanging="283"/>
+      </w:pPr>
+      <w:rPr/>
+    </w:lvl>
+    <w:lvl w:ilvl="5">
+      <w:start w:val="1"/>
+      <w:numFmt w:val="decimal"/>
+      <w:lvlText w:val="%6."/>
+      <w:lvlJc w:val="left"/>
+      <w:pPr>
+        <w:tabs>
+          <w:tab w:val="num" w:pos="4254"/>
+        </w:tabs>
+        <w:ind w:left="4254" w:hanging="283"/>
+      </w:pPr>
+      <w:rPr/>
+    </w:lvl>
+    <w:lvl w:ilvl="6">
+      <w:start w:val="1"/>
+      <w:numFmt w:val="decimal"/>
+      <w:lvlText w:val="%7."/>
+      <w:lvlJc w:val="left"/>
+      <w:pPr>
+        <w:tabs>
+          <w:tab w:val="num" w:pos="4963"/>
+        </w:tabs>
+        <w:ind w:left="4963" w:hanging="283"/>
+      </w:pPr>
+      <w:rPr/>
+    </w:lvl>
+    <w:lvl w:ilvl="7">
+      <w:start w:val="1"/>
+      <w:numFmt w:val="decimal"/>
+      <w:lvlText w:val="%8."/>
+      <w:lvlJc w:val="left"/>
+      <w:pPr>
+        <w:tabs>
+          <w:tab w:val="num" w:pos="5672"/>
+        </w:tabs>
+        <w:ind w:left="5672" w:hanging="283"/>
+      </w:pPr>
+      <w:rPr/>
+    </w:lvl>
+    <w:lvl w:ilvl="8">
+      <w:start w:val="1"/>
+      <w:numFmt w:val="decimal"/>
+      <w:lvlText w:val="%9."/>
+      <w:lvlJc w:val="left"/>
+      <w:pPr>
+        <w:tabs>
+          <w:tab w:val="num" w:pos="6381"/>
+        </w:tabs>
+        <w:ind w:left="6381" w:hanging="283"/>
+      </w:pPr>
+      <w:rPr/>
+    </w:lvl>
+  </w:abstractNum>
+  <w:abstractNum w:abstractNumId="6">
+    <w:lvl w:ilvl="0">
+      <w:start w:val="1"/>
       <w:numFmt w:val="bullet"/>
       <w:lvlText w:val=""/>
       <w:lvlJc w:val="left"/>
@@ -4940,7 +5393,7 @@
       </w:rPr>
     </w:lvl>
   </w:abstractNum>
-  <w:abstractNum w:abstractNumId="6">
+  <w:abstractNum w:abstractNumId="7">
     <w:lvl w:ilvl="0">
       <w:start w:val="1"/>
       <w:numFmt w:val="none"/>
@@ -5079,6 +5532,9 @@
   </w:num>
   <w:num w:numId="6">
     <w:abstractNumId w:val="6"/>
+  </w:num>
+  <w:num w:numId="7">
+    <w:abstractNumId w:val="7"/>
   </w:num>
 </w:numbering>
 </file>

</xml_diff>

<commit_message>
crew: T-0021 round-4 docs - README repo-id rules, ticket-board guide section, id-taken troubleshooting; step crew back to 1.0.42 so 1.0.43 can be re-set last
README 13c's "Whose card" states the round-4 repo-id rules (ssh username
kept, password dropped, other schemes' userinfo dropped, file:// decoded)
and create's claim order. CHANGELOG's 1.0.43 entry gains the round-4
paragraph. memory-and-obsidian.md gains "The ticket board" after Setup;
troubleshooting.md's Obsidian section gains the create-refused entry, its
four lines captured from a throwaway-fixture run. Only those two guides are
rebuilt with build.py --guide (renderer: LibreOffice 26.2.5.2, named on each
output line). The troubleshooting HTML/DOCX/PDF also pick up auto-cycle.md
and troubleshooting.md edits from T-0006 (ea697b95, 6d35ef8c) that were
committed without a rebuild.

Claude-Session: https://claude.ai/code/session_01WuCazBWGU8tFLxG36D1yFu
</commit_message>
<xml_diff>
--- a/docs/guides/crew/crew-1.0-memory-and-obsidian.docx
+++ b/docs/guides/crew/crew-1.0-memory-and-obsidian.docx
@@ -2265,10 +2265,641 @@
         <w:jc w:val="left"/>
         <w:rPr/>
       </w:pPr>
-      <w:bookmarkStart w:id="10" w:name="confirming-recall-reaches-your-sessions"/>
+      <w:bookmarkStart w:id="10" w:name="the-ticket-board"/>
       <w:bookmarkEnd w:id="10"/>
       <w:r>
         <w:rPr/>
+        <w:t>The Ticket Board</w:t>
+      </w:r>
+    </w:p>
+    <w:p>
+      <w:pPr>
+        <w:pStyle w:val="BodyText"/>
+        <w:bidi w:val="0"/>
+        <w:jc w:val="left"/>
+        <w:rPr/>
+      </w:pPr>
+      <w:r>
+        <w:rPr/>
+        <w:t xml:space="preserve">The same vault can hold a Kanban board of your tickets, which crew moves for you at each lifecycle step. Crew writes the files itself, so nothing here needs the bridge or the </w:t>
+      </w:r>
+      <w:r>
+        <w:rPr>
+          <w:rStyle w:val="SourceText"/>
+        </w:rPr>
+        <w:t>obsidian-vault</w:t>
+      </w:r>
+      <w:r>
+        <w:rPr/>
+        <w:t xml:space="preserve"> plugin; the vault needs </w:t>
+      </w:r>
+      <w:r>
+        <w:rPr>
+          <w:rStyle w:val="SourceText"/>
+        </w:rPr>
+        <w:t>.obsidian/</w:t>
+      </w:r>
+      <w:r>
+        <w:rPr/>
+        <w:t xml:space="preserve"> and the Kanban community plugin.</w:t>
+      </w:r>
+    </w:p>
+    <w:p>
+      <w:pPr>
+        <w:pStyle w:val="BodyText"/>
+        <w:bidi w:val="0"/>
+        <w:jc w:val="left"/>
+        <w:rPr/>
+      </w:pPr>
+      <w:r>
+        <w:rPr>
+          <w:rStyle w:val="Strong"/>
+        </w:rPr>
+        <w:t>Turning it on.</w:t>
+      </w:r>
+      <w:r>
+        <w:rPr/>
+        <w:t xml:space="preserve"> In </w:t>
+      </w:r>
+      <w:r>
+        <w:rPr>
+          <w:rStyle w:val="SourceText"/>
+        </w:rPr>
+        <w:t>.crew/crew.json</w:t>
+      </w:r>
+      <w:r>
+        <w:rPr/>
+        <w:t xml:space="preserve">, set </w:t>
+      </w:r>
+      <w:r>
+        <w:rPr>
+          <w:rStyle w:val="SourceText"/>
+        </w:rPr>
+        <w:t>tracker.kind</w:t>
+      </w:r>
+      <w:r>
+        <w:rPr/>
+        <w:t xml:space="preserve"> to </w:t>
+      </w:r>
+      <w:r>
+        <w:rPr>
+          <w:rStyle w:val="SourceText"/>
+        </w:rPr>
+        <w:t>obsidian</w:t>
+      </w:r>
+      <w:r>
+        <w:rPr/>
+        <w:t xml:space="preserve"> and give </w:t>
+      </w:r>
+      <w:r>
+        <w:rPr>
+          <w:rStyle w:val="SourceText"/>
+        </w:rPr>
+        <w:t>tracker.obsidian</w:t>
+      </w:r>
+      <w:r>
+        <w:rPr/>
+        <w:t xml:space="preserve"> a </w:t>
+      </w:r>
+      <w:r>
+        <w:rPr>
+          <w:rStyle w:val="SourceText"/>
+        </w:rPr>
+        <w:t>vaultPath</w:t>
+      </w:r>
+      <w:r>
+        <w:rPr/>
+        <w:t xml:space="preserve">, a </w:t>
+      </w:r>
+      <w:r>
+        <w:rPr>
+          <w:rStyle w:val="SourceText"/>
+        </w:rPr>
+        <w:t>boardDir</w:t>
+      </w:r>
+      <w:r>
+        <w:rPr/>
+        <w:t xml:space="preserve"> (relative to the vault) and optionally </w:t>
+      </w:r>
+      <w:r>
+        <w:rPr>
+          <w:rStyle w:val="SourceText"/>
+        </w:rPr>
+        <w:t>board</w:t>
+      </w:r>
+      <w:r>
+        <w:rPr/>
+        <w:t xml:space="preserve"> (default </w:t>
+      </w:r>
+      <w:r>
+        <w:rPr>
+          <w:rStyle w:val="SourceText"/>
+        </w:rPr>
+        <w:t>Board.md</w:t>
+      </w:r>
+      <w:r>
+        <w:rPr/>
+        <w:t xml:space="preserve">) and </w:t>
+      </w:r>
+      <w:r>
+        <w:rPr>
+          <w:rStyle w:val="SourceText"/>
+        </w:rPr>
+        <w:t>columns</w:t>
+      </w:r>
+      <w:r>
+        <w:rPr/>
+        <w:t xml:space="preserve"> (your lane names). Give every repository its own </w:t>
+      </w:r>
+      <w:r>
+        <w:rPr>
+          <w:rStyle w:val="SourceText"/>
+        </w:rPr>
+        <w:t>boardDir</w:t>
+      </w:r>
+      <w:r>
+        <w:rPr/>
+        <w:t>: with it unset, every repo shares one board at the vault root, and a card another repo owns is refused.</w:t>
+      </w:r>
+    </w:p>
+    <w:tbl>
+      <w:tblPr>
+        <w:tblW w:w="6042" w:type="dxa"/>
+        <w:jc w:val="left"/>
+        <w:tblInd w:w="28" w:type="dxa"/>
+        <w:tblLayout w:type="fixed"/>
+        <w:tblCellMar>
+          <w:top w:w="28" w:type="dxa"/>
+          <w:left w:w="28" w:type="dxa"/>
+          <w:bottom w:w="28" w:type="dxa"/>
+          <w:right w:w="28" w:type="dxa"/>
+        </w:tblCellMar>
+      </w:tblPr>
+      <w:tblGrid>
+        <w:gridCol w:w="2001"/>
+        <w:gridCol w:w="4041"/>
+      </w:tblGrid>
+      <w:tr>
+        <w:trPr>
+          <w:tblHeader w:val="true"/>
+        </w:trPr>
+        <w:tc>
+          <w:tcPr>
+            <w:tcW w:w="2001" w:type="dxa"/>
+            <w:tcBorders/>
+            <w:vAlign w:val="center"/>
+          </w:tcPr>
+          <w:p>
+            <w:pPr>
+              <w:pStyle w:val="TableHeading"/>
+              <w:suppressLineNumbers/>
+              <w:shd w:fill="434C5E" w:val="clear"/>
+              <w:bidi w:val="0"/>
+              <w:spacing w:before="120" w:after="120"/>
+              <w:jc w:val="left"/>
+              <w:rPr/>
+            </w:pPr>
+            <w:r>
+              <w:rPr/>
+              <w:t>Ticket status</w:t>
+            </w:r>
+          </w:p>
+        </w:tc>
+        <w:tc>
+          <w:tcPr>
+            <w:tcW w:w="4041" w:type="dxa"/>
+            <w:tcBorders/>
+            <w:vAlign w:val="center"/>
+          </w:tcPr>
+          <w:p>
+            <w:pPr>
+              <w:pStyle w:val="TableHeading"/>
+              <w:suppressLineNumbers/>
+              <w:shd w:fill="434C5E" w:val="clear"/>
+              <w:bidi w:val="0"/>
+              <w:spacing w:before="120" w:after="120"/>
+              <w:jc w:val="left"/>
+              <w:rPr/>
+            </w:pPr>
+            <w:r>
+              <w:rPr/>
+              <w:t>Lane (default name)</w:t>
+            </w:r>
+          </w:p>
+        </w:tc>
+      </w:tr>
+      <w:tr>
+        <w:trPr/>
+        <w:tc>
+          <w:tcPr>
+            <w:tcW w:w="2001" w:type="dxa"/>
+            <w:tcBorders/>
+            <w:vAlign w:val="center"/>
+          </w:tcPr>
+          <w:p>
+            <w:pPr>
+              <w:pStyle w:val="TableContents"/>
+              <w:shd w:fill="2E3440" w:val="clear"/>
+              <w:bidi w:val="0"/>
+              <w:spacing w:before="120" w:after="120"/>
+              <w:jc w:val="left"/>
+              <w:rPr/>
+            </w:pPr>
+            <w:r>
+              <w:rPr>
+                <w:rStyle w:val="SourceText"/>
+              </w:rPr>
+              <w:t>direction</w:t>
+            </w:r>
+            <w:r>
+              <w:rPr/>
+              <w:t xml:space="preserve">, </w:t>
+            </w:r>
+            <w:r>
+              <w:rPr>
+                <w:rStyle w:val="SourceText"/>
+              </w:rPr>
+              <w:t>ready</w:t>
+            </w:r>
+          </w:p>
+        </w:tc>
+        <w:tc>
+          <w:tcPr>
+            <w:tcW w:w="4041" w:type="dxa"/>
+            <w:tcBorders/>
+            <w:vAlign w:val="center"/>
+          </w:tcPr>
+          <w:p>
+            <w:pPr>
+              <w:pStyle w:val="TableContents"/>
+              <w:shd w:fill="2E3440" w:val="clear"/>
+              <w:bidi w:val="0"/>
+              <w:spacing w:before="120" w:after="120"/>
+              <w:jc w:val="left"/>
+              <w:rPr/>
+            </w:pPr>
+            <w:r>
+              <w:rPr/>
+              <w:t>Backlog</w:t>
+            </w:r>
+          </w:p>
+        </w:tc>
+      </w:tr>
+      <w:tr>
+        <w:trPr/>
+        <w:tc>
+          <w:tcPr>
+            <w:tcW w:w="2001" w:type="dxa"/>
+            <w:tcBorders/>
+            <w:vAlign w:val="center"/>
+          </w:tcPr>
+          <w:p>
+            <w:pPr>
+              <w:pStyle w:val="TableContents"/>
+              <w:shd w:fill="2E3440" w:val="clear"/>
+              <w:bidi w:val="0"/>
+              <w:spacing w:before="120" w:after="120"/>
+              <w:jc w:val="left"/>
+              <w:rPr/>
+            </w:pPr>
+            <w:r>
+              <w:rPr>
+                <w:rStyle w:val="SourceText"/>
+              </w:rPr>
+              <w:t>spec</w:t>
+            </w:r>
+            <w:r>
+              <w:rPr/>
+              <w:t xml:space="preserve">, </w:t>
+            </w:r>
+            <w:r>
+              <w:rPr>
+                <w:rStyle w:val="SourceText"/>
+              </w:rPr>
+              <w:t>planned</w:t>
+            </w:r>
+          </w:p>
+        </w:tc>
+        <w:tc>
+          <w:tcPr>
+            <w:tcW w:w="4041" w:type="dxa"/>
+            <w:tcBorders/>
+            <w:vAlign w:val="center"/>
+          </w:tcPr>
+          <w:p>
+            <w:pPr>
+              <w:pStyle w:val="TableContents"/>
+              <w:shd w:fill="2E3440" w:val="clear"/>
+              <w:bidi w:val="0"/>
+              <w:spacing w:before="120" w:after="120"/>
+              <w:jc w:val="left"/>
+              <w:rPr/>
+            </w:pPr>
+            <w:r>
+              <w:rPr/>
+              <w:t>Ready</w:t>
+            </w:r>
+          </w:p>
+        </w:tc>
+      </w:tr>
+      <w:tr>
+        <w:trPr/>
+        <w:tc>
+          <w:tcPr>
+            <w:tcW w:w="2001" w:type="dxa"/>
+            <w:tcBorders/>
+            <w:vAlign w:val="center"/>
+          </w:tcPr>
+          <w:p>
+            <w:pPr>
+              <w:pStyle w:val="TableContents"/>
+              <w:shd w:fill="2E3440" w:val="clear"/>
+              <w:bidi w:val="0"/>
+              <w:spacing w:before="120" w:after="120"/>
+              <w:jc w:val="left"/>
+              <w:rPr/>
+            </w:pPr>
+            <w:r>
+              <w:rPr>
+                <w:rStyle w:val="SourceText"/>
+              </w:rPr>
+              <w:t>in-progress</w:t>
+            </w:r>
+          </w:p>
+        </w:tc>
+        <w:tc>
+          <w:tcPr>
+            <w:tcW w:w="4041" w:type="dxa"/>
+            <w:tcBorders/>
+            <w:vAlign w:val="center"/>
+          </w:tcPr>
+          <w:p>
+            <w:pPr>
+              <w:pStyle w:val="TableContents"/>
+              <w:shd w:fill="2E3440" w:val="clear"/>
+              <w:bidi w:val="0"/>
+              <w:spacing w:before="120" w:after="120"/>
+              <w:jc w:val="left"/>
+              <w:rPr/>
+            </w:pPr>
+            <w:r>
+              <w:rPr/>
+              <w:t>In Progress</w:t>
+            </w:r>
+          </w:p>
+        </w:tc>
+      </w:tr>
+      <w:tr>
+        <w:trPr/>
+        <w:tc>
+          <w:tcPr>
+            <w:tcW w:w="2001" w:type="dxa"/>
+            <w:tcBorders/>
+            <w:vAlign w:val="center"/>
+          </w:tcPr>
+          <w:p>
+            <w:pPr>
+              <w:pStyle w:val="TableContents"/>
+              <w:shd w:fill="2E3440" w:val="clear"/>
+              <w:bidi w:val="0"/>
+              <w:spacing w:before="120" w:after="120"/>
+              <w:jc w:val="left"/>
+              <w:rPr/>
+            </w:pPr>
+            <w:r>
+              <w:rPr>
+                <w:rStyle w:val="SourceText"/>
+              </w:rPr>
+              <w:t>review</w:t>
+            </w:r>
+          </w:p>
+        </w:tc>
+        <w:tc>
+          <w:tcPr>
+            <w:tcW w:w="4041" w:type="dxa"/>
+            <w:tcBorders/>
+            <w:vAlign w:val="center"/>
+          </w:tcPr>
+          <w:p>
+            <w:pPr>
+              <w:pStyle w:val="TableContents"/>
+              <w:shd w:fill="2E3440" w:val="clear"/>
+              <w:bidi w:val="0"/>
+              <w:spacing w:before="120" w:after="120"/>
+              <w:jc w:val="left"/>
+              <w:rPr/>
+            </w:pPr>
+            <w:r>
+              <w:rPr/>
+              <w:t>Review</w:t>
+            </w:r>
+          </w:p>
+        </w:tc>
+      </w:tr>
+      <w:tr>
+        <w:trPr/>
+        <w:tc>
+          <w:tcPr>
+            <w:tcW w:w="2001" w:type="dxa"/>
+            <w:tcBorders/>
+            <w:vAlign w:val="center"/>
+          </w:tcPr>
+          <w:p>
+            <w:pPr>
+              <w:pStyle w:val="TableContents"/>
+              <w:shd w:fill="2E3440" w:val="clear"/>
+              <w:bidi w:val="0"/>
+              <w:spacing w:before="120" w:after="120"/>
+              <w:jc w:val="left"/>
+              <w:rPr/>
+            </w:pPr>
+            <w:r>
+              <w:rPr>
+                <w:rStyle w:val="SourceText"/>
+              </w:rPr>
+              <w:t>done</w:t>
+            </w:r>
+          </w:p>
+        </w:tc>
+        <w:tc>
+          <w:tcPr>
+            <w:tcW w:w="4041" w:type="dxa"/>
+            <w:tcBorders/>
+            <w:vAlign w:val="center"/>
+          </w:tcPr>
+          <w:p>
+            <w:pPr>
+              <w:pStyle w:val="TableContents"/>
+              <w:shd w:fill="2E3440" w:val="clear"/>
+              <w:bidi w:val="0"/>
+              <w:spacing w:before="120" w:after="120"/>
+              <w:jc w:val="left"/>
+              <w:rPr/>
+            </w:pPr>
+            <w:r>
+              <w:rPr/>
+              <w:t xml:space="preserve">Done, checked, below </w:t>
+            </w:r>
+            <w:r>
+              <w:rPr>
+                <w:rStyle w:val="SourceText"/>
+              </w:rPr>
+              <w:t>**Complete**</w:t>
+            </w:r>
+          </w:p>
+        </w:tc>
+      </w:tr>
+    </w:tbl>
+    <w:p>
+      <w:pPr>
+        <w:pStyle w:val="BodyText"/>
+        <w:bidi w:val="0"/>
+        <w:jc w:val="left"/>
+        <w:rPr/>
+      </w:pPr>
+      <w:r>
+        <w:rPr>
+          <w:rStyle w:val="Strong"/>
+        </w:rPr>
+        <w:t>Whose card it is.</w:t>
+      </w:r>
+      <w:r>
+        <w:rPr/>
+        <w:t xml:space="preserve"> </w:t>
+      </w:r>
+      <w:r>
+        <w:rPr>
+          <w:rStyle w:val="SourceText"/>
+        </w:rPr>
+        <w:t>/crew:brainstorm</w:t>
+      </w:r>
+      <w:r>
+        <w:rPr/>
+        <w:t xml:space="preserve"> writes a ticket note beside the board, </w:t>
+      </w:r>
+      <w:r>
+        <w:rPr>
+          <w:rStyle w:val="SourceText"/>
+        </w:rPr>
+        <w:t>&lt;boardDir&gt;/T-0042.md</w:t>
+      </w:r>
+      <w:r>
+        <w:rPr/>
+        <w:t xml:space="preserve">, once. Its </w:t>
+      </w:r>
+      <w:r>
+        <w:rPr>
+          <w:rStyle w:val="SourceText"/>
+        </w:rPr>
+        <w:t>repo-id:</w:t>
+      </w:r>
+      <w:r>
+        <w:rPr/>
+        <w:t xml:space="preserve"> line is how crew tells your repository's cards from another's. The value is your origin URL, lowercased with </w:t>
+      </w:r>
+      <w:r>
+        <w:rPr>
+          <w:rStyle w:val="SourceText"/>
+        </w:rPr>
+        <w:t>.git</w:t>
+      </w:r>
+      <w:r>
+        <w:rPr/>
+        <w:t xml:space="preserve"> dropped, or the git directory's path when there is no origin. An ssh origin keeps its username (</w:t>
+      </w:r>
+      <w:r>
+        <w:rPr>
+          <w:rStyle w:val="SourceText"/>
+        </w:rPr>
+        <w:t>git@github.com:team/app</w:t>
+      </w:r>
+      <w:r>
+        <w:rPr/>
+        <w:t xml:space="preserve">); other URLs lose any user or token; a </w:t>
+      </w:r>
+      <w:r>
+        <w:rPr>
+          <w:rStyle w:val="SourceText"/>
+        </w:rPr>
+        <w:t>file://</w:t>
+      </w:r>
+      <w:r>
+        <w:rPr/>
+        <w:t xml:space="preserve"> origin is decoded to its path.</w:t>
+      </w:r>
+    </w:p>
+    <w:p>
+      <w:pPr>
+        <w:pStyle w:val="BodyText"/>
+        <w:bidi w:val="0"/>
+        <w:jc w:val="left"/>
+        <w:rPr/>
+      </w:pPr>
+      <w:r>
+        <w:rPr>
+          <w:rStyle w:val="Strong"/>
+        </w:rPr>
+        <w:t>Claiming an older note.</w:t>
+      </w:r>
+      <w:r>
+        <w:rPr/>
+        <w:t xml:space="preserve"> A card whose note has no </w:t>
+      </w:r>
+      <w:r>
+        <w:rPr>
+          <w:rStyle w:val="SourceText"/>
+        </w:rPr>
+        <w:t>repo-id:</w:t>
+      </w:r>
+      <w:r>
+        <w:rPr/>
+        <w:t xml:space="preserve"> (a board from crew 0.20, or a card you added by hand) is refused until you add one. The refusal names the exact line: add </w:t>
+      </w:r>
+      <w:r>
+        <w:rPr>
+          <w:rStyle w:val="SourceText"/>
+        </w:rPr>
+        <w:t>- repo-id: &lt;the id it prints&gt;</w:t>
+      </w:r>
+      <w:r>
+        <w:rPr/>
+        <w:t xml:space="preserve"> to the note and run the command again. Crew never rewrites a note for you.</w:t>
+      </w:r>
+    </w:p>
+    <w:p>
+      <w:pPr>
+        <w:pStyle w:val="BodyText"/>
+        <w:bidi w:val="0"/>
+        <w:jc w:val="left"/>
+        <w:rPr/>
+      </w:pPr>
+      <w:r>
+        <w:rPr/>
+        <w:t xml:space="preserve">The full rules, including every refusal, are in the crew README, section 13c ("Optional: an Obsidian Kanban board"), in </w:t>
+      </w:r>
+      <w:r>
+        <w:rPr>
+          <w:rStyle w:val="SourceText"/>
+        </w:rPr>
+        <w:t>plugin/crew/README.md</w:t>
+      </w:r>
+      <w:r>
+        <w:rPr/>
+        <w:t>.</w:t>
+      </w:r>
+    </w:p>
+    <w:p>
+      <w:pPr>
+        <w:pStyle w:val="Heading2"/>
+        <w:bidi w:val="0"/>
+        <w:ind w:hanging="0" w:left="0" w:right="0"/>
+        <w:jc w:val="left"/>
+        <w:rPr/>
+      </w:pPr>
+      <w:bookmarkStart w:id="11" w:name="confirming-recall-reaches-your-sessions"/>
+      <w:bookmarkEnd w:id="11"/>
+      <w:r>
+        <w:rPr/>
         <w:t>Confirming Recall Reaches Your Sessions</w:t>
       </w:r>
     </w:p>
@@ -2292,8 +2923,8 @@
         <w:jc w:val="left"/>
         <w:rPr/>
       </w:pPr>
-      <w:bookmarkStart w:id="11" w:name="path-scoped-rules-from-the-code-map"/>
-      <w:bookmarkEnd w:id="11"/>
+      <w:bookmarkStart w:id="12" w:name="path-scoped-rules-from-the-code-map"/>
+      <w:bookmarkEnd w:id="12"/>
       <w:r>
         <w:rPr/>
         <w:t>Path-Scoped Rules from the Code Map</w:t>
@@ -2546,8 +3177,8 @@
         <w:jc w:val="left"/>
         <w:rPr/>
       </w:pPr>
-      <w:bookmarkStart w:id="12" w:name="confirming-recall-reaches-your-sessions_"/>
-      <w:bookmarkEnd w:id="12"/>
+      <w:bookmarkStart w:id="13" w:name="confirming-recall-reaches-your-sessions_"/>
+      <w:bookmarkEnd w:id="13"/>
       <w:r>
         <w:rPr/>
         <w:t>Confirming Recall Reaches Your Sessions</w:t>
@@ -2695,8 +3326,8 @@
         <w:jc w:val="left"/>
         <w:rPr/>
       </w:pPr>
-      <w:bookmarkStart w:id="13" w:name="which-channel-reaches-which-agent"/>
-      <w:bookmarkEnd w:id="13"/>
+      <w:bookmarkStart w:id="14" w:name="which-channel-reaches-which-agent"/>
+      <w:bookmarkEnd w:id="14"/>
       <w:r>
         <w:rPr/>
         <w:t>Which Channel Reaches Which Agent</w:t>
@@ -3168,8 +3799,8 @@
         <w:jc w:val="left"/>
         <w:rPr/>
       </w:pPr>
-      <w:bookmarkStart w:id="14" w:name="where-recall-comes-from"/>
-      <w:bookmarkEnd w:id="14"/>
+      <w:bookmarkStart w:id="15" w:name="where-recall-comes-from"/>
+      <w:bookmarkEnd w:id="15"/>
       <w:r>
         <w:rPr/>
         <w:t>Where Recall Comes From</w:t>
@@ -3400,8 +4031,8 @@
         <w:jc w:val="left"/>
         <w:rPr/>
       </w:pPr>
-      <w:bookmarkStart w:id="15" w:name="the-seeded-note-proof"/>
-      <w:bookmarkEnd w:id="15"/>
+      <w:bookmarkStart w:id="16" w:name="the-seeded-note-proof"/>
+      <w:bookmarkEnd w:id="16"/>
       <w:r>
         <w:rPr/>
         <w:t>The Seeded-Note Proof</w:t>
@@ -3847,8 +4478,8 @@
         <w:jc w:val="left"/>
         <w:rPr/>
       </w:pPr>
-      <w:bookmarkStart w:id="16" w:name="measured-against-the-real-vault_opspy-re"/>
-      <w:bookmarkEnd w:id="16"/>
+      <w:bookmarkStart w:id="17" w:name="measured-against-the-real-vault_opspy-re"/>
+      <w:bookmarkEnd w:id="17"/>
       <w:r>
         <w:rPr/>
         <w:t xml:space="preserve">Measured against the real </w:t>
@@ -4115,8 +4746,8 @@
         <w:jc w:val="left"/>
         <w:rPr/>
       </w:pPr>
-      <w:bookmarkStart w:id="17" w:name="reading-stats"/>
-      <w:bookmarkEnd w:id="17"/>
+      <w:bookmarkStart w:id="18" w:name="reading-stats"/>
+      <w:bookmarkEnd w:id="18"/>
       <w:r>
         <w:rPr/>
         <w:t xml:space="preserve">Reading </w:t>

</xml_diff>

<commit_message>
T-0501: docs, verify rules 32-33 and sabotage entries for rules' anchor advice
migrate.md (preview and apply) and onboard.md step 6 say what the anchor
behind: / anchor unresolvable: / anchors: could not tell lines mean and what
to do; the memory-and-obsidian guide's rules bullet says the same, rebuilt to
HTML, DOCX and PDF (build.py --guide memory-and-obsidian, LibreOffice). Rule 24's
why gains the advisory sentence; rule 32 runs the generator's suites, rule 33
the budget checker's. sabotage_context.py gains two entries, each red by hand.
Code maps crew.md and verification-harness.md describe the lines and rules;
their .claude/rules regenerated.
</commit_message>
<xml_diff>
--- a/docs/guides/crew/crew-1.0-memory-and-obsidian.docx
+++ b/docs/guides/crew/crew-1.0-memory-and-obsidian.docx
@@ -3061,7 +3061,37 @@
       </w:r>
       <w:r>
         <w:rPr/>
-        <w:t xml:space="preserve"> list, the note's landmines, and the sha256 of the note it came from. A hand-written file already at that path is reported and left alone. </w:t>
+        <w:t xml:space="preserve"> list, the note's landmines, and the sha256 of the note it came from. A hand-written file already at that path is reported and left alone. Since crew 1.0.62 both commands also print one </w:t>
+      </w:r>
+      <w:r>
+        <w:rPr>
+          <w:rStyle w:val="SourceText"/>
+        </w:rPr>
+        <w:t>anchor behind:</w:t>
+      </w:r>
+      <w:r>
+        <w:rPr/>
+        <w:t xml:space="preserve"> or </w:t>
+      </w:r>
+      <w:r>
+        <w:rPr>
+          <w:rStyle w:val="SourceText"/>
+        </w:rPr>
+        <w:t>anchor unresolvable:</w:t>
+      </w:r>
+      <w:r>
+        <w:rPr/>
+        <w:t xml:space="preserve"> line per note they render a rule from whose anchor needs re-check - the same classification as session-start's "Anchors to re-check" line - or </w:t>
+      </w:r>
+      <w:r>
+        <w:rPr>
+          <w:rStyle w:val="SourceText"/>
+        </w:rPr>
+        <w:t>anchors: could not tell</w:t>
+      </w:r>
+      <w:r>
+        <w:rPr/>
+        <w:t xml:space="preserve"> when there is no git HEAD. They are advisory only: the exit codes and the generated files are unchanged, and a note that yields no rule is not reported here. </w:t>
       </w:r>
     </w:p>
     <w:p>

</xml_diff>

<commit_message>
T-0084: document vault pointers; verify.json rule; remove the ticket folder
Skill section, README section 14, the memory guide (rebuilt), PLUGINS row,
codemap section, CHANGELOG entry and a verify.json rule for crew_memory.py.

Claude-Session: https://claude.ai/code/session_016wQA2o38aSB65bpjaGpMVJ
</commit_message>
<xml_diff>
--- a/docs/guides/crew/crew-1.0-memory-and-obsidian.docx
+++ b/docs/guides/crew/crew-1.0-memory-and-obsidian.docx
@@ -674,7 +674,7 @@
     </w:p>
     <w:tbl>
       <w:tblPr>
-        <w:tblW w:w="4848" w:type="dxa"/>
+        <w:tblW w:w="5148" w:type="dxa"/>
         <w:jc w:val="left"/>
         <w:tblInd w:w="0" w:type="dxa"/>
         <w:tblLayout w:type="fixed"/>
@@ -686,8 +686,8 @@
         </w:tblCellMar>
       </w:tblPr>
       <w:tblGrid>
-        <w:gridCol w:w="1754"/>
-        <w:gridCol w:w="3094"/>
+        <w:gridCol w:w="1801"/>
+        <w:gridCol w:w="3347"/>
       </w:tblGrid>
       <w:tr>
         <w:trPr>
@@ -695,7 +695,7 @@
         </w:trPr>
         <w:tc>
           <w:tcPr>
-            <w:tcW w:w="1754" w:type="dxa"/>
+            <w:tcW w:w="1801" w:type="dxa"/>
             <w:tcBorders/>
             <w:vAlign w:val="center"/>
           </w:tcPr>
@@ -717,7 +717,7 @@
         </w:tc>
         <w:tc>
           <w:tcPr>
-            <w:tcW w:w="3094" w:type="dxa"/>
+            <w:tcW w:w="3347" w:type="dxa"/>
             <w:tcBorders/>
             <w:vAlign w:val="center"/>
           </w:tcPr>
@@ -742,7 +742,7 @@
         <w:trPr/>
         <w:tc>
           <w:tcPr>
-            <w:tcW w:w="1754" w:type="dxa"/>
+            <w:tcW w:w="1801" w:type="dxa"/>
             <w:tcBorders/>
             <w:vAlign w:val="center"/>
           </w:tcPr>
@@ -763,7 +763,7 @@
         </w:tc>
         <w:tc>
           <w:tcPr>
-            <w:tcW w:w="3094" w:type="dxa"/>
+            <w:tcW w:w="3347" w:type="dxa"/>
             <w:tcBorders/>
             <w:vAlign w:val="center"/>
           </w:tcPr>
@@ -807,7 +807,7 @@
         <w:trPr/>
         <w:tc>
           <w:tcPr>
-            <w:tcW w:w="1754" w:type="dxa"/>
+            <w:tcW w:w="1801" w:type="dxa"/>
             <w:tcBorders/>
             <w:vAlign w:val="center"/>
           </w:tcPr>
@@ -828,7 +828,7 @@
         </w:tc>
         <w:tc>
           <w:tcPr>
-            <w:tcW w:w="3094" w:type="dxa"/>
+            <w:tcW w:w="3347" w:type="dxa"/>
             <w:tcBorders/>
             <w:vAlign w:val="center"/>
           </w:tcPr>
@@ -862,7 +862,7 @@
         <w:trPr/>
         <w:tc>
           <w:tcPr>
-            <w:tcW w:w="1754" w:type="dxa"/>
+            <w:tcW w:w="1801" w:type="dxa"/>
             <w:tcBorders/>
             <w:vAlign w:val="center"/>
           </w:tcPr>
@@ -883,7 +883,7 @@
         </w:tc>
         <w:tc>
           <w:tcPr>
-            <w:tcW w:w="3094" w:type="dxa"/>
+            <w:tcW w:w="3347" w:type="dxa"/>
             <w:tcBorders/>
             <w:vAlign w:val="center"/>
           </w:tcPr>
@@ -913,7 +913,7 @@
         <w:trPr/>
         <w:tc>
           <w:tcPr>
-            <w:tcW w:w="1754" w:type="dxa"/>
+            <w:tcW w:w="1801" w:type="dxa"/>
             <w:tcBorders/>
             <w:vAlign w:val="center"/>
           </w:tcPr>
@@ -934,7 +934,7 @@
         </w:tc>
         <w:tc>
           <w:tcPr>
-            <w:tcW w:w="3094" w:type="dxa"/>
+            <w:tcW w:w="3347" w:type="dxa"/>
             <w:tcBorders/>
             <w:vAlign w:val="center"/>
           </w:tcPr>
@@ -964,7 +964,7 @@
         <w:trPr/>
         <w:tc>
           <w:tcPr>
-            <w:tcW w:w="1754" w:type="dxa"/>
+            <w:tcW w:w="1801" w:type="dxa"/>
             <w:tcBorders/>
             <w:vAlign w:val="center"/>
           </w:tcPr>
@@ -985,7 +985,7 @@
         </w:tc>
         <w:tc>
           <w:tcPr>
-            <w:tcW w:w="3094" w:type="dxa"/>
+            <w:tcW w:w="3347" w:type="dxa"/>
             <w:tcBorders/>
             <w:vAlign w:val="center"/>
           </w:tcPr>
@@ -1025,7 +1025,7 @@
         <w:trPr/>
         <w:tc>
           <w:tcPr>
-            <w:tcW w:w="1754" w:type="dxa"/>
+            <w:tcW w:w="1801" w:type="dxa"/>
             <w:tcBorders/>
             <w:vAlign w:val="center"/>
           </w:tcPr>
@@ -1046,7 +1046,7 @@
         </w:tc>
         <w:tc>
           <w:tcPr>
-            <w:tcW w:w="3094" w:type="dxa"/>
+            <w:tcW w:w="3347" w:type="dxa"/>
             <w:tcBorders/>
             <w:vAlign w:val="center"/>
           </w:tcPr>
@@ -2424,7 +2424,7 @@
     </w:p>
     <w:tbl>
       <w:tblPr>
-        <w:tblW w:w="4848" w:type="dxa"/>
+        <w:tblW w:w="5148" w:type="dxa"/>
         <w:jc w:val="left"/>
         <w:tblInd w:w="0" w:type="dxa"/>
         <w:tblLayout w:type="fixed"/>
@@ -2436,8 +2436,8 @@
         </w:tblCellMar>
       </w:tblPr>
       <w:tblGrid>
-        <w:gridCol w:w="1804"/>
-        <w:gridCol w:w="3044"/>
+        <w:gridCol w:w="1847"/>
+        <w:gridCol w:w="3301"/>
       </w:tblGrid>
       <w:tr>
         <w:trPr>
@@ -2445,7 +2445,7 @@
         </w:trPr>
         <w:tc>
           <w:tcPr>
-            <w:tcW w:w="1804" w:type="dxa"/>
+            <w:tcW w:w="1847" w:type="dxa"/>
             <w:tcBorders/>
             <w:vAlign w:val="center"/>
           </w:tcPr>
@@ -2467,7 +2467,7 @@
         </w:tc>
         <w:tc>
           <w:tcPr>
-            <w:tcW w:w="3044" w:type="dxa"/>
+            <w:tcW w:w="3301" w:type="dxa"/>
             <w:tcBorders/>
             <w:vAlign w:val="center"/>
           </w:tcPr>
@@ -2492,7 +2492,7 @@
         <w:trPr/>
         <w:tc>
           <w:tcPr>
-            <w:tcW w:w="1804" w:type="dxa"/>
+            <w:tcW w:w="1847" w:type="dxa"/>
             <w:tcBorders/>
             <w:vAlign w:val="center"/>
           </w:tcPr>
@@ -2525,7 +2525,7 @@
         </w:tc>
         <w:tc>
           <w:tcPr>
-            <w:tcW w:w="3044" w:type="dxa"/>
+            <w:tcW w:w="3301" w:type="dxa"/>
             <w:tcBorders/>
             <w:vAlign w:val="center"/>
           </w:tcPr>
@@ -2549,7 +2549,7 @@
         <w:trPr/>
         <w:tc>
           <w:tcPr>
-            <w:tcW w:w="1804" w:type="dxa"/>
+            <w:tcW w:w="1847" w:type="dxa"/>
             <w:tcBorders/>
             <w:vAlign w:val="center"/>
           </w:tcPr>
@@ -2582,7 +2582,7 @@
         </w:tc>
         <w:tc>
           <w:tcPr>
-            <w:tcW w:w="3044" w:type="dxa"/>
+            <w:tcW w:w="3301" w:type="dxa"/>
             <w:tcBorders/>
             <w:vAlign w:val="center"/>
           </w:tcPr>
@@ -2606,7 +2606,7 @@
         <w:trPr/>
         <w:tc>
           <w:tcPr>
-            <w:tcW w:w="1804" w:type="dxa"/>
+            <w:tcW w:w="1847" w:type="dxa"/>
             <w:tcBorders/>
             <w:vAlign w:val="center"/>
           </w:tcPr>
@@ -2629,7 +2629,7 @@
         </w:tc>
         <w:tc>
           <w:tcPr>
-            <w:tcW w:w="3044" w:type="dxa"/>
+            <w:tcW w:w="3301" w:type="dxa"/>
             <w:tcBorders/>
             <w:vAlign w:val="center"/>
           </w:tcPr>
@@ -2653,7 +2653,7 @@
         <w:trPr/>
         <w:tc>
           <w:tcPr>
-            <w:tcW w:w="1804" w:type="dxa"/>
+            <w:tcW w:w="1847" w:type="dxa"/>
             <w:tcBorders/>
             <w:vAlign w:val="center"/>
           </w:tcPr>
@@ -2676,7 +2676,7 @@
         </w:tc>
         <w:tc>
           <w:tcPr>
-            <w:tcW w:w="3044" w:type="dxa"/>
+            <w:tcW w:w="3301" w:type="dxa"/>
             <w:tcBorders/>
             <w:vAlign w:val="center"/>
           </w:tcPr>
@@ -2700,7 +2700,7 @@
         <w:trPr/>
         <w:tc>
           <w:tcPr>
-            <w:tcW w:w="1804" w:type="dxa"/>
+            <w:tcW w:w="1847" w:type="dxa"/>
             <w:tcBorders/>
             <w:vAlign w:val="center"/>
           </w:tcPr>
@@ -2723,7 +2723,7 @@
         </w:tc>
         <w:tc>
           <w:tcPr>
-            <w:tcW w:w="3044" w:type="dxa"/>
+            <w:tcW w:w="3301" w:type="dxa"/>
             <w:tcBorders/>
             <w:vAlign w:val="center"/>
           </w:tcPr>
@@ -2896,10 +2896,979 @@
         <w:jc w:val="left"/>
         <w:rPr/>
       </w:pPr>
-      <w:bookmarkStart w:id="11" w:name="confirming-recall-reaches-your-sessions"/>
+      <w:bookmarkStart w:id="11" w:name="native-memories-as-vault-pointers"/>
       <w:bookmarkEnd w:id="11"/>
       <w:r>
         <w:rPr/>
+        <w:t>Native Memories as Vault Pointers</w:t>
+      </w:r>
+    </w:p>
+    <w:p>
+      <w:pPr>
+        <w:pStyle w:val="BodyText"/>
+        <w:bidi w:val="0"/>
+        <w:jc w:val="left"/>
+        <w:rPr/>
+      </w:pPr>
+      <w:r>
+        <w:rPr/>
+        <w:t xml:space="preserve">Claude Code keeps its own native memory, one Markdown file per fact under </w:t>
+      </w:r>
+      <w:r>
+        <w:rPr>
+          <w:rStyle w:val="SourceText"/>
+        </w:rPr>
+        <w:t>~/.claude/projects/&lt;project&gt;/memory/</w:t>
+      </w:r>
+      <w:r>
+        <w:rPr/>
+        <w:t>. Crew can read such a file whose body is a single pointer line into your vault, with the frontmatter left as it is:</w:t>
+      </w:r>
+    </w:p>
+    <w:p>
+      <w:pPr>
+        <w:pStyle w:val="PreformattedText"/>
+        <w:bidi w:val="0"/>
+        <w:jc w:val="left"/>
+        <w:rPr/>
+      </w:pPr>
+      <w:r>
+        <w:rPr>
+          <w:rStyle w:val="SourceText"/>
+        </w:rPr>
+        <w:t>vault: &lt;name&gt; | note: &lt;vault-relative path, forward slashes, ending .md&gt;</w:t>
+      </w:r>
+    </w:p>
+    <w:p>
+      <w:pPr>
+        <w:pStyle w:val="BodyText"/>
+        <w:bidi w:val="0"/>
+        <w:jc w:val="left"/>
+        <w:rPr/>
+      </w:pPr>
+      <w:r>
+        <w:rPr/>
+        <w:t xml:space="preserve">The vault is named, not given as a path, so the same file works on every machine the vault syncs to. The name is looked up in that machine's </w:t>
+      </w:r>
+      <w:r>
+        <w:rPr>
+          <w:rStyle w:val="SourceText"/>
+        </w:rPr>
+        <w:t>~/.claude/obsidian/config.json</w:t>
+      </w:r>
+      <w:r>
+        <w:rPr/>
+        <w:t xml:space="preserve"> (</w:t>
+      </w:r>
+      <w:r>
+        <w:rPr>
+          <w:rStyle w:val="SourceText"/>
+        </w:rPr>
+        <w:t>vaults.&lt;name&gt;.path</w:t>
+      </w:r>
+      <w:r>
+        <w:rPr/>
+        <w:t xml:space="preserve">; a vault with role </w:t>
+      </w:r>
+      <w:r>
+        <w:rPr>
+          <w:rStyle w:val="SourceText"/>
+        </w:rPr>
+        <w:t>ignore</w:t>
+      </w:r>
+      <w:r>
+        <w:rPr/>
+        <w:t xml:space="preserve"> is not looked up). Only the name </w:t>
+      </w:r>
+      <w:r>
+        <w:rPr>
+          <w:rStyle w:val="SourceText"/>
+        </w:rPr>
+        <w:t>memory</w:t>
+      </w:r>
+      <w:r>
+        <w:rPr/>
+        <w:t xml:space="preserve"> falls back to crew's </w:t>
+      </w:r>
+      <w:r>
+        <w:rPr>
+          <w:rStyle w:val="SourceText"/>
+        </w:rPr>
+        <w:t>memory.vaultPath</w:t>
+      </w:r>
+      <w:r>
+        <w:rPr/>
+        <w:t xml:space="preserve">. </w:t>
+      </w:r>
+      <w:r>
+        <w:rPr>
+          <w:rStyle w:val="SourceText"/>
+        </w:rPr>
+        <w:t>OBSIDIAN_VAULT_PATH</w:t>
+      </w:r>
+      <w:r>
+        <w:rPr/>
+        <w:t xml:space="preserve"> is not used.</w:t>
+      </w:r>
+    </w:p>
+    <w:p>
+      <w:pPr>
+        <w:pStyle w:val="PreformattedText"/>
+        <w:bidi w:val="0"/>
+        <w:jc w:val="left"/>
+        <w:rPr/>
+      </w:pPr>
+      <w:r>
+        <w:rPr>
+          <w:rStyle w:val="SourceText"/>
+        </w:rPr>
+        <w:t>python3 plugin/crew/hooks/scripts/crew_memory.py resolve --file &lt;memory file&gt;</w:t>
+      </w:r>
+    </w:p>
+    <w:p>
+      <w:pPr>
+        <w:pStyle w:val="PreformattedText"/>
+        <w:bidi w:val="0"/>
+        <w:jc w:val="left"/>
+        <w:rPr/>
+      </w:pPr>
+      <w:r>
+        <w:rPr>
+          <w:rStyle w:val="SourceText"/>
+        </w:rPr>
+        <w:t>python3 plugin/crew/hooks/scripts/crew_memory.py check --memory-dir &lt;memory dir&gt;</w:t>
+      </w:r>
+    </w:p>
+    <w:p>
+      <w:pPr>
+        <w:pStyle w:val="BodyText"/>
+        <w:bidi w:val="0"/>
+        <w:jc w:val="left"/>
+        <w:rPr/>
+      </w:pPr>
+      <w:r>
+        <w:rPr>
+          <w:rStyle w:val="SourceText"/>
+        </w:rPr>
+        <w:t>resolve</w:t>
+      </w:r>
+      <w:r>
+        <w:rPr/>
+        <w:t xml:space="preserve"> prints </w:t>
+      </w:r>
+      <w:r>
+        <w:rPr>
+          <w:rStyle w:val="SourceText"/>
+        </w:rPr>
+        <w:t>state:</w:t>
+      </w:r>
+      <w:r>
+        <w:rPr/>
+        <w:t xml:space="preserve"> and, when the note is found, </w:t>
+      </w:r>
+      <w:r>
+        <w:rPr>
+          <w:rStyle w:val="SourceText"/>
+        </w:rPr>
+        <w:t>path:</w:t>
+      </w:r>
+      <w:r>
+        <w:rPr/>
+        <w:t xml:space="preserve">. </w:t>
+      </w:r>
+      <w:r>
+        <w:rPr>
+          <w:rStyle w:val="SourceText"/>
+        </w:rPr>
+        <w:t>check</w:t>
+      </w:r>
+      <w:r>
+        <w:rPr/>
+        <w:t xml:space="preserve"> prints one row per memory file (not </w:t>
+      </w:r>
+      <w:r>
+        <w:rPr>
+          <w:rStyle w:val="SourceText"/>
+        </w:rPr>
+        <w:t>MEMORY.md</w:t>
+      </w:r>
+      <w:r>
+        <w:rPr/>
+        <w:t xml:space="preserve">) and a count per state. Both read only; </w:t>
+      </w:r>
+      <w:r>
+        <w:rPr>
+          <w:rStyle w:val="SourceText"/>
+        </w:rPr>
+        <w:t>--json</w:t>
+      </w:r>
+      <w:r>
+        <w:rPr/>
+        <w:t xml:space="preserve"> gives the same rows as JSON.</w:t>
+      </w:r>
+    </w:p>
+    <w:tbl>
+      <w:tblPr>
+        <w:tblW w:w="5148" w:type="dxa"/>
+        <w:jc w:val="left"/>
+        <w:tblInd w:w="0" w:type="dxa"/>
+        <w:tblLayout w:type="fixed"/>
+        <w:tblCellMar>
+          <w:top w:w="28" w:type="dxa"/>
+          <w:left w:w="28" w:type="dxa"/>
+          <w:bottom w:w="28" w:type="dxa"/>
+          <w:right w:w="28" w:type="dxa"/>
+        </w:tblCellMar>
+      </w:tblPr>
+      <w:tblGrid>
+        <w:gridCol w:w="2236"/>
+        <w:gridCol w:w="2161"/>
+        <w:gridCol w:w="751"/>
+      </w:tblGrid>
+      <w:tr>
+        <w:trPr>
+          <w:tblHeader w:val="true"/>
+        </w:trPr>
+        <w:tc>
+          <w:tcPr>
+            <w:tcW w:w="2236" w:type="dxa"/>
+            <w:tcBorders/>
+            <w:vAlign w:val="center"/>
+          </w:tcPr>
+          <w:p>
+            <w:pPr>
+              <w:pStyle w:val="TableHeading"/>
+              <w:suppressLineNumbers/>
+              <w:shd w:fill="434C5E" w:val="clear"/>
+              <w:bidi w:val="0"/>
+              <w:spacing w:before="120" w:after="120"/>
+              <w:jc w:val="left"/>
+              <w:rPr/>
+            </w:pPr>
+            <w:r>
+              <w:rPr/>
+              <w:t>state</w:t>
+            </w:r>
+          </w:p>
+        </w:tc>
+        <w:tc>
+          <w:tcPr>
+            <w:tcW w:w="2161" w:type="dxa"/>
+            <w:tcBorders/>
+            <w:vAlign w:val="center"/>
+          </w:tcPr>
+          <w:p>
+            <w:pPr>
+              <w:pStyle w:val="TableHeading"/>
+              <w:suppressLineNumbers/>
+              <w:shd w:fill="434C5E" w:val="clear"/>
+              <w:bidi w:val="0"/>
+              <w:spacing w:before="120" w:after="120"/>
+              <w:jc w:val="left"/>
+              <w:rPr/>
+            </w:pPr>
+            <w:r>
+              <w:rPr/>
+              <w:t>meaning</w:t>
+            </w:r>
+          </w:p>
+        </w:tc>
+        <w:tc>
+          <w:tcPr>
+            <w:tcW w:w="751" w:type="dxa"/>
+            <w:tcBorders/>
+            <w:vAlign w:val="center"/>
+          </w:tcPr>
+          <w:p>
+            <w:pPr>
+              <w:pStyle w:val="TableHeading"/>
+              <w:suppressLineNumbers/>
+              <w:shd w:fill="434C5E" w:val="clear"/>
+              <w:bidi w:val="0"/>
+              <w:spacing w:before="120" w:after="120"/>
+              <w:jc w:val="left"/>
+              <w:rPr/>
+            </w:pPr>
+            <w:r>
+              <w:rPr/>
+              <w:t>exit</w:t>
+            </w:r>
+          </w:p>
+        </w:tc>
+      </w:tr>
+      <w:tr>
+        <w:trPr/>
+        <w:tc>
+          <w:tcPr>
+            <w:tcW w:w="2236" w:type="dxa"/>
+            <w:tcBorders/>
+            <w:vAlign w:val="center"/>
+          </w:tcPr>
+          <w:p>
+            <w:pPr>
+              <w:pStyle w:val="TableContents"/>
+              <w:shd w:fill="2E3440" w:val="clear"/>
+              <w:bidi w:val="0"/>
+              <w:spacing w:before="120" w:after="120"/>
+              <w:jc w:val="left"/>
+              <w:rPr/>
+            </w:pPr>
+            <w:r>
+              <w:rPr>
+                <w:rStyle w:val="SourceText"/>
+              </w:rPr>
+              <w:t>resolved</w:t>
+            </w:r>
+          </w:p>
+        </w:tc>
+        <w:tc>
+          <w:tcPr>
+            <w:tcW w:w="2161" w:type="dxa"/>
+            <w:tcBorders/>
+            <w:vAlign w:val="center"/>
+          </w:tcPr>
+          <w:p>
+            <w:pPr>
+              <w:pStyle w:val="TableContents"/>
+              <w:shd w:fill="2E3440" w:val="clear"/>
+              <w:bidi w:val="0"/>
+              <w:spacing w:before="120" w:after="120"/>
+              <w:jc w:val="left"/>
+              <w:rPr/>
+            </w:pPr>
+            <w:r>
+              <w:rPr/>
+              <w:t>the note exists on this host</w:t>
+            </w:r>
+          </w:p>
+        </w:tc>
+        <w:tc>
+          <w:tcPr>
+            <w:tcW w:w="751" w:type="dxa"/>
+            <w:tcBorders/>
+            <w:vAlign w:val="center"/>
+          </w:tcPr>
+          <w:p>
+            <w:pPr>
+              <w:pStyle w:val="TableContents"/>
+              <w:shd w:fill="2E3440" w:val="clear"/>
+              <w:bidi w:val="0"/>
+              <w:spacing w:before="120" w:after="120"/>
+              <w:jc w:val="left"/>
+              <w:rPr/>
+            </w:pPr>
+            <w:r>
+              <w:rPr/>
+              <w:t>0</w:t>
+            </w:r>
+          </w:p>
+        </w:tc>
+      </w:tr>
+      <w:tr>
+        <w:trPr/>
+        <w:tc>
+          <w:tcPr>
+            <w:tcW w:w="2236" w:type="dxa"/>
+            <w:tcBorders/>
+            <w:vAlign w:val="center"/>
+          </w:tcPr>
+          <w:p>
+            <w:pPr>
+              <w:pStyle w:val="TableContents"/>
+              <w:shd w:fill="2E3440" w:val="clear"/>
+              <w:bidi w:val="0"/>
+              <w:spacing w:before="120" w:after="120"/>
+              <w:jc w:val="left"/>
+              <w:rPr/>
+            </w:pPr>
+            <w:r>
+              <w:rPr>
+                <w:rStyle w:val="SourceText"/>
+              </w:rPr>
+              <w:t>full-text</w:t>
+            </w:r>
+          </w:p>
+        </w:tc>
+        <w:tc>
+          <w:tcPr>
+            <w:tcW w:w="2161" w:type="dxa"/>
+            <w:tcBorders/>
+            <w:vAlign w:val="center"/>
+          </w:tcPr>
+          <w:p>
+            <w:pPr>
+              <w:pStyle w:val="TableContents"/>
+              <w:shd w:fill="2E3440" w:val="clear"/>
+              <w:bidi w:val="0"/>
+              <w:spacing w:before="120" w:after="120"/>
+              <w:jc w:val="left"/>
+              <w:rPr/>
+            </w:pPr>
+            <w:r>
+              <w:rPr/>
+              <w:t>not a pointer; the body is the memory</w:t>
+            </w:r>
+          </w:p>
+        </w:tc>
+        <w:tc>
+          <w:tcPr>
+            <w:tcW w:w="751" w:type="dxa"/>
+            <w:tcBorders/>
+            <w:vAlign w:val="center"/>
+          </w:tcPr>
+          <w:p>
+            <w:pPr>
+              <w:pStyle w:val="TableContents"/>
+              <w:shd w:fill="2E3440" w:val="clear"/>
+              <w:bidi w:val="0"/>
+              <w:spacing w:before="120" w:after="120"/>
+              <w:jc w:val="left"/>
+              <w:rPr/>
+            </w:pPr>
+            <w:r>
+              <w:rPr/>
+              <w:t>0</w:t>
+            </w:r>
+          </w:p>
+        </w:tc>
+      </w:tr>
+      <w:tr>
+        <w:trPr/>
+        <w:tc>
+          <w:tcPr>
+            <w:tcW w:w="2236" w:type="dxa"/>
+            <w:tcBorders/>
+            <w:vAlign w:val="center"/>
+          </w:tcPr>
+          <w:p>
+            <w:pPr>
+              <w:pStyle w:val="TableContents"/>
+              <w:shd w:fill="2E3440" w:val="clear"/>
+              <w:bidi w:val="0"/>
+              <w:spacing w:before="120" w:after="120"/>
+              <w:jc w:val="left"/>
+              <w:rPr/>
+            </w:pPr>
+            <w:r>
+              <w:rPr>
+                <w:rStyle w:val="SourceText"/>
+              </w:rPr>
+              <w:t>malformed</w:t>
+            </w:r>
+          </w:p>
+        </w:tc>
+        <w:tc>
+          <w:tcPr>
+            <w:tcW w:w="2161" w:type="dxa"/>
+            <w:tcBorders/>
+            <w:vAlign w:val="center"/>
+          </w:tcPr>
+          <w:p>
+            <w:pPr>
+              <w:pStyle w:val="TableContents"/>
+              <w:shd w:fill="2E3440" w:val="clear"/>
+              <w:bidi w:val="0"/>
+              <w:spacing w:before="120" w:after="120"/>
+              <w:jc w:val="left"/>
+              <w:rPr/>
+            </w:pPr>
+            <w:r>
+              <w:rPr/>
+              <w:t xml:space="preserve">a </w:t>
+            </w:r>
+            <w:r>
+              <w:rPr>
+                <w:rStyle w:val="SourceText"/>
+              </w:rPr>
+              <w:t>vault:</w:t>
+            </w:r>
+            <w:r>
+              <w:rPr/>
+              <w:t xml:space="preserve"> line that is not a valid pointer (absolute path, drive, </w:t>
+            </w:r>
+            <w:r>
+              <w:rPr>
+                <w:rStyle w:val="SourceText"/>
+              </w:rPr>
+              <w:t>..</w:t>
+            </w:r>
+            <w:r>
+              <w:rPr/>
+              <w:t>, a second field)</w:t>
+            </w:r>
+          </w:p>
+        </w:tc>
+        <w:tc>
+          <w:tcPr>
+            <w:tcW w:w="751" w:type="dxa"/>
+            <w:tcBorders/>
+            <w:vAlign w:val="center"/>
+          </w:tcPr>
+          <w:p>
+            <w:pPr>
+              <w:pStyle w:val="TableContents"/>
+              <w:shd w:fill="2E3440" w:val="clear"/>
+              <w:bidi w:val="0"/>
+              <w:spacing w:before="120" w:after="120"/>
+              <w:jc w:val="left"/>
+              <w:rPr/>
+            </w:pPr>
+            <w:r>
+              <w:rPr/>
+              <w:t>1</w:t>
+            </w:r>
+          </w:p>
+        </w:tc>
+      </w:tr>
+      <w:tr>
+        <w:trPr/>
+        <w:tc>
+          <w:tcPr>
+            <w:tcW w:w="2236" w:type="dxa"/>
+            <w:tcBorders/>
+            <w:vAlign w:val="center"/>
+          </w:tcPr>
+          <w:p>
+            <w:pPr>
+              <w:pStyle w:val="TableContents"/>
+              <w:shd w:fill="2E3440" w:val="clear"/>
+              <w:bidi w:val="0"/>
+              <w:spacing w:before="120" w:after="120"/>
+              <w:jc w:val="left"/>
+              <w:rPr/>
+            </w:pPr>
+            <w:r>
+              <w:rPr>
+                <w:rStyle w:val="SourceText"/>
+              </w:rPr>
+              <w:t>no-vault-config</w:t>
+            </w:r>
+          </w:p>
+        </w:tc>
+        <w:tc>
+          <w:tcPr>
+            <w:tcW w:w="2161" w:type="dxa"/>
+            <w:tcBorders/>
+            <w:vAlign w:val="center"/>
+          </w:tcPr>
+          <w:p>
+            <w:pPr>
+              <w:pStyle w:val="TableContents"/>
+              <w:shd w:fill="2E3440" w:val="clear"/>
+              <w:bidi w:val="0"/>
+              <w:spacing w:before="120" w:after="120"/>
+              <w:jc w:val="left"/>
+              <w:rPr/>
+            </w:pPr>
+            <w:r>
+              <w:rPr/>
+              <w:t xml:space="preserve">no Obsidian config and no </w:t>
+            </w:r>
+            <w:r>
+              <w:rPr>
+                <w:rStyle w:val="SourceText"/>
+              </w:rPr>
+              <w:t>memory.vaultPath</w:t>
+            </w:r>
+            <w:r>
+              <w:rPr/>
+              <w:t>, or a config file that does not parse</w:t>
+            </w:r>
+          </w:p>
+        </w:tc>
+        <w:tc>
+          <w:tcPr>
+            <w:tcW w:w="751" w:type="dxa"/>
+            <w:tcBorders/>
+            <w:vAlign w:val="center"/>
+          </w:tcPr>
+          <w:p>
+            <w:pPr>
+              <w:pStyle w:val="TableContents"/>
+              <w:shd w:fill="2E3440" w:val="clear"/>
+              <w:bidi w:val="0"/>
+              <w:spacing w:before="120" w:after="120"/>
+              <w:jc w:val="left"/>
+              <w:rPr/>
+            </w:pPr>
+            <w:r>
+              <w:rPr/>
+              <w:t>1</w:t>
+            </w:r>
+          </w:p>
+        </w:tc>
+      </w:tr>
+      <w:tr>
+        <w:trPr/>
+        <w:tc>
+          <w:tcPr>
+            <w:tcW w:w="2236" w:type="dxa"/>
+            <w:tcBorders/>
+            <w:vAlign w:val="center"/>
+          </w:tcPr>
+          <w:p>
+            <w:pPr>
+              <w:pStyle w:val="TableContents"/>
+              <w:shd w:fill="2E3440" w:val="clear"/>
+              <w:bidi w:val="0"/>
+              <w:spacing w:before="120" w:after="120"/>
+              <w:jc w:val="left"/>
+              <w:rPr/>
+            </w:pPr>
+            <w:r>
+              <w:rPr>
+                <w:rStyle w:val="SourceText"/>
+              </w:rPr>
+              <w:t>vault-unknown</w:t>
+            </w:r>
+          </w:p>
+        </w:tc>
+        <w:tc>
+          <w:tcPr>
+            <w:tcW w:w="2161" w:type="dxa"/>
+            <w:tcBorders/>
+            <w:vAlign w:val="center"/>
+          </w:tcPr>
+          <w:p>
+            <w:pPr>
+              <w:pStyle w:val="TableContents"/>
+              <w:shd w:fill="2E3440" w:val="clear"/>
+              <w:bidi w:val="0"/>
+              <w:spacing w:before="120" w:after="120"/>
+              <w:jc w:val="left"/>
+              <w:rPr/>
+            </w:pPr>
+            <w:r>
+              <w:rPr/>
+              <w:t xml:space="preserve">this machine names no vault of that name, or marks it </w:t>
+            </w:r>
+            <w:r>
+              <w:rPr>
+                <w:rStyle w:val="SourceText"/>
+              </w:rPr>
+              <w:t>ignore</w:t>
+            </w:r>
+          </w:p>
+        </w:tc>
+        <w:tc>
+          <w:tcPr>
+            <w:tcW w:w="751" w:type="dxa"/>
+            <w:tcBorders/>
+            <w:vAlign w:val="center"/>
+          </w:tcPr>
+          <w:p>
+            <w:pPr>
+              <w:pStyle w:val="TableContents"/>
+              <w:shd w:fill="2E3440" w:val="clear"/>
+              <w:bidi w:val="0"/>
+              <w:spacing w:before="120" w:after="120"/>
+              <w:jc w:val="left"/>
+              <w:rPr/>
+            </w:pPr>
+            <w:r>
+              <w:rPr/>
+              <w:t>1</w:t>
+            </w:r>
+          </w:p>
+        </w:tc>
+      </w:tr>
+      <w:tr>
+        <w:trPr/>
+        <w:tc>
+          <w:tcPr>
+            <w:tcW w:w="2236" w:type="dxa"/>
+            <w:tcBorders/>
+            <w:vAlign w:val="center"/>
+          </w:tcPr>
+          <w:p>
+            <w:pPr>
+              <w:pStyle w:val="TableContents"/>
+              <w:shd w:fill="2E3440" w:val="clear"/>
+              <w:bidi w:val="0"/>
+              <w:spacing w:before="120" w:after="120"/>
+              <w:jc w:val="left"/>
+              <w:rPr/>
+            </w:pPr>
+            <w:r>
+              <w:rPr>
+                <w:rStyle w:val="SourceText"/>
+              </w:rPr>
+              <w:t>vault-unavailable</w:t>
+            </w:r>
+          </w:p>
+        </w:tc>
+        <w:tc>
+          <w:tcPr>
+            <w:tcW w:w="2161" w:type="dxa"/>
+            <w:tcBorders/>
+            <w:vAlign w:val="center"/>
+          </w:tcPr>
+          <w:p>
+            <w:pPr>
+              <w:pStyle w:val="TableContents"/>
+              <w:shd w:fill="2E3440" w:val="clear"/>
+              <w:bidi w:val="0"/>
+              <w:spacing w:before="120" w:after="120"/>
+              <w:jc w:val="left"/>
+              <w:rPr/>
+            </w:pPr>
+            <w:r>
+              <w:rPr/>
+              <w:t>the configured folder is not there (not mounted, not synced)</w:t>
+            </w:r>
+          </w:p>
+        </w:tc>
+        <w:tc>
+          <w:tcPr>
+            <w:tcW w:w="751" w:type="dxa"/>
+            <w:tcBorders/>
+            <w:vAlign w:val="center"/>
+          </w:tcPr>
+          <w:p>
+            <w:pPr>
+              <w:pStyle w:val="TableContents"/>
+              <w:shd w:fill="2E3440" w:val="clear"/>
+              <w:bidi w:val="0"/>
+              <w:spacing w:before="120" w:after="120"/>
+              <w:jc w:val="left"/>
+              <w:rPr/>
+            </w:pPr>
+            <w:r>
+              <w:rPr/>
+              <w:t>1</w:t>
+            </w:r>
+          </w:p>
+        </w:tc>
+      </w:tr>
+      <w:tr>
+        <w:trPr/>
+        <w:tc>
+          <w:tcPr>
+            <w:tcW w:w="2236" w:type="dxa"/>
+            <w:tcBorders/>
+            <w:vAlign w:val="center"/>
+          </w:tcPr>
+          <w:p>
+            <w:pPr>
+              <w:pStyle w:val="TableContents"/>
+              <w:shd w:fill="2E3440" w:val="clear"/>
+              <w:bidi w:val="0"/>
+              <w:spacing w:before="120" w:after="120"/>
+              <w:jc w:val="left"/>
+              <w:rPr/>
+            </w:pPr>
+            <w:r>
+              <w:rPr>
+                <w:rStyle w:val="SourceText"/>
+              </w:rPr>
+              <w:t>note-missing</w:t>
+            </w:r>
+          </w:p>
+        </w:tc>
+        <w:tc>
+          <w:tcPr>
+            <w:tcW w:w="2161" w:type="dxa"/>
+            <w:tcBorders/>
+            <w:vAlign w:val="center"/>
+          </w:tcPr>
+          <w:p>
+            <w:pPr>
+              <w:pStyle w:val="TableContents"/>
+              <w:shd w:fill="2E3440" w:val="clear"/>
+              <w:bidi w:val="0"/>
+              <w:spacing w:before="120" w:after="120"/>
+              <w:jc w:val="left"/>
+              <w:rPr/>
+            </w:pPr>
+            <w:r>
+              <w:rPr/>
+              <w:t>the vault is there, the note is not</w:t>
+            </w:r>
+          </w:p>
+        </w:tc>
+        <w:tc>
+          <w:tcPr>
+            <w:tcW w:w="751" w:type="dxa"/>
+            <w:tcBorders/>
+            <w:vAlign w:val="center"/>
+          </w:tcPr>
+          <w:p>
+            <w:pPr>
+              <w:pStyle w:val="TableContents"/>
+              <w:shd w:fill="2E3440" w:val="clear"/>
+              <w:bidi w:val="0"/>
+              <w:spacing w:before="120" w:after="120"/>
+              <w:jc w:val="left"/>
+              <w:rPr/>
+            </w:pPr>
+            <w:r>
+              <w:rPr/>
+              <w:t>1</w:t>
+            </w:r>
+          </w:p>
+        </w:tc>
+      </w:tr>
+      <w:tr>
+        <w:trPr/>
+        <w:tc>
+          <w:tcPr>
+            <w:tcW w:w="2236" w:type="dxa"/>
+            <w:tcBorders/>
+            <w:vAlign w:val="center"/>
+          </w:tcPr>
+          <w:p>
+            <w:pPr>
+              <w:pStyle w:val="TableContents"/>
+              <w:shd w:fill="2E3440" w:val="clear"/>
+              <w:bidi w:val="0"/>
+              <w:spacing w:before="120" w:after="120"/>
+              <w:jc w:val="left"/>
+              <w:rPr/>
+            </w:pPr>
+            <w:r>
+              <w:rPr>
+                <w:rStyle w:val="SourceText"/>
+              </w:rPr>
+              <w:t>outside-vault</w:t>
+            </w:r>
+          </w:p>
+        </w:tc>
+        <w:tc>
+          <w:tcPr>
+            <w:tcW w:w="2161" w:type="dxa"/>
+            <w:tcBorders/>
+            <w:vAlign w:val="center"/>
+          </w:tcPr>
+          <w:p>
+            <w:pPr>
+              <w:pStyle w:val="TableContents"/>
+              <w:shd w:fill="2E3440" w:val="clear"/>
+              <w:bidi w:val="0"/>
+              <w:spacing w:before="120" w:after="120"/>
+              <w:jc w:val="left"/>
+              <w:rPr/>
+            </w:pPr>
+            <w:r>
+              <w:rPr/>
+              <w:t>the path passes through a symlink inside the vault, or leaves it</w:t>
+            </w:r>
+          </w:p>
+        </w:tc>
+        <w:tc>
+          <w:tcPr>
+            <w:tcW w:w="751" w:type="dxa"/>
+            <w:tcBorders/>
+            <w:vAlign w:val="center"/>
+          </w:tcPr>
+          <w:p>
+            <w:pPr>
+              <w:pStyle w:val="TableContents"/>
+              <w:shd w:fill="2E3440" w:val="clear"/>
+              <w:bidi w:val="0"/>
+              <w:spacing w:before="120" w:after="120"/>
+              <w:jc w:val="left"/>
+              <w:rPr/>
+            </w:pPr>
+            <w:r>
+              <w:rPr/>
+              <w:t>1</w:t>
+            </w:r>
+          </w:p>
+        </w:tc>
+      </w:tr>
+      <w:tr>
+        <w:trPr/>
+        <w:tc>
+          <w:tcPr>
+            <w:tcW w:w="2236" w:type="dxa"/>
+            <w:tcBorders/>
+            <w:vAlign w:val="center"/>
+          </w:tcPr>
+          <w:p>
+            <w:pPr>
+              <w:pStyle w:val="TableContents"/>
+              <w:shd w:fill="2E3440" w:val="clear"/>
+              <w:bidi w:val="0"/>
+              <w:spacing w:before="120" w:after="120"/>
+              <w:jc w:val="left"/>
+              <w:rPr/>
+            </w:pPr>
+            <w:r>
+              <w:rPr>
+                <w:rStyle w:val="SourceText"/>
+              </w:rPr>
+              <w:t>unreadable</w:t>
+            </w:r>
+          </w:p>
+        </w:tc>
+        <w:tc>
+          <w:tcPr>
+            <w:tcW w:w="2161" w:type="dxa"/>
+            <w:tcBorders/>
+            <w:vAlign w:val="center"/>
+          </w:tcPr>
+          <w:p>
+            <w:pPr>
+              <w:pStyle w:val="TableContents"/>
+              <w:shd w:fill="2E3440" w:val="clear"/>
+              <w:bidi w:val="0"/>
+              <w:spacing w:before="120" w:after="120"/>
+              <w:jc w:val="left"/>
+              <w:rPr/>
+            </w:pPr>
+            <w:r>
+              <w:rPr/>
+              <w:t>the memory file cannot be read as UTF-8</w:t>
+            </w:r>
+          </w:p>
+        </w:tc>
+        <w:tc>
+          <w:tcPr>
+            <w:tcW w:w="751" w:type="dxa"/>
+            <w:tcBorders/>
+            <w:vAlign w:val="center"/>
+          </w:tcPr>
+          <w:p>
+            <w:pPr>
+              <w:pStyle w:val="TableContents"/>
+              <w:shd w:fill="2E3440" w:val="clear"/>
+              <w:bidi w:val="0"/>
+              <w:spacing w:before="120" w:after="120"/>
+              <w:jc w:val="left"/>
+              <w:rPr/>
+            </w:pPr>
+            <w:r>
+              <w:rPr/>
+              <w:t>1</w:t>
+            </w:r>
+          </w:p>
+        </w:tc>
+      </w:tr>
+    </w:tbl>
+    <w:p>
+      <w:pPr>
+        <w:pStyle w:val="BodyText"/>
+        <w:bidi w:val="0"/>
+        <w:jc w:val="left"/>
+        <w:rPr/>
+      </w:pPr>
+      <w:r>
+        <w:rPr/>
+        <w:t>An unavailable vault is never replaced by another one that happens to hold a note at the same path. This crew version only reads pointers; writing them, and converting existing memories, arrive in later versions.</w:t>
+      </w:r>
+    </w:p>
+    <w:p>
+      <w:pPr>
+        <w:pStyle w:val="Heading2"/>
+        <w:bidi w:val="0"/>
+        <w:ind w:hanging="0" w:left="0" w:right="0"/>
+        <w:jc w:val="left"/>
+        <w:rPr/>
+      </w:pPr>
+      <w:bookmarkStart w:id="12" w:name="confirming-recall-reaches-your-sessions"/>
+      <w:bookmarkEnd w:id="12"/>
+      <w:r>
+        <w:rPr/>
         <w:t>Confirming Recall Reaches Your Sessions</w:t>
       </w:r>
     </w:p>
@@ -2923,8 +3892,8 @@
         <w:jc w:val="left"/>
         <w:rPr/>
       </w:pPr>
-      <w:bookmarkStart w:id="12" w:name="path-scoped-rules-from-the-code-map"/>
-      <w:bookmarkEnd w:id="12"/>
+      <w:bookmarkStart w:id="13" w:name="path-scoped-rules-from-the-code-map"/>
+      <w:bookmarkEnd w:id="13"/>
       <w:r>
         <w:rPr/>
         <w:t>Path-Scoped Rules from the Code Map</w:t>
@@ -3177,8 +4146,8 @@
         <w:jc w:val="left"/>
         <w:rPr/>
       </w:pPr>
-      <w:bookmarkStart w:id="13" w:name="confirming-recall-reaches-your-sessions_"/>
-      <w:bookmarkEnd w:id="13"/>
+      <w:bookmarkStart w:id="14" w:name="confirming-recall-reaches-your-sessions_"/>
+      <w:bookmarkEnd w:id="14"/>
       <w:r>
         <w:rPr/>
         <w:t>Confirming Recall Reaches Your Sessions</w:t>
@@ -3326,8 +4295,8 @@
         <w:jc w:val="left"/>
         <w:rPr/>
       </w:pPr>
-      <w:bookmarkStart w:id="14" w:name="which-channel-reaches-which-agent"/>
-      <w:bookmarkEnd w:id="14"/>
+      <w:bookmarkStart w:id="15" w:name="which-channel-reaches-which-agent"/>
+      <w:bookmarkEnd w:id="15"/>
       <w:r>
         <w:rPr/>
         <w:t>Which Channel Reaches Which Agent</w:t>
@@ -3367,7 +4336,7 @@
     </w:p>
     <w:tbl>
       <w:tblPr>
-        <w:tblW w:w="4848" w:type="dxa"/>
+        <w:tblW w:w="5148" w:type="dxa"/>
         <w:jc w:val="left"/>
         <w:tblInd w:w="0" w:type="dxa"/>
         <w:tblLayout w:type="fixed"/>
@@ -3380,8 +4349,8 @@
       </w:tblPr>
       <w:tblGrid>
         <w:gridCol w:w="2116"/>
-        <w:gridCol w:w="1276"/>
-        <w:gridCol w:w="1456"/>
+        <w:gridCol w:w="1454"/>
+        <w:gridCol w:w="1578"/>
       </w:tblGrid>
       <w:tr>
         <w:trPr>
@@ -3411,7 +4380,7 @@
         </w:tc>
         <w:tc>
           <w:tcPr>
-            <w:tcW w:w="1276" w:type="dxa"/>
+            <w:tcW w:w="1454" w:type="dxa"/>
             <w:tcBorders/>
             <w:vAlign w:val="center"/>
           </w:tcPr>
@@ -3433,7 +4402,7 @@
         </w:tc>
         <w:tc>
           <w:tcPr>
-            <w:tcW w:w="1456" w:type="dxa"/>
+            <w:tcW w:w="1578" w:type="dxa"/>
             <w:tcBorders/>
             <w:vAlign w:val="center"/>
           </w:tcPr>
@@ -3481,7 +4450,7 @@
         </w:tc>
         <w:tc>
           <w:tcPr>
-            <w:tcW w:w="1276" w:type="dxa"/>
+            <w:tcW w:w="1454" w:type="dxa"/>
             <w:tcBorders/>
             <w:vAlign w:val="center"/>
           </w:tcPr>
@@ -3502,7 +4471,7 @@
         </w:tc>
         <w:tc>
           <w:tcPr>
-            <w:tcW w:w="1456" w:type="dxa"/>
+            <w:tcW w:w="1578" w:type="dxa"/>
             <w:tcBorders/>
             <w:vAlign w:val="center"/>
           </w:tcPr>
@@ -3551,7 +4520,7 @@
         </w:tc>
         <w:tc>
           <w:tcPr>
-            <w:tcW w:w="1276" w:type="dxa"/>
+            <w:tcW w:w="1454" w:type="dxa"/>
             <w:tcBorders/>
             <w:vAlign w:val="center"/>
           </w:tcPr>
@@ -3572,7 +4541,7 @@
         </w:tc>
         <w:tc>
           <w:tcPr>
-            <w:tcW w:w="1456" w:type="dxa"/>
+            <w:tcW w:w="1578" w:type="dxa"/>
             <w:tcBorders/>
             <w:vAlign w:val="center"/>
           </w:tcPr>
@@ -3621,7 +4590,7 @@
         </w:tc>
         <w:tc>
           <w:tcPr>
-            <w:tcW w:w="1276" w:type="dxa"/>
+            <w:tcW w:w="1454" w:type="dxa"/>
             <w:tcBorders/>
             <w:vAlign w:val="center"/>
           </w:tcPr>
@@ -3642,7 +4611,7 @@
         </w:tc>
         <w:tc>
           <w:tcPr>
-            <w:tcW w:w="1456" w:type="dxa"/>
+            <w:tcW w:w="1578" w:type="dxa"/>
             <w:tcBorders/>
             <w:vAlign w:val="center"/>
           </w:tcPr>
@@ -3799,8 +4768,8 @@
         <w:jc w:val="left"/>
         <w:rPr/>
       </w:pPr>
-      <w:bookmarkStart w:id="15" w:name="where-recall-comes-from"/>
-      <w:bookmarkEnd w:id="15"/>
+      <w:bookmarkStart w:id="16" w:name="where-recall-comes-from"/>
+      <w:bookmarkEnd w:id="16"/>
       <w:r>
         <w:rPr/>
         <w:t>Where Recall Comes From</w:t>
@@ -4031,8 +5000,8 @@
         <w:jc w:val="left"/>
         <w:rPr/>
       </w:pPr>
-      <w:bookmarkStart w:id="16" w:name="the-seeded-note-proof"/>
-      <w:bookmarkEnd w:id="16"/>
+      <w:bookmarkStart w:id="17" w:name="the-seeded-note-proof"/>
+      <w:bookmarkEnd w:id="17"/>
       <w:r>
         <w:rPr/>
         <w:t>The Seeded-Note Proof</w:t>
@@ -4478,8 +5447,8 @@
         <w:jc w:val="left"/>
         <w:rPr/>
       </w:pPr>
-      <w:bookmarkStart w:id="17" w:name="measured-against-the-real-vault_opspy-re"/>
-      <w:bookmarkEnd w:id="17"/>
+      <w:bookmarkStart w:id="18" w:name="measured-against-the-real-vault_opspy-re"/>
+      <w:bookmarkEnd w:id="18"/>
       <w:r>
         <w:rPr/>
         <w:t xml:space="preserve">Measured against the real </w:t>
@@ -4746,8 +5715,8 @@
         <w:jc w:val="left"/>
         <w:rPr/>
       </w:pPr>
-      <w:bookmarkStart w:id="18" w:name="reading-stats"/>
-      <w:bookmarkEnd w:id="18"/>
+      <w:bookmarkStart w:id="19" w:name="reading-stats"/>
+      <w:bookmarkEnd w:id="19"/>
       <w:r>
         <w:rPr/>
         <w:t xml:space="preserve">Reading </w:t>

</xml_diff>

<commit_message>
T-0084 review round 1: docs for the fallback, near-pointers and new states
SKILL.md, README section 14 and the memory guide (rebuilt) describe the
legacy vaultPath only without a vaults block and the exact pointer line;
codemap cites re-derived at this head; CHANGELOG and verify.json re-timed.

Claude-Session: https://claude.ai/code/session_016wQA2o38aSB65bpjaGpMVJ
</commit_message>
<xml_diff>
--- a/docs/guides/crew/crew-1.0-memory-and-obsidian.docx
+++ b/docs/guides/crew/crew-1.0-memory-and-obsidian.docx
@@ -2988,7 +2988,7 @@
       </w:r>
       <w:r>
         <w:rPr/>
-        <w:t xml:space="preserve"> falls back to crew's </w:t>
+        <w:t xml:space="preserve"> falls back: to crew's </w:t>
       </w:r>
       <w:r>
         <w:rPr>
@@ -2998,6 +2998,26 @@
       </w:r>
       <w:r>
         <w:rPr/>
+        <w:t xml:space="preserve">, then, only when the Obsidian config has no </w:t>
+      </w:r>
+      <w:r>
+        <w:rPr>
+          <w:rStyle w:val="SourceText"/>
+        </w:rPr>
+        <w:t>vaults</w:t>
+      </w:r>
+      <w:r>
+        <w:rPr/>
+        <w:t xml:space="preserve"> block, to its legacy top-level </w:t>
+      </w:r>
+      <w:r>
+        <w:rPr>
+          <w:rStyle w:val="SourceText"/>
+        </w:rPr>
+        <w:t>vaultPath</w:t>
+      </w:r>
+      <w:r>
+        <w:rPr/>
         <w:t xml:space="preserve">. </w:t>
       </w:r>
       <w:r>
@@ -3008,7 +3028,27 @@
       </w:r>
       <w:r>
         <w:rPr/>
-        <w:t xml:space="preserve"> is not used.</w:t>
+        <w:t xml:space="preserve"> is not used. The line is exact: an indented or </w:t>
+      </w:r>
+      <w:r>
+        <w:rPr>
+          <w:rStyle w:val="SourceText"/>
+        </w:rPr>
+        <w:t>Vault:</w:t>
+      </w:r>
+      <w:r>
+        <w:rPr/>
+        <w:t xml:space="preserve"> line is </w:t>
+      </w:r>
+      <w:r>
+        <w:rPr>
+          <w:rStyle w:val="SourceText"/>
+        </w:rPr>
+        <w:t>malformed</w:t>
+      </w:r>
+      <w:r>
+        <w:rPr/>
+        <w:t>, not prose.</w:t>
       </w:r>
     </w:p>
     <w:p>
@@ -3384,7 +3424,17 @@
             </w:r>
             <w:r>
               <w:rPr/>
-              <w:t xml:space="preserve"> line that is not a valid pointer (absolute path, drive, </w:t>
+              <w:t xml:space="preserve"> line, in any case or indent, that is not a valid pointer (absolute path, </w:t>
+            </w:r>
+            <w:r>
+              <w:rPr>
+                <w:rStyle w:val="SourceText"/>
+              </w:rPr>
+              <w:t>:</w:t>
+            </w:r>
+            <w:r>
+              <w:rPr/>
+              <w:t xml:space="preserve">, </w:t>
             </w:r>
             <w:r>
               <w:rPr>
@@ -3394,7 +3444,7 @@
             </w:r>
             <w:r>
               <w:rPr/>
-              <w:t>, a second field)</w:t>
+              <w:t>, a second field, an invisible character)</w:t>
             </w:r>
           </w:p>
         </w:tc>
@@ -3472,7 +3522,17 @@
             </w:r>
             <w:r>
               <w:rPr/>
-              <w:t>, or a config file that does not parse</w:t>
+              <w:t xml:space="preserve">, or a config file that cannot be read, does not parse or has a </w:t>
+            </w:r>
+            <w:r>
+              <w:rPr>
+                <w:rStyle w:val="SourceText"/>
+              </w:rPr>
+              <w:t>vaults</w:t>
+            </w:r>
+            <w:r>
+              <w:rPr/>
+              <w:t xml:space="preserve"> block of the wrong shape</w:t>
             </w:r>
           </w:p>
         </w:tc>
@@ -3818,7 +3878,7 @@
             </w:pPr>
             <w:r>
               <w:rPr/>
-              <w:t>the memory file cannot be read as UTF-8</w:t>
+              <w:t>the memory file cannot be read as UTF-8, or a folder or note inside the vault cannot be read</w:t>
             </w:r>
           </w:p>
         </w:tc>

</xml_diff>

<commit_message>
T-0084 review round 2: docs for the absent/schema/open rules
Module docstring, SKILL.md, README section 14 and the memory guide (rebuilt)
state the lstat-only absence rule, the schema and the pointer-attempt rule;
codemap cites re-derived at this head; CHANGELOG and verify.json re-timed.

Claude-Session: https://claude.ai/code/session_016wQA2o38aSB65bpjaGpMVJ
</commit_message>
<xml_diff>
--- a/docs/guides/crew/crew-1.0-memory-and-obsidian.docx
+++ b/docs/guides/crew/crew-1.0-memory-and-obsidian.docx
@@ -3028,17 +3028,27 @@
       </w:r>
       <w:r>
         <w:rPr/>
-        <w:t xml:space="preserve"> is not used. The line is exact: an indented or </w:t>
-      </w:r>
-      <w:r>
-        <w:rPr>
-          <w:rStyle w:val="SourceText"/>
-        </w:rPr>
-        <w:t>Vault:</w:t>
-      </w:r>
-      <w:r>
-        <w:rPr/>
-        <w:t xml:space="preserve"> line is </w:t>
+        <w:t xml:space="preserve"> is not used. The line is exact and must be the whole body: a first line that starts </w:t>
+      </w:r>
+      <w:r>
+        <w:rPr>
+          <w:rStyle w:val="SourceText"/>
+        </w:rPr>
+        <w:t>vault</w:t>
+      </w:r>
+      <w:r>
+        <w:rPr/>
+        <w:t xml:space="preserve"> and </w:t>
+      </w:r>
+      <w:r>
+        <w:rPr>
+          <w:rStyle w:val="SourceText"/>
+        </w:rPr>
+        <w:t>:</w:t>
+      </w:r>
+      <w:r>
+        <w:rPr/>
+        <w:t xml:space="preserve">, in any case, indent or spacing, and is anything less is </w:t>
       </w:r>
       <w:r>
         <w:rPr>
@@ -3048,7 +3058,67 @@
       </w:r>
       <w:r>
         <w:rPr/>
-        <w:t>, not prose.</w:t>
+        <w:t xml:space="preserve">, not prose. A config file counts as missing only when it is not there at all; one that is there but does not read, parse or have the expected shape (a </w:t>
+      </w:r>
+      <w:r>
+        <w:rPr>
+          <w:rStyle w:val="SourceText"/>
+        </w:rPr>
+        <w:t>vaults</w:t>
+      </w:r>
+      <w:r>
+        <w:rPr/>
+        <w:t xml:space="preserve"> object of objects with a string </w:t>
+      </w:r>
+      <w:r>
+        <w:rPr>
+          <w:rStyle w:val="SourceText"/>
+        </w:rPr>
+        <w:t>path</w:t>
+      </w:r>
+      <w:r>
+        <w:rPr/>
+        <w:t xml:space="preserve">, a string </w:t>
+      </w:r>
+      <w:r>
+        <w:rPr>
+          <w:rStyle w:val="SourceText"/>
+        </w:rPr>
+        <w:t>vaultPath</w:t>
+      </w:r>
+      <w:r>
+        <w:rPr/>
+        <w:t xml:space="preserve">, crew's </w:t>
+      </w:r>
+      <w:r>
+        <w:rPr>
+          <w:rStyle w:val="SourceText"/>
+        </w:rPr>
+        <w:t>memory</w:t>
+      </w:r>
+      <w:r>
+        <w:rPr/>
+        <w:t xml:space="preserve"> an object with a string or null </w:t>
+      </w:r>
+      <w:r>
+        <w:rPr>
+          <w:rStyle w:val="SourceText"/>
+        </w:rPr>
+        <w:t>vaultPath</w:t>
+      </w:r>
+      <w:r>
+        <w:rPr/>
+        <w:t xml:space="preserve">) is </w:t>
+      </w:r>
+      <w:r>
+        <w:rPr>
+          <w:rStyle w:val="SourceText"/>
+        </w:rPr>
+        <w:t>no-vault-config</w:t>
+      </w:r>
+      <w:r>
+        <w:rPr/>
+        <w:t>, naming the field.</w:t>
       </w:r>
     </w:p>
     <w:p>
@@ -3424,7 +3494,7 @@
             </w:r>
             <w:r>
               <w:rPr/>
-              <w:t xml:space="preserve"> line, in any case or indent, that is not a valid pointer (absolute path, </w:t>
+              <w:t xml:space="preserve"> first line, in any case, indent or spacing, that is not a valid pointer alone in the body (absolute path, </w:t>
             </w:r>
             <w:r>
               <w:rPr>
@@ -3522,17 +3592,7 @@
             </w:r>
             <w:r>
               <w:rPr/>
-              <w:t xml:space="preserve">, or a config file that cannot be read, does not parse or has a </w:t>
-            </w:r>
-            <w:r>
-              <w:rPr>
-                <w:rStyle w:val="SourceText"/>
-              </w:rPr>
-              <w:t>vaults</w:t>
-            </w:r>
-            <w:r>
-              <w:rPr/>
-              <w:t xml:space="preserve"> block of the wrong shape</w:t>
+              <w:t>, or a config file that cannot be read, does not parse or has a field of the wrong shape</w:t>
             </w:r>
           </w:p>
         </w:tc>
@@ -3878,7 +3938,17 @@
             </w:pPr>
             <w:r>
               <w:rPr/>
-              <w:t>the memory file cannot be read as UTF-8, or a folder or note inside the vault cannot be read</w:t>
+              <w:t>the memory file is not a regular file readable as UTF-8 (</w:t>
+            </w:r>
+            <w:r>
+              <w:rPr>
+                <w:rStyle w:val="SourceText"/>
+              </w:rPr>
+              <w:t>check</w:t>
+            </w:r>
+            <w:r>
+              <w:rPr/>
+              <w:t xml:space="preserve"> never opens a FIFO, device or directory), or a folder or note inside the vault cannot be read or opened</w:t>
             </w:r>
           </w:p>
         </w:tc>

</xml_diff>

<commit_message>
T-0084 review round 3: docs for the pointer mark, hostile configs and scoping
SKILL.md, README section 14 and the memory guide (rebuilt) state that a
vault: line needs note: or '|' to be a pointer attempt, the duplicate-key,
depth and 1 MiB limits, and the docstring's rule for which names a bad
crew config stops; codemap cites re-derived; CHANGELOG and verify.json.

Claude-Session: https://claude.ai/code/session_016wQA2o38aSB65bpjaGpMVJ
</commit_message>
<xml_diff>
--- a/docs/guides/crew/crew-1.0-memory-and-obsidian.docx
+++ b/docs/guides/crew/crew-1.0-memory-and-obsidian.docx
@@ -3048,7 +3048,27 @@
       </w:r>
       <w:r>
         <w:rPr/>
-        <w:t xml:space="preserve">, in any case, indent or spacing, and is anything less is </w:t>
+        <w:t xml:space="preserve">, in any case, indent or spacing, and also holds </w:t>
+      </w:r>
+      <w:r>
+        <w:rPr>
+          <w:rStyle w:val="SourceText"/>
+        </w:rPr>
+        <w:t>note:</w:t>
+      </w:r>
+      <w:r>
+        <w:rPr/>
+        <w:t xml:space="preserve"> or </w:t>
+      </w:r>
+      <w:r>
+        <w:rPr>
+          <w:rStyle w:val="SourceText"/>
+        </w:rPr>
+        <w:t>|</w:t>
+      </w:r>
+      <w:r>
+        <w:rPr/>
+        <w:t xml:space="preserve">, is a pointer attempt, and anything less is </w:t>
       </w:r>
       <w:r>
         <w:rPr>
@@ -3058,7 +3078,37 @@
       </w:r>
       <w:r>
         <w:rPr/>
-        <w:t xml:space="preserve">, not prose. A config file counts as missing only when it is not there at all; one that is there but does not read, parse or have the expected shape (a </w:t>
+        <w:t xml:space="preserve">. Without </w:t>
+      </w:r>
+      <w:r>
+        <w:rPr>
+          <w:rStyle w:val="SourceText"/>
+        </w:rPr>
+        <w:t>note:</w:t>
+      </w:r>
+      <w:r>
+        <w:rPr/>
+        <w:t xml:space="preserve"> or </w:t>
+      </w:r>
+      <w:r>
+        <w:rPr>
+          <w:rStyle w:val="SourceText"/>
+        </w:rPr>
+        <w:t>|</w:t>
+      </w:r>
+      <w:r>
+        <w:rPr/>
+        <w:t xml:space="preserve"> the line is prose: </w:t>
+      </w:r>
+      <w:r>
+        <w:rPr>
+          <w:rStyle w:val="SourceText"/>
+        </w:rPr>
+        <w:t>Vault: keep client notes in the work vault</w:t>
+      </w:r>
+      <w:r>
+        <w:rPr/>
+        <w:t xml:space="preserve"> is a memory, not a pointer. A config file counts as missing only when it is not there at all; one that is there but does not read, parse or have the expected shape (a </w:t>
       </w:r>
       <w:r>
         <w:rPr>
@@ -3108,7 +3158,7 @@
       </w:r>
       <w:r>
         <w:rPr/>
-        <w:t xml:space="preserve">) is </w:t>
+        <w:t xml:space="preserve">; no duplicate key, not nested too deep, at most 1 MiB) is </w:t>
       </w:r>
       <w:r>
         <w:rPr>
@@ -3118,7 +3168,17 @@
       </w:r>
       <w:r>
         <w:rPr/>
-        <w:t>, naming the field.</w:t>
+        <w:t xml:space="preserve">, naming the field. A bad Obsidian config stops every name; a bad crew config stops </w:t>
+      </w:r>
+      <w:r>
+        <w:rPr>
+          <w:rStyle w:val="SourceText"/>
+        </w:rPr>
+        <w:t>memory</w:t>
+      </w:r>
+      <w:r>
+        <w:rPr/>
+        <w:t>, the one name it can answer for, and any name when there is no Obsidian config to say which failure applies.</w:t>
       </w:r>
     </w:p>
     <w:p>

</xml_diff>

<commit_message>
T-0084 review round 4: docs for the pointer-attempt rule
SKILL.md, README section 14 and the memory guide (rebuilt) state the mark-
anywhere-or-bare-name rule; codemap cites re-derived; CHANGELOG, verify.json.

Claude-Session: https://claude.ai/code/session_016wQA2o38aSB65bpjaGpMVJ
</commit_message>
<xml_diff>
--- a/docs/guides/crew/crew-1.0-memory-and-obsidian.docx
+++ b/docs/guides/crew/crew-1.0-memory-and-obsidian.docx
@@ -3048,7 +3048,7 @@
       </w:r>
       <w:r>
         <w:rPr/>
-        <w:t xml:space="preserve">, in any case, indent or spacing, and also holds </w:t>
+        <w:t xml:space="preserve">, in any case, indent or spacing, is a pointer attempt when </w:t>
       </w:r>
       <w:r>
         <w:rPr>
@@ -3068,7 +3068,27 @@
       </w:r>
       <w:r>
         <w:rPr/>
-        <w:t xml:space="preserve">, is a pointer attempt, and anything less is </w:t>
+        <w:t xml:space="preserve"> appears anywhere in the body (a pointer wrapped before its </w:t>
+      </w:r>
+      <w:r>
+        <w:rPr>
+          <w:rStyle w:val="SourceText"/>
+        </w:rPr>
+        <w:t>|</w:t>
+      </w:r>
+      <w:r>
+        <w:rPr/>
+        <w:t xml:space="preserve"> included) or the line is a bare vault name alone (</w:t>
+      </w:r>
+      <w:r>
+        <w:rPr>
+          <w:rStyle w:val="SourceText"/>
+        </w:rPr>
+        <w:t>vault: work</w:t>
+      </w:r>
+      <w:r>
+        <w:rPr/>
+        <w:t xml:space="preserve">); anything less than the full grammar is then </w:t>
       </w:r>
       <w:r>
         <w:rPr>
@@ -3078,27 +3098,7 @@
       </w:r>
       <w:r>
         <w:rPr/>
-        <w:t xml:space="preserve">. Without </w:t>
-      </w:r>
-      <w:r>
-        <w:rPr>
-          <w:rStyle w:val="SourceText"/>
-        </w:rPr>
-        <w:t>note:</w:t>
-      </w:r>
-      <w:r>
-        <w:rPr/>
-        <w:t xml:space="preserve"> or </w:t>
-      </w:r>
-      <w:r>
-        <w:rPr>
-          <w:rStyle w:val="SourceText"/>
-        </w:rPr>
-        <w:t>|</w:t>
-      </w:r>
-      <w:r>
-        <w:rPr/>
-        <w:t xml:space="preserve"> the line is prose: </w:t>
+        <w:t xml:space="preserve">. With neither the line is prose: </w:t>
       </w:r>
       <w:r>
         <w:rPr>

</xml_diff>

<commit_message>
T-0084 review round 5: docs for where the pointer mark counts
Claude-Session: https://claude.ai/code/session_016wQA2o38aSB65bpjaGpMVJ
</commit_message>
<xml_diff>
--- a/docs/guides/crew/crew-1.0-memory-and-obsidian.docx
+++ b/docs/guides/crew/crew-1.0-memory-and-obsidian.docx
@@ -3068,7 +3068,7 @@
       </w:r>
       <w:r>
         <w:rPr/>
-        <w:t xml:space="preserve"> appears anywhere in the body (a pointer wrapped before its </w:t>
+        <w:t xml:space="preserve"> is on that line, or the next line starts with </w:t>
       </w:r>
       <w:r>
         <w:rPr>
@@ -3078,7 +3078,27 @@
       </w:r>
       <w:r>
         <w:rPr/>
-        <w:t xml:space="preserve"> included) or the line is a bare vault name alone (</w:t>
+        <w:t xml:space="preserve"> or </w:t>
+      </w:r>
+      <w:r>
+        <w:rPr>
+          <w:rStyle w:val="SourceText"/>
+        </w:rPr>
+        <w:t>note:</w:t>
+      </w:r>
+      <w:r>
+        <w:rPr/>
+        <w:t xml:space="preserve"> (a pointer wrapped before its </w:t>
+      </w:r>
+      <w:r>
+        <w:rPr>
+          <w:rStyle w:val="SourceText"/>
+        </w:rPr>
+        <w:t>|</w:t>
+      </w:r>
+      <w:r>
+        <w:rPr/>
+        <w:t>), or the line is a bare vault name alone (</w:t>
       </w:r>
       <w:r>
         <w:rPr>
@@ -3088,7 +3108,17 @@
       </w:r>
       <w:r>
         <w:rPr/>
-        <w:t xml:space="preserve">); anything less than the full grammar is then </w:t>
+        <w:t xml:space="preserve">); a table or a </w:t>
+      </w:r>
+      <w:r>
+        <w:rPr>
+          <w:rStyle w:val="SourceText"/>
+        </w:rPr>
+        <w:t>Note:</w:t>
+      </w:r>
+      <w:r>
+        <w:rPr/>
+        <w:t xml:space="preserve"> line further down does not count; anything less than the full grammar is then </w:t>
       </w:r>
       <w:r>
         <w:rPr>

</xml_diff>

<commit_message>
T-0083: docs, verify.json rule, code map and CHANGELOG for recall relevance; ticket folder removed
README recall section (exclusion, stop words, floor, project/kind order, the
three new options and JSON keys), obsidian-setup SKILL.md, memory-vault.md
layout (wiki/sessions/archive/ never recalled), memory-recall-proof.md and
troubleshooting.md (empty recall can be the floor; --min-terms 1 and
--include-excluded to check), the two affected guides rebuilt, the
obsidian-vault code map re-anchored to 5c2f0d6e with .claude/rules
regenerated, a verify.json rule mapping vault_recall.py to test_memory_ops.py
(7s measured), and the CHANGELOG entry flagged "behaviour change: default
recall results". docs/tickets/T-0083/ removed: the spec ships as code and
CHANGELOG.

Claude-Session: https://claude.ai/code/session_016wQA2o38aSB65bpjaGpMVJ
</commit_message>
<xml_diff>
--- a/docs/guides/crew/crew-1.0-memory-and-obsidian.docx
+++ b/docs/guides/crew/crew-1.0-memory-and-obsidian.docx
@@ -3990,6 +3990,68 @@
       <w:r>
         <w:rPr/>
         <w:t xml:space="preserve">. If the plugin is missing, or the CLI fails, times out or prints something other than JSON, the session goes on without recall and the log records a miss with the reason. </w:t>
+      </w:r>
+    </w:p>
+    <w:p>
+      <w:pPr>
+        <w:pStyle w:val="BodyText"/>
+        <w:numPr>
+          <w:ilvl w:val="0"/>
+          <w:numId w:val="4"/>
+        </w:numPr>
+        <w:tabs>
+          <w:tab w:val="clear" w:pos="1134"/>
+          <w:tab w:val="left" w:pos="829" w:leader="none"/>
+        </w:tabs>
+        <w:bidi w:val="0"/>
+        <w:spacing w:before="120" w:after="0"/>
+        <w:ind w:hanging="283" w:left="829"/>
+        <w:jc w:val="left"/>
+        <w:rPr/>
+      </w:pPr>
+      <w:r>
+        <w:rPr/>
+        <w:t xml:space="preserve">An empty recall can be the CLI working as meant: it skips stop words, needs more than one matching word for a query of three or more words, and never reads </w:t>
+      </w:r>
+      <w:r>
+        <w:rPr>
+          <w:rStyle w:val="SourceText"/>
+        </w:rPr>
+        <w:t>wiki/sessions/archive/</w:t>
+      </w:r>
+      <w:r>
+        <w:rPr/>
+        <w:t xml:space="preserve"> or the vault's </w:t>
+      </w:r>
+      <w:r>
+        <w:rPr>
+          <w:rStyle w:val="SourceText"/>
+        </w:rPr>
+        <w:t>userIgnoreFilters</w:t>
+      </w:r>
+      <w:r>
+        <w:rPr/>
+        <w:t xml:space="preserve"> folders. To check whether a note is there but held back, run the CLI with </w:t>
+      </w:r>
+      <w:r>
+        <w:rPr>
+          <w:rStyle w:val="SourceText"/>
+        </w:rPr>
+        <w:t>--min-terms 1</w:t>
+      </w:r>
+      <w:r>
+        <w:rPr/>
+        <w:t xml:space="preserve"> (no floor) and </w:t>
+      </w:r>
+      <w:r>
+        <w:rPr>
+          <w:rStyle w:val="SourceText"/>
+        </w:rPr>
+        <w:t>--include-excluded</w:t>
+      </w:r>
+      <w:r>
+        <w:rPr/>
+        <w:t xml:space="preserve"> (every folder). </w:t>
       </w:r>
     </w:p>
     <w:p>

</xml_diff>

<commit_message>
T-0084: a first line of only `vault:` is a pointer attempt (landing NIT)
`vault:` + optional whitespace, nothing after the colon, now counts as
a pointer attempt, so `vault:\nwork | note: notes/fact.md` is malformed
rather than full text: `_BARE`'s vault name is optional. Must-block test
with three bodies, red before the fix. Skill, memory guide (rebuilt) and
code map citations updated; rules regenerated.

Claude-Session: https://claude.ai/code/session_016wQA2o38aSB65bpjaGpMVJ
</commit_message>
<xml_diff>
--- a/docs/guides/crew/crew-1.0-memory-and-obsidian.docx
+++ b/docs/guides/crew/crew-1.0-memory-and-obsidian.docx
@@ -3105,6 +3105,16 @@
           <w:rStyle w:val="SourceText"/>
         </w:rPr>
         <w:t>vault: work</w:t>
+      </w:r>
+      <w:r>
+        <w:rPr/>
+        <w:t>) or nothing after the colon (</w:t>
+      </w:r>
+      <w:r>
+        <w:rPr>
+          <w:rStyle w:val="SourceText"/>
+        </w:rPr>
+        <w:t>vault:</w:t>
       </w:r>
       <w:r>
         <w:rPr/>

</xml_diff>

<commit_message>
L-0677: docs - skill, README section 14, memory guide (rebuilt), codemap, verify rule, CHANGELOG; ticket files removed
Claude-Session: https://claude.ai/code/session_016wQA2o38aSB65bpjaGpMVJ
</commit_message>
<xml_diff>
--- a/docs/guides/crew/crew-1.0-memory-and-obsidian.docx
+++ b/docs/guides/crew/crew-1.0-memory-and-obsidian.docx
@@ -4074,7 +4074,984 @@
       </w:pPr>
       <w:r>
         <w:rPr/>
-        <w:t>An unavailable vault is never replaced by another one that happens to hold a note at the same path. This crew version only reads pointers; writing them, and converting existing memories, arrive in later versions.</w:t>
+        <w:t>An unavailable vault is never replaced by another one that happens to hold a note at the same path.</w:t>
+      </w:r>
+    </w:p>
+    <w:p>
+      <w:pPr>
+        <w:pStyle w:val="Heading3"/>
+        <w:bidi w:val="0"/>
+        <w:ind w:hanging="0" w:left="0" w:right="0"/>
+        <w:jc w:val="left"/>
+        <w:rPr/>
+      </w:pPr>
+      <w:bookmarkStart w:id="12" w:name="saving-a-memory-as-a-pointer"/>
+      <w:bookmarkEnd w:id="12"/>
+      <w:r>
+        <w:rPr/>
+        <w:t>Saving a Memory as a Pointer</w:t>
+      </w:r>
+    </w:p>
+    <w:p>
+      <w:pPr>
+        <w:pStyle w:val="BodyText"/>
+        <w:bidi w:val="0"/>
+        <w:jc w:val="left"/>
+        <w:rPr/>
+      </w:pPr>
+      <w:r>
+        <w:rPr>
+          <w:rStyle w:val="SourceText"/>
+        </w:rPr>
+        <w:t>save</w:t>
+      </w:r>
+      <w:r>
+        <w:rPr/>
+        <w:t xml:space="preserve"> turns one memory that holds its full text into a pointer, note first:</w:t>
+      </w:r>
+    </w:p>
+    <w:p>
+      <w:pPr>
+        <w:pStyle w:val="PreformattedText"/>
+        <w:bidi w:val="0"/>
+        <w:jc w:val="left"/>
+        <w:rPr/>
+      </w:pPr>
+      <w:r>
+        <w:rPr>
+          <w:rStyle w:val="SourceText"/>
+        </w:rPr>
+        <w:t>python3 plugin/crew/hooks/scripts/crew_memory.py save --file &lt;memory file&gt; --tag &lt;tag&gt;</w:t>
+      </w:r>
+    </w:p>
+    <w:p>
+      <w:pPr>
+        <w:pStyle w:val="PreformattedText"/>
+        <w:bidi w:val="0"/>
+        <w:jc w:val="left"/>
+        <w:rPr/>
+      </w:pPr>
+      <w:r>
+        <w:rPr>
+          <w:rStyle w:val="SourceText"/>
+        </w:rPr>
+        <w:t>python3 plugin/crew/hooks/scripts/crew_memory.py save --file &lt;memory file&gt; --tag &lt;tag&gt; --apply</w:t>
+      </w:r>
+    </w:p>
+    <w:p>
+      <w:pPr>
+        <w:pStyle w:val="BodyText"/>
+        <w:bidi w:val="0"/>
+        <w:jc w:val="left"/>
+        <w:rPr/>
+      </w:pPr>
+      <w:r>
+        <w:rPr/>
+        <w:t xml:space="preserve">Without </w:t>
+      </w:r>
+      <w:r>
+        <w:rPr>
+          <w:rStyle w:val="SourceText"/>
+        </w:rPr>
+        <w:t>--apply</w:t>
+      </w:r>
+      <w:r>
+        <w:rPr/>
+        <w:t xml:space="preserve"> it prints the plan (the vault, the note, </w:t>
+      </w:r>
+      <w:r>
+        <w:rPr>
+          <w:rStyle w:val="SourceText"/>
+        </w:rPr>
+        <w:t>create</w:t>
+      </w:r>
+      <w:r>
+        <w:rPr/>
+        <w:t xml:space="preserve">, </w:t>
+      </w:r>
+      <w:r>
+        <w:rPr>
+          <w:rStyle w:val="SourceText"/>
+        </w:rPr>
+        <w:t>append</w:t>
+      </w:r>
+      <w:r>
+        <w:rPr/>
+        <w:t xml:space="preserve"> or </w:t>
+      </w:r>
+      <w:r>
+        <w:rPr>
+          <w:rStyle w:val="SourceText"/>
+        </w:rPr>
+        <w:t>unchanged</w:t>
+      </w:r>
+      <w:r>
+        <w:rPr/>
+        <w:t xml:space="preserve">, and the pointer line) and writes nothing. Read your vault's own </w:t>
+      </w:r>
+      <w:r>
+        <w:rPr>
+          <w:rStyle w:val="SourceText"/>
+        </w:rPr>
+        <w:t>CLAUDE.md</w:t>
+      </w:r>
+      <w:r>
+        <w:rPr/>
+        <w:t xml:space="preserve"> for its folders and tags first; </w:t>
+      </w:r>
+      <w:r>
+        <w:rPr>
+          <w:rStyle w:val="SourceText"/>
+        </w:rPr>
+        <w:t>--note</w:t>
+      </w:r>
+      <w:r>
+        <w:rPr/>
+        <w:t xml:space="preserve">, </w:t>
+      </w:r>
+      <w:r>
+        <w:rPr>
+          <w:rStyle w:val="SourceText"/>
+        </w:rPr>
+        <w:t>--title</w:t>
+      </w:r>
+      <w:r>
+        <w:rPr/>
+        <w:t xml:space="preserve">, </w:t>
+      </w:r>
+      <w:r>
+        <w:rPr>
+          <w:rStyle w:val="SourceText"/>
+        </w:rPr>
+        <w:t>--type</w:t>
+      </w:r>
+      <w:r>
+        <w:rPr/>
+        <w:t xml:space="preserve"> (</w:t>
+      </w:r>
+      <w:r>
+        <w:rPr>
+          <w:rStyle w:val="SourceText"/>
+        </w:rPr>
+        <w:t>concept</w:t>
+      </w:r>
+      <w:r>
+        <w:rPr/>
+        <w:t xml:space="preserve"> by default) and </w:t>
+      </w:r>
+      <w:r>
+        <w:rPr>
+          <w:rStyle w:val="SourceText"/>
+        </w:rPr>
+        <w:t>--project</w:t>
+      </w:r>
+      <w:r>
+        <w:rPr/>
+        <w:t xml:space="preserve"> change the defaults (</w:t>
+      </w:r>
+      <w:r>
+        <w:rPr>
+          <w:rStyle w:val="SourceText"/>
+        </w:rPr>
+        <w:t>memories/&lt;project&gt;/&lt;title&gt;.md</w:t>
+      </w:r>
+      <w:r>
+        <w:rPr/>
+        <w:t xml:space="preserve">, the title taken from the memory's </w:t>
+      </w:r>
+      <w:r>
+        <w:rPr>
+          <w:rStyle w:val="SourceText"/>
+        </w:rPr>
+        <w:t>name:</w:t>
+      </w:r>
+      <w:r>
+        <w:rPr/>
+        <w:t xml:space="preserve"> line).</w:t>
+      </w:r>
+    </w:p>
+    <w:p>
+      <w:pPr>
+        <w:pStyle w:val="BodyText"/>
+        <w:bidi w:val="0"/>
+        <w:jc w:val="left"/>
+        <w:rPr/>
+      </w:pPr>
+      <w:r>
+        <w:rPr/>
+        <w:t xml:space="preserve">It writes only to the one writable vault: the vault with role </w:t>
+      </w:r>
+      <w:r>
+        <w:rPr>
+          <w:rStyle w:val="SourceText"/>
+        </w:rPr>
+        <w:t>primary</w:t>
+      </w:r>
+      <w:r>
+        <w:rPr/>
+        <w:t xml:space="preserve"> (without roles, the </w:t>
+      </w:r>
+      <w:r>
+        <w:rPr>
+          <w:rStyle w:val="SourceText"/>
+        </w:rPr>
+        <w:t>default: true</w:t>
+      </w:r>
+      <w:r>
+        <w:rPr/>
+        <w:t xml:space="preserve"> vault, else the first; with no </w:t>
+      </w:r>
+      <w:r>
+        <w:rPr>
+          <w:rStyle w:val="SourceText"/>
+        </w:rPr>
+        <w:t>vaults</w:t>
+      </w:r>
+      <w:r>
+        <w:rPr/>
+        <w:t xml:space="preserve"> block, </w:t>
+      </w:r>
+      <w:r>
+        <w:rPr>
+          <w:rStyle w:val="SourceText"/>
+        </w:rPr>
+        <w:t>memory</w:t>
+      </w:r>
+      <w:r>
+        <w:rPr/>
+        <w:t xml:space="preserve">). The folder must hold </w:t>
+      </w:r>
+      <w:r>
+        <w:rPr>
+          <w:rStyle w:val="SourceText"/>
+        </w:rPr>
+        <w:t>.obsidian/</w:t>
+      </w:r>
+      <w:r>
+        <w:rPr/>
+        <w:t xml:space="preserve">. A </w:t>
+      </w:r>
+      <w:r>
+        <w:rPr>
+          <w:rStyle w:val="SourceText"/>
+        </w:rPr>
+        <w:t>recall</w:t>
+      </w:r>
+      <w:r>
+        <w:rPr/>
+        <w:t xml:space="preserve"> or </w:t>
+      </w:r>
+      <w:r>
+        <w:rPr>
+          <w:rStyle w:val="SourceText"/>
+        </w:rPr>
+        <w:t>ignore</w:t>
+      </w:r>
+      <w:r>
+        <w:rPr/>
+        <w:t xml:space="preserve"> vault is never written, and a primary that is not mounted is reported, not replaced. The note gets the vault's six frontmatter keys plus </w:t>
+      </w:r>
+      <w:r>
+        <w:rPr>
+          <w:rStyle w:val="SourceText"/>
+        </w:rPr>
+        <w:t>project</w:t>
+      </w:r>
+      <w:r>
+        <w:rPr/>
+        <w:t xml:space="preserve"> and </w:t>
+      </w:r>
+      <w:r>
+        <w:rPr>
+          <w:rStyle w:val="SourceText"/>
+        </w:rPr>
+        <w:t>memory_id</w:t>
+      </w:r>
+      <w:r>
+        <w:rPr/>
+        <w:t xml:space="preserve">; saving the same memory again appends a dated </w:t>
+      </w:r>
+      <w:r>
+        <w:rPr>
+          <w:rStyle w:val="SourceText"/>
+        </w:rPr>
+        <w:t>## Update</w:t>
+      </w:r>
+      <w:r>
+        <w:rPr/>
+        <w:t xml:space="preserve"> passage, and a note that belongs to another memory is a </w:t>
+      </w:r>
+      <w:r>
+        <w:rPr>
+          <w:rStyle w:val="SourceText"/>
+        </w:rPr>
+        <w:t>collision</w:t>
+      </w:r>
+      <w:r>
+        <w:rPr/>
+        <w:t>.</w:t>
+      </w:r>
+    </w:p>
+    <w:p>
+      <w:pPr>
+        <w:pStyle w:val="BodyText"/>
+        <w:bidi w:val="0"/>
+        <w:jc w:val="left"/>
+        <w:rPr/>
+      </w:pPr>
+      <w:r>
+        <w:rPr/>
+        <w:t xml:space="preserve">The order is the point. The note is written through a temp file, read back, and the pointer resolved; only then is the memory's body replaced, its frontmatter kept byte for byte, through a temp file and a rename. Any refusal or failure prints </w:t>
+      </w:r>
+      <w:r>
+        <w:rPr>
+          <w:rStyle w:val="SourceText"/>
+        </w:rPr>
+        <w:t>kept-full-text: &lt;reason&gt;</w:t>
+      </w:r>
+      <w:r>
+        <w:rPr/>
+        <w:t xml:space="preserve"> and leaves the memory exactly as it was:</w:t>
+      </w:r>
+    </w:p>
+    <w:tbl>
+      <w:tblPr>
+        <w:tblW w:w="5148" w:type="dxa"/>
+        <w:jc w:val="left"/>
+        <w:tblInd w:w="0" w:type="dxa"/>
+        <w:tblLayout w:type="fixed"/>
+        <w:tblCellMar>
+          <w:top w:w="28" w:type="dxa"/>
+          <w:left w:w="28" w:type="dxa"/>
+          <w:bottom w:w="28" w:type="dxa"/>
+          <w:right w:w="28" w:type="dxa"/>
+        </w:tblCellMar>
+      </w:tblPr>
+      <w:tblGrid>
+        <w:gridCol w:w="2832"/>
+        <w:gridCol w:w="1564"/>
+        <w:gridCol w:w="752"/>
+      </w:tblGrid>
+      <w:tr>
+        <w:trPr>
+          <w:tblHeader w:val="true"/>
+        </w:trPr>
+        <w:tc>
+          <w:tcPr>
+            <w:tcW w:w="2832" w:type="dxa"/>
+            <w:tcBorders/>
+            <w:vAlign w:val="center"/>
+          </w:tcPr>
+          <w:p>
+            <w:pPr>
+              <w:pStyle w:val="TableHeading"/>
+              <w:suppressLineNumbers/>
+              <w:shd w:fill="434C5E" w:val="clear"/>
+              <w:bidi w:val="0"/>
+              <w:spacing w:before="120" w:after="120"/>
+              <w:jc w:val="left"/>
+              <w:rPr/>
+            </w:pPr>
+            <w:r>
+              <w:rPr/>
+              <w:t>state</w:t>
+            </w:r>
+          </w:p>
+        </w:tc>
+        <w:tc>
+          <w:tcPr>
+            <w:tcW w:w="1564" w:type="dxa"/>
+            <w:tcBorders/>
+            <w:vAlign w:val="center"/>
+          </w:tcPr>
+          <w:p>
+            <w:pPr>
+              <w:pStyle w:val="TableHeading"/>
+              <w:suppressLineNumbers/>
+              <w:shd w:fill="434C5E" w:val="clear"/>
+              <w:bidi w:val="0"/>
+              <w:spacing w:before="120" w:after="120"/>
+              <w:jc w:val="left"/>
+              <w:rPr/>
+            </w:pPr>
+            <w:r>
+              <w:rPr/>
+              <w:t>memory file</w:t>
+            </w:r>
+          </w:p>
+        </w:tc>
+        <w:tc>
+          <w:tcPr>
+            <w:tcW w:w="752" w:type="dxa"/>
+            <w:tcBorders/>
+            <w:vAlign w:val="center"/>
+          </w:tcPr>
+          <w:p>
+            <w:pPr>
+              <w:pStyle w:val="TableHeading"/>
+              <w:suppressLineNumbers/>
+              <w:shd w:fill="434C5E" w:val="clear"/>
+              <w:bidi w:val="0"/>
+              <w:spacing w:before="120" w:after="120"/>
+              <w:jc w:val="left"/>
+              <w:rPr/>
+            </w:pPr>
+            <w:r>
+              <w:rPr/>
+              <w:t>exit</w:t>
+            </w:r>
+          </w:p>
+        </w:tc>
+      </w:tr>
+      <w:tr>
+        <w:trPr/>
+        <w:tc>
+          <w:tcPr>
+            <w:tcW w:w="2832" w:type="dxa"/>
+            <w:tcBorders/>
+            <w:vAlign w:val="center"/>
+          </w:tcPr>
+          <w:p>
+            <w:pPr>
+              <w:pStyle w:val="TableContents"/>
+              <w:shd w:fill="2E3440" w:val="clear"/>
+              <w:bidi w:val="0"/>
+              <w:spacing w:before="120" w:after="120"/>
+              <w:jc w:val="left"/>
+              <w:rPr/>
+            </w:pPr>
+            <w:r>
+              <w:rPr>
+                <w:rStyle w:val="SourceText"/>
+              </w:rPr>
+              <w:t>pointer-written</w:t>
+            </w:r>
+          </w:p>
+        </w:tc>
+        <w:tc>
+          <w:tcPr>
+            <w:tcW w:w="1564" w:type="dxa"/>
+            <w:tcBorders/>
+            <w:vAlign w:val="center"/>
+          </w:tcPr>
+          <w:p>
+            <w:pPr>
+              <w:pStyle w:val="TableContents"/>
+              <w:shd w:fill="2E3440" w:val="clear"/>
+              <w:bidi w:val="0"/>
+              <w:spacing w:before="120" w:after="120"/>
+              <w:jc w:val="left"/>
+              <w:rPr/>
+            </w:pPr>
+            <w:r>
+              <w:rPr/>
+              <w:t>body replaced by the pointer</w:t>
+            </w:r>
+          </w:p>
+        </w:tc>
+        <w:tc>
+          <w:tcPr>
+            <w:tcW w:w="752" w:type="dxa"/>
+            <w:tcBorders/>
+            <w:vAlign w:val="center"/>
+          </w:tcPr>
+          <w:p>
+            <w:pPr>
+              <w:pStyle w:val="TableContents"/>
+              <w:shd w:fill="2E3440" w:val="clear"/>
+              <w:bidi w:val="0"/>
+              <w:spacing w:before="120" w:after="120"/>
+              <w:jc w:val="left"/>
+              <w:rPr/>
+            </w:pPr>
+            <w:r>
+              <w:rPr/>
+              <w:t>0</w:t>
+            </w:r>
+          </w:p>
+        </w:tc>
+      </w:tr>
+      <w:tr>
+        <w:trPr/>
+        <w:tc>
+          <w:tcPr>
+            <w:tcW w:w="2832" w:type="dxa"/>
+            <w:tcBorders/>
+            <w:vAlign w:val="center"/>
+          </w:tcPr>
+          <w:p>
+            <w:pPr>
+              <w:pStyle w:val="TableContents"/>
+              <w:shd w:fill="2E3440" w:val="clear"/>
+              <w:bidi w:val="0"/>
+              <w:spacing w:before="120" w:after="120"/>
+              <w:jc w:val="left"/>
+              <w:rPr/>
+            </w:pPr>
+            <w:r>
+              <w:rPr>
+                <w:rStyle w:val="SourceText"/>
+              </w:rPr>
+              <w:t>already-pointer</w:t>
+            </w:r>
+          </w:p>
+        </w:tc>
+        <w:tc>
+          <w:tcPr>
+            <w:tcW w:w="1564" w:type="dxa"/>
+            <w:tcBorders/>
+            <w:vAlign w:val="center"/>
+          </w:tcPr>
+          <w:p>
+            <w:pPr>
+              <w:pStyle w:val="TableContents"/>
+              <w:shd w:fill="2E3440" w:val="clear"/>
+              <w:bidi w:val="0"/>
+              <w:spacing w:before="120" w:after="120"/>
+              <w:jc w:val="left"/>
+              <w:rPr/>
+            </w:pPr>
+            <w:r>
+              <w:rPr/>
+              <w:t>untouched</w:t>
+            </w:r>
+          </w:p>
+        </w:tc>
+        <w:tc>
+          <w:tcPr>
+            <w:tcW w:w="752" w:type="dxa"/>
+            <w:tcBorders/>
+            <w:vAlign w:val="center"/>
+          </w:tcPr>
+          <w:p>
+            <w:pPr>
+              <w:pStyle w:val="TableContents"/>
+              <w:shd w:fill="2E3440" w:val="clear"/>
+              <w:bidi w:val="0"/>
+              <w:spacing w:before="120" w:after="120"/>
+              <w:jc w:val="left"/>
+              <w:rPr/>
+            </w:pPr>
+            <w:r>
+              <w:rPr/>
+              <w:t>0</w:t>
+            </w:r>
+          </w:p>
+        </w:tc>
+      </w:tr>
+      <w:tr>
+        <w:trPr/>
+        <w:tc>
+          <w:tcPr>
+            <w:tcW w:w="2832" w:type="dxa"/>
+            <w:tcBorders/>
+            <w:vAlign w:val="center"/>
+          </w:tcPr>
+          <w:p>
+            <w:pPr>
+              <w:pStyle w:val="TableContents"/>
+              <w:shd w:fill="2E3440" w:val="clear"/>
+              <w:bidi w:val="0"/>
+              <w:spacing w:before="120" w:after="120"/>
+              <w:jc w:val="left"/>
+              <w:rPr/>
+            </w:pPr>
+            <w:r>
+              <w:rPr>
+                <w:rStyle w:val="SourceText"/>
+              </w:rPr>
+              <w:t>kept-full-text: no vault configured</w:t>
+            </w:r>
+          </w:p>
+        </w:tc>
+        <w:tc>
+          <w:tcPr>
+            <w:tcW w:w="1564" w:type="dxa"/>
+            <w:tcBorders/>
+            <w:vAlign w:val="center"/>
+          </w:tcPr>
+          <w:p>
+            <w:pPr>
+              <w:pStyle w:val="TableContents"/>
+              <w:shd w:fill="2E3440" w:val="clear"/>
+              <w:bidi w:val="0"/>
+              <w:spacing w:before="120" w:after="120"/>
+              <w:jc w:val="left"/>
+              <w:rPr/>
+            </w:pPr>
+            <w:r>
+              <w:rPr/>
+              <w:t>untouched</w:t>
+            </w:r>
+          </w:p>
+        </w:tc>
+        <w:tc>
+          <w:tcPr>
+            <w:tcW w:w="752" w:type="dxa"/>
+            <w:tcBorders/>
+            <w:vAlign w:val="center"/>
+          </w:tcPr>
+          <w:p>
+            <w:pPr>
+              <w:pStyle w:val="TableContents"/>
+              <w:shd w:fill="2E3440" w:val="clear"/>
+              <w:bidi w:val="0"/>
+              <w:spacing w:before="120" w:after="120"/>
+              <w:jc w:val="left"/>
+              <w:rPr/>
+            </w:pPr>
+            <w:r>
+              <w:rPr/>
+              <w:t>0</w:t>
+            </w:r>
+          </w:p>
+        </w:tc>
+      </w:tr>
+      <w:tr>
+        <w:trPr/>
+        <w:tc>
+          <w:tcPr>
+            <w:tcW w:w="2832" w:type="dxa"/>
+            <w:tcBorders/>
+            <w:vAlign w:val="center"/>
+          </w:tcPr>
+          <w:p>
+            <w:pPr>
+              <w:pStyle w:val="TableContents"/>
+              <w:shd w:fill="2E3440" w:val="clear"/>
+              <w:bidi w:val="0"/>
+              <w:spacing w:before="120" w:after="120"/>
+              <w:jc w:val="left"/>
+              <w:rPr/>
+            </w:pPr>
+            <w:r>
+              <w:rPr>
+                <w:rStyle w:val="SourceText"/>
+              </w:rPr>
+              <w:t>kept-full-text: vault unavailable</w:t>
+            </w:r>
+            <w:r>
+              <w:rPr/>
+              <w:t xml:space="preserve">, </w:t>
+            </w:r>
+            <w:r>
+              <w:rPr>
+                <w:rStyle w:val="SourceText"/>
+              </w:rPr>
+              <w:t>no primary</w:t>
+            </w:r>
+            <w:r>
+              <w:rPr/>
+              <w:t xml:space="preserve">, </w:t>
+            </w:r>
+            <w:r>
+              <w:rPr>
+                <w:rStyle w:val="SourceText"/>
+              </w:rPr>
+              <w:t>several primaries</w:t>
+            </w:r>
+            <w:r>
+              <w:rPr/>
+              <w:t xml:space="preserve">, </w:t>
+            </w:r>
+            <w:r>
+              <w:rPr>
+                <w:rStyle w:val="SourceText"/>
+              </w:rPr>
+              <w:t>not a vault</w:t>
+            </w:r>
+            <w:r>
+              <w:rPr/>
+              <w:t xml:space="preserve">, </w:t>
+            </w:r>
+            <w:r>
+              <w:rPr>
+                <w:rStyle w:val="SourceText"/>
+              </w:rPr>
+              <w:t>config unreadable</w:t>
+            </w:r>
+          </w:p>
+        </w:tc>
+        <w:tc>
+          <w:tcPr>
+            <w:tcW w:w="1564" w:type="dxa"/>
+            <w:tcBorders/>
+            <w:vAlign w:val="center"/>
+          </w:tcPr>
+          <w:p>
+            <w:pPr>
+              <w:pStyle w:val="TableContents"/>
+              <w:shd w:fill="2E3440" w:val="clear"/>
+              <w:bidi w:val="0"/>
+              <w:spacing w:before="120" w:after="120"/>
+              <w:jc w:val="left"/>
+              <w:rPr/>
+            </w:pPr>
+            <w:r>
+              <w:rPr/>
+              <w:t>untouched</w:t>
+            </w:r>
+          </w:p>
+        </w:tc>
+        <w:tc>
+          <w:tcPr>
+            <w:tcW w:w="752" w:type="dxa"/>
+            <w:tcBorders/>
+            <w:vAlign w:val="center"/>
+          </w:tcPr>
+          <w:p>
+            <w:pPr>
+              <w:pStyle w:val="TableContents"/>
+              <w:shd w:fill="2E3440" w:val="clear"/>
+              <w:bidi w:val="0"/>
+              <w:spacing w:before="120" w:after="120"/>
+              <w:jc w:val="left"/>
+              <w:rPr/>
+            </w:pPr>
+            <w:r>
+              <w:rPr/>
+              <w:t>1</w:t>
+            </w:r>
+          </w:p>
+        </w:tc>
+      </w:tr>
+      <w:tr>
+        <w:trPr/>
+        <w:tc>
+          <w:tcPr>
+            <w:tcW w:w="2832" w:type="dxa"/>
+            <w:tcBorders/>
+            <w:vAlign w:val="center"/>
+          </w:tcPr>
+          <w:p>
+            <w:pPr>
+              <w:pStyle w:val="TableContents"/>
+              <w:shd w:fill="2E3440" w:val="clear"/>
+              <w:bidi w:val="0"/>
+              <w:spacing w:before="120" w:after="120"/>
+              <w:jc w:val="left"/>
+              <w:rPr/>
+            </w:pPr>
+            <w:r>
+              <w:rPr>
+                <w:rStyle w:val="SourceText"/>
+              </w:rPr>
+              <w:t>kept-full-text: collision</w:t>
+            </w:r>
+            <w:r>
+              <w:rPr/>
+              <w:t xml:space="preserve">, </w:t>
+            </w:r>
+            <w:r>
+              <w:rPr>
+                <w:rStyle w:val="SourceText"/>
+              </w:rPr>
+              <w:t>ascii-required</w:t>
+            </w:r>
+            <w:r>
+              <w:rPr/>
+              <w:t xml:space="preserve">, </w:t>
+            </w:r>
+            <w:r>
+              <w:rPr>
+                <w:rStyle w:val="SourceText"/>
+              </w:rPr>
+              <w:t>outside-vault</w:t>
+            </w:r>
+            <w:r>
+              <w:rPr/>
+              <w:t xml:space="preserve">, </w:t>
+            </w:r>
+            <w:r>
+              <w:rPr>
+                <w:rStyle w:val="SourceText"/>
+              </w:rPr>
+              <w:t>bad-note-path</w:t>
+            </w:r>
+          </w:p>
+        </w:tc>
+        <w:tc>
+          <w:tcPr>
+            <w:tcW w:w="1564" w:type="dxa"/>
+            <w:tcBorders/>
+            <w:vAlign w:val="center"/>
+          </w:tcPr>
+          <w:p>
+            <w:pPr>
+              <w:pStyle w:val="TableContents"/>
+              <w:shd w:fill="2E3440" w:val="clear"/>
+              <w:bidi w:val="0"/>
+              <w:spacing w:before="120" w:after="120"/>
+              <w:jc w:val="left"/>
+              <w:rPr/>
+            </w:pPr>
+            <w:r>
+              <w:rPr/>
+              <w:t>untouched</w:t>
+            </w:r>
+          </w:p>
+        </w:tc>
+        <w:tc>
+          <w:tcPr>
+            <w:tcW w:w="752" w:type="dxa"/>
+            <w:tcBorders/>
+            <w:vAlign w:val="center"/>
+          </w:tcPr>
+          <w:p>
+            <w:pPr>
+              <w:pStyle w:val="TableContents"/>
+              <w:shd w:fill="2E3440" w:val="clear"/>
+              <w:bidi w:val="0"/>
+              <w:spacing w:before="120" w:after="120"/>
+              <w:jc w:val="left"/>
+              <w:rPr/>
+            </w:pPr>
+            <w:r>
+              <w:rPr/>
+              <w:t>1</w:t>
+            </w:r>
+          </w:p>
+        </w:tc>
+      </w:tr>
+      <w:tr>
+        <w:trPr/>
+        <w:tc>
+          <w:tcPr>
+            <w:tcW w:w="2832" w:type="dxa"/>
+            <w:tcBorders/>
+            <w:vAlign w:val="center"/>
+          </w:tcPr>
+          <w:p>
+            <w:pPr>
+              <w:pStyle w:val="TableContents"/>
+              <w:shd w:fill="2E3440" w:val="clear"/>
+              <w:bidi w:val="0"/>
+              <w:spacing w:before="120" w:after="120"/>
+              <w:jc w:val="left"/>
+              <w:rPr/>
+            </w:pPr>
+            <w:r>
+              <w:rPr>
+                <w:rStyle w:val="SourceText"/>
+              </w:rPr>
+              <w:t>kept-full-text: note write failed</w:t>
+            </w:r>
+            <w:r>
+              <w:rPr/>
+              <w:t xml:space="preserve">, </w:t>
+            </w:r>
+            <w:r>
+              <w:rPr>
+                <w:rStyle w:val="SourceText"/>
+              </w:rPr>
+              <w:t>note not readable after write</w:t>
+            </w:r>
+            <w:r>
+              <w:rPr/>
+              <w:t xml:space="preserve">, </w:t>
+            </w:r>
+            <w:r>
+              <w:rPr>
+                <w:rStyle w:val="SourceText"/>
+              </w:rPr>
+              <w:t>pointer write failed</w:t>
+            </w:r>
+            <w:r>
+              <w:rPr/>
+              <w:t xml:space="preserve">, </w:t>
+            </w:r>
+            <w:r>
+              <w:rPr>
+                <w:rStyle w:val="SourceText"/>
+              </w:rPr>
+              <w:t>the memory file changed during save</w:t>
+            </w:r>
+          </w:p>
+        </w:tc>
+        <w:tc>
+          <w:tcPr>
+            <w:tcW w:w="1564" w:type="dxa"/>
+            <w:tcBorders/>
+            <w:vAlign w:val="center"/>
+          </w:tcPr>
+          <w:p>
+            <w:pPr>
+              <w:pStyle w:val="TableContents"/>
+              <w:shd w:fill="2E3440" w:val="clear"/>
+              <w:bidi w:val="0"/>
+              <w:spacing w:before="120" w:after="120"/>
+              <w:jc w:val="left"/>
+              <w:rPr/>
+            </w:pPr>
+            <w:r>
+              <w:rPr/>
+              <w:t>untouched</w:t>
+            </w:r>
+          </w:p>
+        </w:tc>
+        <w:tc>
+          <w:tcPr>
+            <w:tcW w:w="752" w:type="dxa"/>
+            <w:tcBorders/>
+            <w:vAlign w:val="center"/>
+          </w:tcPr>
+          <w:p>
+            <w:pPr>
+              <w:pStyle w:val="TableContents"/>
+              <w:shd w:fill="2E3440" w:val="clear"/>
+              <w:bidi w:val="0"/>
+              <w:spacing w:before="120" w:after="120"/>
+              <w:jc w:val="left"/>
+              <w:rPr/>
+            </w:pPr>
+            <w:r>
+              <w:rPr/>
+              <w:t>1</w:t>
+            </w:r>
+          </w:p>
+        </w:tc>
+      </w:tr>
+    </w:tbl>
+    <w:p>
+      <w:pPr>
+        <w:pStyle w:val="BodyText"/>
+        <w:bidi w:val="0"/>
+        <w:jc w:val="left"/>
+        <w:rPr/>
+      </w:pPr>
+      <w:r>
+        <w:rPr/>
+        <w:t xml:space="preserve">Claude Code 2.1.289 was seen to keep a one-line pointer body across new sessions (it rewrites the frontmatter when it updates the memory, and kept the pointer). If a later version rewrites the body with full text, </w:t>
+      </w:r>
+      <w:r>
+        <w:rPr>
+          <w:rStyle w:val="SourceText"/>
+        </w:rPr>
+        <w:t>check</w:t>
+      </w:r>
+      <w:r>
+        <w:rPr/>
+        <w:t xml:space="preserve"> shows it as </w:t>
+      </w:r>
+      <w:r>
+        <w:rPr>
+          <w:rStyle w:val="SourceText"/>
+        </w:rPr>
+        <w:t>full-text</w:t>
+      </w:r>
+      <w:r>
+        <w:rPr/>
+        <w:t xml:space="preserve"> again; run </w:t>
+      </w:r>
+      <w:r>
+        <w:rPr>
+          <w:rStyle w:val="SourceText"/>
+        </w:rPr>
+        <w:t>save</w:t>
+      </w:r>
+      <w:r>
+        <w:rPr/>
+        <w:t xml:space="preserve"> again. Converting existing memories in bulk arrives in a later version.</w:t>
       </w:r>
     </w:p>
     <w:p>
@@ -4085,8 +5062,8 @@
         <w:jc w:val="left"/>
         <w:rPr/>
       </w:pPr>
-      <w:bookmarkStart w:id="12" w:name="confirming-recall-reaches-your-sessions"/>
-      <w:bookmarkEnd w:id="12"/>
+      <w:bookmarkStart w:id="13" w:name="confirming-recall-reaches-your-sessions"/>
+      <w:bookmarkEnd w:id="13"/>
       <w:r>
         <w:rPr/>
         <w:t>Confirming Recall Reaches Your Sessions</w:t>
@@ -4112,8 +5089,8 @@
         <w:jc w:val="left"/>
         <w:rPr/>
       </w:pPr>
-      <w:bookmarkStart w:id="13" w:name="path-scoped-rules-from-the-code-map"/>
-      <w:bookmarkEnd w:id="13"/>
+      <w:bookmarkStart w:id="14" w:name="path-scoped-rules-from-the-code-map"/>
+      <w:bookmarkEnd w:id="14"/>
       <w:r>
         <w:rPr/>
         <w:t>Path-Scoped Rules from the Code Map</w:t>
@@ -4366,8 +5343,8 @@
         <w:jc w:val="left"/>
         <w:rPr/>
       </w:pPr>
-      <w:bookmarkStart w:id="14" w:name="confirming-recall-reaches-your-sessions_"/>
-      <w:bookmarkEnd w:id="14"/>
+      <w:bookmarkStart w:id="15" w:name="confirming-recall-reaches-your-sessions_"/>
+      <w:bookmarkEnd w:id="15"/>
       <w:r>
         <w:rPr/>
         <w:t>Confirming Recall Reaches Your Sessions</w:t>
@@ -4515,8 +5492,8 @@
         <w:jc w:val="left"/>
         <w:rPr/>
       </w:pPr>
-      <w:bookmarkStart w:id="15" w:name="which-channel-reaches-which-agent"/>
-      <w:bookmarkEnd w:id="15"/>
+      <w:bookmarkStart w:id="16" w:name="which-channel-reaches-which-agent"/>
+      <w:bookmarkEnd w:id="16"/>
       <w:r>
         <w:rPr/>
         <w:t>Which Channel Reaches Which Agent</w:t>
@@ -4988,8 +5965,8 @@
         <w:jc w:val="left"/>
         <w:rPr/>
       </w:pPr>
-      <w:bookmarkStart w:id="16" w:name="where-recall-comes-from"/>
-      <w:bookmarkEnd w:id="16"/>
+      <w:bookmarkStart w:id="17" w:name="where-recall-comes-from"/>
+      <w:bookmarkEnd w:id="17"/>
       <w:r>
         <w:rPr/>
         <w:t>Where Recall Comes From</w:t>
@@ -5220,8 +6197,8 @@
         <w:jc w:val="left"/>
         <w:rPr/>
       </w:pPr>
-      <w:bookmarkStart w:id="17" w:name="the-seeded-note-proof"/>
-      <w:bookmarkEnd w:id="17"/>
+      <w:bookmarkStart w:id="18" w:name="the-seeded-note-proof"/>
+      <w:bookmarkEnd w:id="18"/>
       <w:r>
         <w:rPr/>
         <w:t>The Seeded-Note Proof</w:t>
@@ -5667,8 +6644,8 @@
         <w:jc w:val="left"/>
         <w:rPr/>
       </w:pPr>
-      <w:bookmarkStart w:id="18" w:name="measured-against-the-real-vault_opspy-re"/>
-      <w:bookmarkEnd w:id="18"/>
+      <w:bookmarkStart w:id="19" w:name="measured-against-the-real-vault_opspy-re"/>
+      <w:bookmarkEnd w:id="19"/>
       <w:r>
         <w:rPr/>
         <w:t xml:space="preserve">Measured against the real </w:t>
@@ -5935,8 +6912,8 @@
         <w:jc w:val="left"/>
         <w:rPr/>
       </w:pPr>
-      <w:bookmarkStart w:id="19" w:name="reading-stats"/>
-      <w:bookmarkEnd w:id="19"/>
+      <w:bookmarkStart w:id="20" w:name="reading-stats"/>
+      <w:bookmarkEnd w:id="20"/>
       <w:r>
         <w:rPr/>
         <w:t xml:space="preserve">Reading </w:t>

</xml_diff>

<commit_message>
T-0083: review round 1 docs - no userIgnoreFilters, case, symlinks, whole words; code map to 17ea9d1e
README, CHANGELOG, memory-recall-proof.md and troubleshooting.md (guides
rebuilt) drop the userIgnoreFilters claims and name the follow-up; README
documents the folder-match risk (N3); skipped_links replaces skipped_filters;
verify.json rule why re-measured; code map re-derived for vault_recall.py and
.claude/rules regenerated.

Claude-Session: https://claude.ai/code/session_016wQA2o38aSB65bpjaGpMVJ
</commit_message>
<xml_diff>
--- a/docs/guides/crew/crew-1.0-memory-and-obsidian.docx
+++ b/docs/guides/crew/crew-1.0-memory-and-obsidian.docx
@@ -4011,7 +4011,7 @@
       </w:pPr>
       <w:r>
         <w:rPr/>
-        <w:t xml:space="preserve">An empty recall can be the CLI working as meant: it skips stop words, needs more than one matching word for a query of three or more words, and never reads </w:t>
+        <w:t xml:space="preserve">An empty recall can be the CLI working as meant: it skips stop words, needs more than one matching word for a query of three or more words, matches whole words only, and never reads </w:t>
       </w:r>
       <w:r>
         <w:rPr>
@@ -4021,17 +4021,7 @@
       </w:r>
       <w:r>
         <w:rPr/>
-        <w:t xml:space="preserve"> or the vault's </w:t>
-      </w:r>
-      <w:r>
-        <w:rPr>
-          <w:rStyle w:val="SourceText"/>
-        </w:rPr>
-        <w:t>userIgnoreFilters</w:t>
-      </w:r>
-      <w:r>
-        <w:rPr/>
-        <w:t xml:space="preserve"> folders. To check whether a note is there but held back, run the CLI with </w:t>
+        <w:t xml:space="preserve">. To check whether a note is there but held back, run the CLI with </w:t>
       </w:r>
       <w:r>
         <w:rPr>
@@ -4051,7 +4041,7 @@
       </w:r>
       <w:r>
         <w:rPr/>
-        <w:t xml:space="preserve"> (every folder). </w:t>
+        <w:t xml:space="preserve"> (the archive too). </w:t>
       </w:r>
     </w:p>
     <w:p>

</xml_diff>

<commit_message>
L-0677 review round 1: docs say exactly what save guarantees; every kept-full-text reason listed
README section 14, the crew-memory skill (plus the Git Bash python note)
and the memory guide (rebuilt) list every reason and state the lock and
re-compare guarantee and its limit; codemap re-cited, verify why re-timed,
CHANGELOG.

Claude-Session: https://claude.ai/code/session_016wQA2o38aSB65bpjaGpMVJ
</commit_message>
<xml_diff>
--- a/docs/guides/crew/crew-1.0-memory-and-obsidian.docx
+++ b/docs/guides/crew/crew-1.0-memory-and-obsidian.docx
@@ -4084,7 +4084,1154 @@
       </w:pPr>
       <w:r>
         <w:rPr/>
-        <w:t>An unavailable vault is never replaced by another one that happens to hold a note at the same path. This crew version only reads pointers; writing them, and converting existing memories, arrive in later versions.</w:t>
+        <w:t>An unavailable vault is never replaced by another one that happens to hold a note at the same path.</w:t>
+      </w:r>
+    </w:p>
+    <w:p>
+      <w:pPr>
+        <w:pStyle w:val="Heading3"/>
+        <w:bidi w:val="0"/>
+        <w:ind w:hanging="0" w:left="0" w:right="0"/>
+        <w:jc w:val="left"/>
+        <w:rPr/>
+      </w:pPr>
+      <w:bookmarkStart w:id="12" w:name="saving-a-memory-as-a-pointer"/>
+      <w:bookmarkEnd w:id="12"/>
+      <w:r>
+        <w:rPr/>
+        <w:t>Saving a Memory as a Pointer</w:t>
+      </w:r>
+    </w:p>
+    <w:p>
+      <w:pPr>
+        <w:pStyle w:val="BodyText"/>
+        <w:bidi w:val="0"/>
+        <w:jc w:val="left"/>
+        <w:rPr/>
+      </w:pPr>
+      <w:r>
+        <w:rPr>
+          <w:rStyle w:val="SourceText"/>
+        </w:rPr>
+        <w:t>save</w:t>
+      </w:r>
+      <w:r>
+        <w:rPr/>
+        <w:t xml:space="preserve"> turns one memory that holds its full text into a pointer, note first:</w:t>
+      </w:r>
+    </w:p>
+    <w:p>
+      <w:pPr>
+        <w:pStyle w:val="PreformattedText"/>
+        <w:bidi w:val="0"/>
+        <w:jc w:val="left"/>
+        <w:rPr/>
+      </w:pPr>
+      <w:r>
+        <w:rPr>
+          <w:rStyle w:val="SourceText"/>
+        </w:rPr>
+        <w:t>python3 plugin/crew/hooks/scripts/crew_memory.py save --file &lt;memory file&gt; --tag &lt;tag&gt;</w:t>
+      </w:r>
+    </w:p>
+    <w:p>
+      <w:pPr>
+        <w:pStyle w:val="PreformattedText"/>
+        <w:bidi w:val="0"/>
+        <w:jc w:val="left"/>
+        <w:rPr/>
+      </w:pPr>
+      <w:r>
+        <w:rPr>
+          <w:rStyle w:val="SourceText"/>
+        </w:rPr>
+        <w:t>python3 plugin/crew/hooks/scripts/crew_memory.py save --file &lt;memory file&gt; --tag &lt;tag&gt; --apply</w:t>
+      </w:r>
+    </w:p>
+    <w:p>
+      <w:pPr>
+        <w:pStyle w:val="BodyText"/>
+        <w:bidi w:val="0"/>
+        <w:jc w:val="left"/>
+        <w:rPr/>
+      </w:pPr>
+      <w:r>
+        <w:rPr/>
+        <w:t xml:space="preserve">Without </w:t>
+      </w:r>
+      <w:r>
+        <w:rPr>
+          <w:rStyle w:val="SourceText"/>
+        </w:rPr>
+        <w:t>--apply</w:t>
+      </w:r>
+      <w:r>
+        <w:rPr/>
+        <w:t xml:space="preserve"> it prints the plan (the vault, the note, </w:t>
+      </w:r>
+      <w:r>
+        <w:rPr>
+          <w:rStyle w:val="SourceText"/>
+        </w:rPr>
+        <w:t>create</w:t>
+      </w:r>
+      <w:r>
+        <w:rPr/>
+        <w:t xml:space="preserve">, </w:t>
+      </w:r>
+      <w:r>
+        <w:rPr>
+          <w:rStyle w:val="SourceText"/>
+        </w:rPr>
+        <w:t>append</w:t>
+      </w:r>
+      <w:r>
+        <w:rPr/>
+        <w:t xml:space="preserve"> or </w:t>
+      </w:r>
+      <w:r>
+        <w:rPr>
+          <w:rStyle w:val="SourceText"/>
+        </w:rPr>
+        <w:t>unchanged</w:t>
+      </w:r>
+      <w:r>
+        <w:rPr/>
+        <w:t xml:space="preserve">, and the pointer line) and writes nothing. Read your vault's own </w:t>
+      </w:r>
+      <w:r>
+        <w:rPr>
+          <w:rStyle w:val="SourceText"/>
+        </w:rPr>
+        <w:t>CLAUDE.md</w:t>
+      </w:r>
+      <w:r>
+        <w:rPr/>
+        <w:t xml:space="preserve"> for its folders and tags first; </w:t>
+      </w:r>
+      <w:r>
+        <w:rPr>
+          <w:rStyle w:val="SourceText"/>
+        </w:rPr>
+        <w:t>--note</w:t>
+      </w:r>
+      <w:r>
+        <w:rPr/>
+        <w:t xml:space="preserve">, </w:t>
+      </w:r>
+      <w:r>
+        <w:rPr>
+          <w:rStyle w:val="SourceText"/>
+        </w:rPr>
+        <w:t>--title</w:t>
+      </w:r>
+      <w:r>
+        <w:rPr/>
+        <w:t xml:space="preserve">, </w:t>
+      </w:r>
+      <w:r>
+        <w:rPr>
+          <w:rStyle w:val="SourceText"/>
+        </w:rPr>
+        <w:t>--type</w:t>
+      </w:r>
+      <w:r>
+        <w:rPr/>
+        <w:t xml:space="preserve"> (</w:t>
+      </w:r>
+      <w:r>
+        <w:rPr>
+          <w:rStyle w:val="SourceText"/>
+        </w:rPr>
+        <w:t>concept</w:t>
+      </w:r>
+      <w:r>
+        <w:rPr/>
+        <w:t xml:space="preserve"> by default) and </w:t>
+      </w:r>
+      <w:r>
+        <w:rPr>
+          <w:rStyle w:val="SourceText"/>
+        </w:rPr>
+        <w:t>--project</w:t>
+      </w:r>
+      <w:r>
+        <w:rPr/>
+        <w:t xml:space="preserve"> change the defaults (</w:t>
+      </w:r>
+      <w:r>
+        <w:rPr>
+          <w:rStyle w:val="SourceText"/>
+        </w:rPr>
+        <w:t>memories/&lt;project&gt;/&lt;title&gt;.md</w:t>
+      </w:r>
+      <w:r>
+        <w:rPr/>
+        <w:t xml:space="preserve">, the title taken from the memory's </w:t>
+      </w:r>
+      <w:r>
+        <w:rPr>
+          <w:rStyle w:val="SourceText"/>
+        </w:rPr>
+        <w:t>name:</w:t>
+      </w:r>
+      <w:r>
+        <w:rPr/>
+        <w:t xml:space="preserve"> line).</w:t>
+      </w:r>
+    </w:p>
+    <w:p>
+      <w:pPr>
+        <w:pStyle w:val="BodyText"/>
+        <w:bidi w:val="0"/>
+        <w:jc w:val="left"/>
+        <w:rPr/>
+      </w:pPr>
+      <w:r>
+        <w:rPr/>
+        <w:t xml:space="preserve">It writes only to the one writable vault: the vault with role </w:t>
+      </w:r>
+      <w:r>
+        <w:rPr>
+          <w:rStyle w:val="SourceText"/>
+        </w:rPr>
+        <w:t>primary</w:t>
+      </w:r>
+      <w:r>
+        <w:rPr/>
+        <w:t xml:space="preserve"> (without roles, the </w:t>
+      </w:r>
+      <w:r>
+        <w:rPr>
+          <w:rStyle w:val="SourceText"/>
+        </w:rPr>
+        <w:t>default: true</w:t>
+      </w:r>
+      <w:r>
+        <w:rPr/>
+        <w:t xml:space="preserve"> vault, else the first; with no </w:t>
+      </w:r>
+      <w:r>
+        <w:rPr>
+          <w:rStyle w:val="SourceText"/>
+        </w:rPr>
+        <w:t>vaults</w:t>
+      </w:r>
+      <w:r>
+        <w:rPr/>
+        <w:t xml:space="preserve"> block, </w:t>
+      </w:r>
+      <w:r>
+        <w:rPr>
+          <w:rStyle w:val="SourceText"/>
+        </w:rPr>
+        <w:t>memory</w:t>
+      </w:r>
+      <w:r>
+        <w:rPr/>
+        <w:t xml:space="preserve">). The folder must hold </w:t>
+      </w:r>
+      <w:r>
+        <w:rPr>
+          <w:rStyle w:val="SourceText"/>
+        </w:rPr>
+        <w:t>.obsidian/</w:t>
+      </w:r>
+      <w:r>
+        <w:rPr/>
+        <w:t xml:space="preserve">. A </w:t>
+      </w:r>
+      <w:r>
+        <w:rPr>
+          <w:rStyle w:val="SourceText"/>
+        </w:rPr>
+        <w:t>recall</w:t>
+      </w:r>
+      <w:r>
+        <w:rPr/>
+        <w:t xml:space="preserve"> or </w:t>
+      </w:r>
+      <w:r>
+        <w:rPr>
+          <w:rStyle w:val="SourceText"/>
+        </w:rPr>
+        <w:t>ignore</w:t>
+      </w:r>
+      <w:r>
+        <w:rPr/>
+        <w:t xml:space="preserve"> vault is never written, and a primary that is not mounted is reported, not replaced. The note gets the vault's six frontmatter keys plus </w:t>
+      </w:r>
+      <w:r>
+        <w:rPr>
+          <w:rStyle w:val="SourceText"/>
+        </w:rPr>
+        <w:t>project</w:t>
+      </w:r>
+      <w:r>
+        <w:rPr/>
+        <w:t xml:space="preserve"> and </w:t>
+      </w:r>
+      <w:r>
+        <w:rPr>
+          <w:rStyle w:val="SourceText"/>
+        </w:rPr>
+        <w:t>memory_id</w:t>
+      </w:r>
+      <w:r>
+        <w:rPr/>
+        <w:t xml:space="preserve">; saving the same memory again appends a dated </w:t>
+      </w:r>
+      <w:r>
+        <w:rPr>
+          <w:rStyle w:val="SourceText"/>
+        </w:rPr>
+        <w:t>## Update</w:t>
+      </w:r>
+      <w:r>
+        <w:rPr/>
+        <w:t xml:space="preserve"> passage, and a note that belongs to another memory is a </w:t>
+      </w:r>
+      <w:r>
+        <w:rPr>
+          <w:rStyle w:val="SourceText"/>
+        </w:rPr>
+        <w:t>collision</w:t>
+      </w:r>
+      <w:r>
+        <w:rPr/>
+        <w:t>.</w:t>
+      </w:r>
+    </w:p>
+    <w:p>
+      <w:pPr>
+        <w:pStyle w:val="BodyText"/>
+        <w:bidi w:val="0"/>
+        <w:jc w:val="left"/>
+        <w:rPr/>
+      </w:pPr>
+      <w:r>
+        <w:rPr/>
+        <w:t xml:space="preserve">The order is the point. The note is written through a temp file, read back, and the pointer resolved; only then is the memory's body replaced, its frontmatter kept byte for byte, through a temp file and a rename. Any refusal or failure prints </w:t>
+      </w:r>
+      <w:r>
+        <w:rPr>
+          <w:rStyle w:val="SourceText"/>
+        </w:rPr>
+        <w:t>kept-full-text: &lt;reason&gt;</w:t>
+      </w:r>
+      <w:r>
+        <w:rPr/>
+        <w:t xml:space="preserve"> and leaves the memory exactly as it was:</w:t>
+      </w:r>
+    </w:p>
+    <w:tbl>
+      <w:tblPr>
+        <w:tblW w:w="5148" w:type="dxa"/>
+        <w:jc w:val="left"/>
+        <w:tblInd w:w="0" w:type="dxa"/>
+        <w:tblLayout w:type="fixed"/>
+        <w:tblCellMar>
+          <w:top w:w="28" w:type="dxa"/>
+          <w:left w:w="28" w:type="dxa"/>
+          <w:bottom w:w="28" w:type="dxa"/>
+          <w:right w:w="28" w:type="dxa"/>
+        </w:tblCellMar>
+      </w:tblPr>
+      <w:tblGrid>
+        <w:gridCol w:w="2892"/>
+        <w:gridCol w:w="1504"/>
+        <w:gridCol w:w="752"/>
+      </w:tblGrid>
+      <w:tr>
+        <w:trPr>
+          <w:tblHeader w:val="true"/>
+        </w:trPr>
+        <w:tc>
+          <w:tcPr>
+            <w:tcW w:w="2892" w:type="dxa"/>
+            <w:tcBorders/>
+            <w:vAlign w:val="center"/>
+          </w:tcPr>
+          <w:p>
+            <w:pPr>
+              <w:pStyle w:val="TableHeading"/>
+              <w:suppressLineNumbers/>
+              <w:shd w:fill="434C5E" w:val="clear"/>
+              <w:bidi w:val="0"/>
+              <w:spacing w:before="120" w:after="120"/>
+              <w:jc w:val="left"/>
+              <w:rPr/>
+            </w:pPr>
+            <w:r>
+              <w:rPr/>
+              <w:t>state</w:t>
+            </w:r>
+          </w:p>
+        </w:tc>
+        <w:tc>
+          <w:tcPr>
+            <w:tcW w:w="1504" w:type="dxa"/>
+            <w:tcBorders/>
+            <w:vAlign w:val="center"/>
+          </w:tcPr>
+          <w:p>
+            <w:pPr>
+              <w:pStyle w:val="TableHeading"/>
+              <w:suppressLineNumbers/>
+              <w:shd w:fill="434C5E" w:val="clear"/>
+              <w:bidi w:val="0"/>
+              <w:spacing w:before="120" w:after="120"/>
+              <w:jc w:val="left"/>
+              <w:rPr/>
+            </w:pPr>
+            <w:r>
+              <w:rPr/>
+              <w:t>memory file</w:t>
+            </w:r>
+          </w:p>
+        </w:tc>
+        <w:tc>
+          <w:tcPr>
+            <w:tcW w:w="752" w:type="dxa"/>
+            <w:tcBorders/>
+            <w:vAlign w:val="center"/>
+          </w:tcPr>
+          <w:p>
+            <w:pPr>
+              <w:pStyle w:val="TableHeading"/>
+              <w:suppressLineNumbers/>
+              <w:shd w:fill="434C5E" w:val="clear"/>
+              <w:bidi w:val="0"/>
+              <w:spacing w:before="120" w:after="120"/>
+              <w:jc w:val="left"/>
+              <w:rPr/>
+            </w:pPr>
+            <w:r>
+              <w:rPr/>
+              <w:t>exit</w:t>
+            </w:r>
+          </w:p>
+        </w:tc>
+      </w:tr>
+      <w:tr>
+        <w:trPr/>
+        <w:tc>
+          <w:tcPr>
+            <w:tcW w:w="2892" w:type="dxa"/>
+            <w:tcBorders/>
+            <w:vAlign w:val="center"/>
+          </w:tcPr>
+          <w:p>
+            <w:pPr>
+              <w:pStyle w:val="TableContents"/>
+              <w:shd w:fill="2E3440" w:val="clear"/>
+              <w:bidi w:val="0"/>
+              <w:spacing w:before="120" w:after="120"/>
+              <w:jc w:val="left"/>
+              <w:rPr/>
+            </w:pPr>
+            <w:r>
+              <w:rPr>
+                <w:rStyle w:val="SourceText"/>
+              </w:rPr>
+              <w:t>pointer-written</w:t>
+            </w:r>
+          </w:p>
+        </w:tc>
+        <w:tc>
+          <w:tcPr>
+            <w:tcW w:w="1504" w:type="dxa"/>
+            <w:tcBorders/>
+            <w:vAlign w:val="center"/>
+          </w:tcPr>
+          <w:p>
+            <w:pPr>
+              <w:pStyle w:val="TableContents"/>
+              <w:shd w:fill="2E3440" w:val="clear"/>
+              <w:bidi w:val="0"/>
+              <w:spacing w:before="120" w:after="120"/>
+              <w:jc w:val="left"/>
+              <w:rPr/>
+            </w:pPr>
+            <w:r>
+              <w:rPr/>
+              <w:t>body replaced by the pointer</w:t>
+            </w:r>
+          </w:p>
+        </w:tc>
+        <w:tc>
+          <w:tcPr>
+            <w:tcW w:w="752" w:type="dxa"/>
+            <w:tcBorders/>
+            <w:vAlign w:val="center"/>
+          </w:tcPr>
+          <w:p>
+            <w:pPr>
+              <w:pStyle w:val="TableContents"/>
+              <w:shd w:fill="2E3440" w:val="clear"/>
+              <w:bidi w:val="0"/>
+              <w:spacing w:before="120" w:after="120"/>
+              <w:jc w:val="left"/>
+              <w:rPr/>
+            </w:pPr>
+            <w:r>
+              <w:rPr/>
+              <w:t>0</w:t>
+            </w:r>
+          </w:p>
+        </w:tc>
+      </w:tr>
+      <w:tr>
+        <w:trPr/>
+        <w:tc>
+          <w:tcPr>
+            <w:tcW w:w="2892" w:type="dxa"/>
+            <w:tcBorders/>
+            <w:vAlign w:val="center"/>
+          </w:tcPr>
+          <w:p>
+            <w:pPr>
+              <w:pStyle w:val="TableContents"/>
+              <w:shd w:fill="2E3440" w:val="clear"/>
+              <w:bidi w:val="0"/>
+              <w:spacing w:before="120" w:after="120"/>
+              <w:jc w:val="left"/>
+              <w:rPr/>
+            </w:pPr>
+            <w:r>
+              <w:rPr>
+                <w:rStyle w:val="SourceText"/>
+              </w:rPr>
+              <w:t>already-pointer</w:t>
+            </w:r>
+          </w:p>
+        </w:tc>
+        <w:tc>
+          <w:tcPr>
+            <w:tcW w:w="1504" w:type="dxa"/>
+            <w:tcBorders/>
+            <w:vAlign w:val="center"/>
+          </w:tcPr>
+          <w:p>
+            <w:pPr>
+              <w:pStyle w:val="TableContents"/>
+              <w:shd w:fill="2E3440" w:val="clear"/>
+              <w:bidi w:val="0"/>
+              <w:spacing w:before="120" w:after="120"/>
+              <w:jc w:val="left"/>
+              <w:rPr/>
+            </w:pPr>
+            <w:r>
+              <w:rPr/>
+              <w:t>untouched</w:t>
+            </w:r>
+          </w:p>
+        </w:tc>
+        <w:tc>
+          <w:tcPr>
+            <w:tcW w:w="752" w:type="dxa"/>
+            <w:tcBorders/>
+            <w:vAlign w:val="center"/>
+          </w:tcPr>
+          <w:p>
+            <w:pPr>
+              <w:pStyle w:val="TableContents"/>
+              <w:shd w:fill="2E3440" w:val="clear"/>
+              <w:bidi w:val="0"/>
+              <w:spacing w:before="120" w:after="120"/>
+              <w:jc w:val="left"/>
+              <w:rPr/>
+            </w:pPr>
+            <w:r>
+              <w:rPr/>
+              <w:t>0</w:t>
+            </w:r>
+          </w:p>
+        </w:tc>
+      </w:tr>
+      <w:tr>
+        <w:trPr/>
+        <w:tc>
+          <w:tcPr>
+            <w:tcW w:w="2892" w:type="dxa"/>
+            <w:tcBorders/>
+            <w:vAlign w:val="center"/>
+          </w:tcPr>
+          <w:p>
+            <w:pPr>
+              <w:pStyle w:val="TableContents"/>
+              <w:shd w:fill="2E3440" w:val="clear"/>
+              <w:bidi w:val="0"/>
+              <w:spacing w:before="120" w:after="120"/>
+              <w:jc w:val="left"/>
+              <w:rPr/>
+            </w:pPr>
+            <w:r>
+              <w:rPr>
+                <w:rStyle w:val="SourceText"/>
+              </w:rPr>
+              <w:t>kept-full-text: no vault configured</w:t>
+            </w:r>
+          </w:p>
+        </w:tc>
+        <w:tc>
+          <w:tcPr>
+            <w:tcW w:w="1504" w:type="dxa"/>
+            <w:tcBorders/>
+            <w:vAlign w:val="center"/>
+          </w:tcPr>
+          <w:p>
+            <w:pPr>
+              <w:pStyle w:val="TableContents"/>
+              <w:shd w:fill="2E3440" w:val="clear"/>
+              <w:bidi w:val="0"/>
+              <w:spacing w:before="120" w:after="120"/>
+              <w:jc w:val="left"/>
+              <w:rPr/>
+            </w:pPr>
+            <w:r>
+              <w:rPr/>
+              <w:t>untouched</w:t>
+            </w:r>
+          </w:p>
+        </w:tc>
+        <w:tc>
+          <w:tcPr>
+            <w:tcW w:w="752" w:type="dxa"/>
+            <w:tcBorders/>
+            <w:vAlign w:val="center"/>
+          </w:tcPr>
+          <w:p>
+            <w:pPr>
+              <w:pStyle w:val="TableContents"/>
+              <w:shd w:fill="2E3440" w:val="clear"/>
+              <w:bidi w:val="0"/>
+              <w:spacing w:before="120" w:after="120"/>
+              <w:jc w:val="left"/>
+              <w:rPr/>
+            </w:pPr>
+            <w:r>
+              <w:rPr/>
+              <w:t>0</w:t>
+            </w:r>
+          </w:p>
+        </w:tc>
+      </w:tr>
+      <w:tr>
+        <w:trPr/>
+        <w:tc>
+          <w:tcPr>
+            <w:tcW w:w="2892" w:type="dxa"/>
+            <w:tcBorders/>
+            <w:vAlign w:val="center"/>
+          </w:tcPr>
+          <w:p>
+            <w:pPr>
+              <w:pStyle w:val="TableContents"/>
+              <w:shd w:fill="2E3440" w:val="clear"/>
+              <w:bidi w:val="0"/>
+              <w:spacing w:before="120" w:after="120"/>
+              <w:jc w:val="left"/>
+              <w:rPr/>
+            </w:pPr>
+            <w:r>
+              <w:rPr>
+                <w:rStyle w:val="SourceText"/>
+              </w:rPr>
+              <w:t>kept-full-text: vault unavailable</w:t>
+            </w:r>
+            <w:r>
+              <w:rPr/>
+              <w:t xml:space="preserve">, </w:t>
+            </w:r>
+            <w:r>
+              <w:rPr>
+                <w:rStyle w:val="SourceText"/>
+              </w:rPr>
+              <w:t>no primary</w:t>
+            </w:r>
+            <w:r>
+              <w:rPr/>
+              <w:t xml:space="preserve">, </w:t>
+            </w:r>
+            <w:r>
+              <w:rPr>
+                <w:rStyle w:val="SourceText"/>
+              </w:rPr>
+              <w:t>several primaries</w:t>
+            </w:r>
+            <w:r>
+              <w:rPr/>
+              <w:t xml:space="preserve">, </w:t>
+            </w:r>
+            <w:r>
+              <w:rPr>
+                <w:rStyle w:val="SourceText"/>
+              </w:rPr>
+              <w:t>not a vault</w:t>
+            </w:r>
+            <w:r>
+              <w:rPr/>
+              <w:t xml:space="preserve">, </w:t>
+            </w:r>
+            <w:r>
+              <w:rPr>
+                <w:rStyle w:val="SourceText"/>
+              </w:rPr>
+              <w:t>config unreadable</w:t>
+            </w:r>
+          </w:p>
+        </w:tc>
+        <w:tc>
+          <w:tcPr>
+            <w:tcW w:w="1504" w:type="dxa"/>
+            <w:tcBorders/>
+            <w:vAlign w:val="center"/>
+          </w:tcPr>
+          <w:p>
+            <w:pPr>
+              <w:pStyle w:val="TableContents"/>
+              <w:shd w:fill="2E3440" w:val="clear"/>
+              <w:bidi w:val="0"/>
+              <w:spacing w:before="120" w:after="120"/>
+              <w:jc w:val="left"/>
+              <w:rPr/>
+            </w:pPr>
+            <w:r>
+              <w:rPr/>
+              <w:t>untouched</w:t>
+            </w:r>
+          </w:p>
+        </w:tc>
+        <w:tc>
+          <w:tcPr>
+            <w:tcW w:w="752" w:type="dxa"/>
+            <w:tcBorders/>
+            <w:vAlign w:val="center"/>
+          </w:tcPr>
+          <w:p>
+            <w:pPr>
+              <w:pStyle w:val="TableContents"/>
+              <w:shd w:fill="2E3440" w:val="clear"/>
+              <w:bidi w:val="0"/>
+              <w:spacing w:before="120" w:after="120"/>
+              <w:jc w:val="left"/>
+              <w:rPr/>
+            </w:pPr>
+            <w:r>
+              <w:rPr/>
+              <w:t>1</w:t>
+            </w:r>
+          </w:p>
+        </w:tc>
+      </w:tr>
+      <w:tr>
+        <w:trPr/>
+        <w:tc>
+          <w:tcPr>
+            <w:tcW w:w="2892" w:type="dxa"/>
+            <w:tcBorders/>
+            <w:vAlign w:val="center"/>
+          </w:tcPr>
+          <w:p>
+            <w:pPr>
+              <w:pStyle w:val="TableContents"/>
+              <w:shd w:fill="2E3440" w:val="clear"/>
+              <w:bidi w:val="0"/>
+              <w:spacing w:before="120" w:after="120"/>
+              <w:jc w:val="left"/>
+              <w:rPr/>
+            </w:pPr>
+            <w:r>
+              <w:rPr>
+                <w:rStyle w:val="SourceText"/>
+              </w:rPr>
+              <w:t>kept-full-text: collision</w:t>
+            </w:r>
+            <w:r>
+              <w:rPr/>
+              <w:t xml:space="preserve">, </w:t>
+            </w:r>
+            <w:r>
+              <w:rPr>
+                <w:rStyle w:val="SourceText"/>
+              </w:rPr>
+              <w:t>ascii-required</w:t>
+            </w:r>
+            <w:r>
+              <w:rPr/>
+              <w:t xml:space="preserve">, </w:t>
+            </w:r>
+            <w:r>
+              <w:rPr>
+                <w:rStyle w:val="SourceText"/>
+              </w:rPr>
+              <w:t>outside-vault</w:t>
+            </w:r>
+            <w:r>
+              <w:rPr/>
+              <w:t xml:space="preserve">, </w:t>
+            </w:r>
+            <w:r>
+              <w:rPr>
+                <w:rStyle w:val="SourceText"/>
+              </w:rPr>
+              <w:t>bad-note-path</w:t>
+            </w:r>
+            <w:r>
+              <w:rPr/>
+              <w:t xml:space="preserve">, </w:t>
+            </w:r>
+            <w:r>
+              <w:rPr>
+                <w:rStyle w:val="SourceText"/>
+              </w:rPr>
+              <w:t>the existing note is not UTF-8</w:t>
+            </w:r>
+          </w:p>
+        </w:tc>
+        <w:tc>
+          <w:tcPr>
+            <w:tcW w:w="1504" w:type="dxa"/>
+            <w:tcBorders/>
+            <w:vAlign w:val="center"/>
+          </w:tcPr>
+          <w:p>
+            <w:pPr>
+              <w:pStyle w:val="TableContents"/>
+              <w:shd w:fill="2E3440" w:val="clear"/>
+              <w:bidi w:val="0"/>
+              <w:spacing w:before="120" w:after="120"/>
+              <w:jc w:val="left"/>
+              <w:rPr/>
+            </w:pPr>
+            <w:r>
+              <w:rPr/>
+              <w:t>untouched</w:t>
+            </w:r>
+          </w:p>
+        </w:tc>
+        <w:tc>
+          <w:tcPr>
+            <w:tcW w:w="752" w:type="dxa"/>
+            <w:tcBorders/>
+            <w:vAlign w:val="center"/>
+          </w:tcPr>
+          <w:p>
+            <w:pPr>
+              <w:pStyle w:val="TableContents"/>
+              <w:shd w:fill="2E3440" w:val="clear"/>
+              <w:bidi w:val="0"/>
+              <w:spacing w:before="120" w:after="120"/>
+              <w:jc w:val="left"/>
+              <w:rPr/>
+            </w:pPr>
+            <w:r>
+              <w:rPr/>
+              <w:t>1</w:t>
+            </w:r>
+          </w:p>
+        </w:tc>
+      </w:tr>
+      <w:tr>
+        <w:trPr/>
+        <w:tc>
+          <w:tcPr>
+            <w:tcW w:w="2892" w:type="dxa"/>
+            <w:tcBorders/>
+            <w:vAlign w:val="center"/>
+          </w:tcPr>
+          <w:p>
+            <w:pPr>
+              <w:pStyle w:val="TableContents"/>
+              <w:shd w:fill="2E3440" w:val="clear"/>
+              <w:bidi w:val="0"/>
+              <w:spacing w:before="120" w:after="120"/>
+              <w:jc w:val="left"/>
+              <w:rPr/>
+            </w:pPr>
+            <w:r>
+              <w:rPr>
+                <w:rStyle w:val="SourceText"/>
+              </w:rPr>
+              <w:t>kept-full-text: MEMORY.md is the index</w:t>
+            </w:r>
+            <w:r>
+              <w:rPr/>
+              <w:t xml:space="preserve">, </w:t>
+            </w:r>
+            <w:r>
+              <w:rPr>
+                <w:rStyle w:val="SourceText"/>
+              </w:rPr>
+              <w:t>the memory file is a symlink</w:t>
+            </w:r>
+            <w:r>
+              <w:rPr/>
+              <w:t xml:space="preserve">, </w:t>
+            </w:r>
+            <w:r>
+              <w:rPr>
+                <w:rStyle w:val="SourceText"/>
+              </w:rPr>
+              <w:t>the memory has no body to save</w:t>
+            </w:r>
+          </w:p>
+        </w:tc>
+        <w:tc>
+          <w:tcPr>
+            <w:tcW w:w="1504" w:type="dxa"/>
+            <w:tcBorders/>
+            <w:vAlign w:val="center"/>
+          </w:tcPr>
+          <w:p>
+            <w:pPr>
+              <w:pStyle w:val="TableContents"/>
+              <w:shd w:fill="2E3440" w:val="clear"/>
+              <w:bidi w:val="0"/>
+              <w:spacing w:before="120" w:after="120"/>
+              <w:jc w:val="left"/>
+              <w:rPr/>
+            </w:pPr>
+            <w:r>
+              <w:rPr/>
+              <w:t>untouched</w:t>
+            </w:r>
+          </w:p>
+        </w:tc>
+        <w:tc>
+          <w:tcPr>
+            <w:tcW w:w="752" w:type="dxa"/>
+            <w:tcBorders/>
+            <w:vAlign w:val="center"/>
+          </w:tcPr>
+          <w:p>
+            <w:pPr>
+              <w:pStyle w:val="TableContents"/>
+              <w:shd w:fill="2E3440" w:val="clear"/>
+              <w:bidi w:val="0"/>
+              <w:spacing w:before="120" w:after="120"/>
+              <w:jc w:val="left"/>
+              <w:rPr/>
+            </w:pPr>
+            <w:r>
+              <w:rPr/>
+              <w:t>1</w:t>
+            </w:r>
+          </w:p>
+        </w:tc>
+      </w:tr>
+      <w:tr>
+        <w:trPr/>
+        <w:tc>
+          <w:tcPr>
+            <w:tcW w:w="2892" w:type="dxa"/>
+            <w:tcBorders/>
+            <w:vAlign w:val="center"/>
+          </w:tcPr>
+          <w:p>
+            <w:pPr>
+              <w:pStyle w:val="TableContents"/>
+              <w:shd w:fill="2E3440" w:val="clear"/>
+              <w:bidi w:val="0"/>
+              <w:spacing w:before="120" w:after="120"/>
+              <w:jc w:val="left"/>
+              <w:rPr/>
+            </w:pPr>
+            <w:r>
+              <w:rPr>
+                <w:rStyle w:val="SourceText"/>
+              </w:rPr>
+              <w:t>kept-full-text: another save is in progress</w:t>
+            </w:r>
+            <w:r>
+              <w:rPr/>
+              <w:t xml:space="preserve">, </w:t>
+            </w:r>
+            <w:r>
+              <w:rPr>
+                <w:rStyle w:val="SourceText"/>
+              </w:rPr>
+              <w:t>note write failed</w:t>
+            </w:r>
+            <w:r>
+              <w:rPr/>
+              <w:t xml:space="preserve">, </w:t>
+            </w:r>
+            <w:r>
+              <w:rPr>
+                <w:rStyle w:val="SourceText"/>
+              </w:rPr>
+              <w:t>the note changed during save</w:t>
+            </w:r>
+            <w:r>
+              <w:rPr/>
+              <w:t xml:space="preserve">, </w:t>
+            </w:r>
+            <w:r>
+              <w:rPr>
+                <w:rStyle w:val="SourceText"/>
+              </w:rPr>
+              <w:t>note not readable after write</w:t>
+            </w:r>
+            <w:r>
+              <w:rPr/>
+              <w:t xml:space="preserve">, </w:t>
+            </w:r>
+            <w:r>
+              <w:rPr>
+                <w:rStyle w:val="SourceText"/>
+              </w:rPr>
+              <w:t>the memory file changed during save</w:t>
+            </w:r>
+            <w:r>
+              <w:rPr/>
+              <w:t xml:space="preserve">, </w:t>
+            </w:r>
+            <w:r>
+              <w:rPr>
+                <w:rStyle w:val="SourceText"/>
+              </w:rPr>
+              <w:t>the memory file cannot be read again</w:t>
+            </w:r>
+            <w:r>
+              <w:rPr/>
+              <w:t xml:space="preserve">, </w:t>
+            </w:r>
+            <w:r>
+              <w:rPr>
+                <w:rStyle w:val="SourceText"/>
+              </w:rPr>
+              <w:t>pointer write failed</w:t>
+            </w:r>
+          </w:p>
+        </w:tc>
+        <w:tc>
+          <w:tcPr>
+            <w:tcW w:w="1504" w:type="dxa"/>
+            <w:tcBorders/>
+            <w:vAlign w:val="center"/>
+          </w:tcPr>
+          <w:p>
+            <w:pPr>
+              <w:pStyle w:val="TableContents"/>
+              <w:shd w:fill="2E3440" w:val="clear"/>
+              <w:bidi w:val="0"/>
+              <w:spacing w:before="120" w:after="120"/>
+              <w:jc w:val="left"/>
+              <w:rPr/>
+            </w:pPr>
+            <w:r>
+              <w:rPr/>
+              <w:t>untouched</w:t>
+            </w:r>
+          </w:p>
+        </w:tc>
+        <w:tc>
+          <w:tcPr>
+            <w:tcW w:w="752" w:type="dxa"/>
+            <w:tcBorders/>
+            <w:vAlign w:val="center"/>
+          </w:tcPr>
+          <w:p>
+            <w:pPr>
+              <w:pStyle w:val="TableContents"/>
+              <w:shd w:fill="2E3440" w:val="clear"/>
+              <w:bidi w:val="0"/>
+              <w:spacing w:before="120" w:after="120"/>
+              <w:jc w:val="left"/>
+              <w:rPr/>
+            </w:pPr>
+            <w:r>
+              <w:rPr/>
+              <w:t>1</w:t>
+            </w:r>
+          </w:p>
+        </w:tc>
+      </w:tr>
+    </w:tbl>
+    <w:p>
+      <w:pPr>
+        <w:pStyle w:val="BodyText"/>
+        <w:bidi w:val="0"/>
+        <w:jc w:val="left"/>
+        <w:rPr/>
+      </w:pPr>
+      <w:r>
+        <w:rPr/>
+        <w:t xml:space="preserve">Two </w:t>
+      </w:r>
+      <w:r>
+        <w:rPr>
+          <w:rStyle w:val="SourceText"/>
+        </w:rPr>
+        <w:t>save</w:t>
+      </w:r>
+      <w:r>
+        <w:rPr/>
+        <w:t xml:space="preserve"> runs never interleave: each holds a lock file beside the note and beside the memory (</w:t>
+      </w:r>
+      <w:r>
+        <w:rPr>
+          <w:rStyle w:val="SourceText"/>
+        </w:rPr>
+        <w:t>.&lt;name&gt;.crew-save.lock</w:t>
+      </w:r>
+      <w:r>
+        <w:rPr/>
+        <w:t xml:space="preserve">; one older than 10 minutes is removed as left by a save that died). The memory and an existing note are compared again right before each rename. An edit by another program in the instant between that compare and the rename is not detected: a rename cannot compare and swap. An existing note keeps every byte, a BOM and CRLF line endings included; only its </w:t>
+      </w:r>
+      <w:r>
+        <w:rPr>
+          <w:rStyle w:val="SourceText"/>
+        </w:rPr>
+        <w:t>updated:</w:t>
+      </w:r>
+      <w:r>
+        <w:rPr/>
+        <w:t xml:space="preserve"> value changes and the passage is appended. A new note gets mode 0644 less your umask.</w:t>
+      </w:r>
+    </w:p>
+    <w:p>
+      <w:pPr>
+        <w:pStyle w:val="BodyText"/>
+        <w:bidi w:val="0"/>
+        <w:jc w:val="left"/>
+        <w:rPr/>
+      </w:pPr>
+      <w:r>
+        <w:rPr/>
+        <w:t xml:space="preserve">Claude Code 2.1.289 was seen to keep a one-line pointer body across new sessions (it rewrites the frontmatter when it updates the memory, and kept the pointer). If a later version rewrites the body with full text, </w:t>
+      </w:r>
+      <w:r>
+        <w:rPr>
+          <w:rStyle w:val="SourceText"/>
+        </w:rPr>
+        <w:t>check</w:t>
+      </w:r>
+      <w:r>
+        <w:rPr/>
+        <w:t xml:space="preserve"> shows it as </w:t>
+      </w:r>
+      <w:r>
+        <w:rPr>
+          <w:rStyle w:val="SourceText"/>
+        </w:rPr>
+        <w:t>full-text</w:t>
+      </w:r>
+      <w:r>
+        <w:rPr/>
+        <w:t xml:space="preserve"> again; run </w:t>
+      </w:r>
+      <w:r>
+        <w:rPr>
+          <w:rStyle w:val="SourceText"/>
+        </w:rPr>
+        <w:t>save</w:t>
+      </w:r>
+      <w:r>
+        <w:rPr/>
+        <w:t xml:space="preserve"> again. Converting existing memories in bulk arrives in a later version.</w:t>
       </w:r>
     </w:p>
     <w:p>
@@ -4095,8 +5242,8 @@
         <w:jc w:val="left"/>
         <w:rPr/>
       </w:pPr>
-      <w:bookmarkStart w:id="12" w:name="confirming-recall-reaches-your-sessions"/>
-      <w:bookmarkEnd w:id="12"/>
+      <w:bookmarkStart w:id="13" w:name="confirming-recall-reaches-your-sessions"/>
+      <w:bookmarkEnd w:id="13"/>
       <w:r>
         <w:rPr/>
         <w:t>Confirming Recall Reaches Your Sessions</w:t>
@@ -4122,8 +5269,8 @@
         <w:jc w:val="left"/>
         <w:rPr/>
       </w:pPr>
-      <w:bookmarkStart w:id="13" w:name="path-scoped-rules-from-the-code-map"/>
-      <w:bookmarkEnd w:id="13"/>
+      <w:bookmarkStart w:id="14" w:name="path-scoped-rules-from-the-code-map"/>
+      <w:bookmarkEnd w:id="14"/>
       <w:r>
         <w:rPr/>
         <w:t>Path-Scoped Rules from the Code Map</w:t>
@@ -4376,8 +5523,8 @@
         <w:jc w:val="left"/>
         <w:rPr/>
       </w:pPr>
-      <w:bookmarkStart w:id="14" w:name="confirming-recall-reaches-your-sessions_"/>
-      <w:bookmarkEnd w:id="14"/>
+      <w:bookmarkStart w:id="15" w:name="confirming-recall-reaches-your-sessions_"/>
+      <w:bookmarkEnd w:id="15"/>
       <w:r>
         <w:rPr/>
         <w:t>Confirming Recall Reaches Your Sessions</w:t>
@@ -4525,8 +5672,8 @@
         <w:jc w:val="left"/>
         <w:rPr/>
       </w:pPr>
-      <w:bookmarkStart w:id="15" w:name="which-channel-reaches-which-agent"/>
-      <w:bookmarkEnd w:id="15"/>
+      <w:bookmarkStart w:id="16" w:name="which-channel-reaches-which-agent"/>
+      <w:bookmarkEnd w:id="16"/>
       <w:r>
         <w:rPr/>
         <w:t>Which Channel Reaches Which Agent</w:t>
@@ -4998,8 +6145,8 @@
         <w:jc w:val="left"/>
         <w:rPr/>
       </w:pPr>
-      <w:bookmarkStart w:id="16" w:name="where-recall-comes-from"/>
-      <w:bookmarkEnd w:id="16"/>
+      <w:bookmarkStart w:id="17" w:name="where-recall-comes-from"/>
+      <w:bookmarkEnd w:id="17"/>
       <w:r>
         <w:rPr/>
         <w:t>Where Recall Comes From</w:t>
@@ -5230,8 +6377,8 @@
         <w:jc w:val="left"/>
         <w:rPr/>
       </w:pPr>
-      <w:bookmarkStart w:id="17" w:name="the-seeded-note-proof"/>
-      <w:bookmarkEnd w:id="17"/>
+      <w:bookmarkStart w:id="18" w:name="the-seeded-note-proof"/>
+      <w:bookmarkEnd w:id="18"/>
       <w:r>
         <w:rPr/>
         <w:t>The Seeded-Note Proof</w:t>
@@ -5677,8 +6824,8 @@
         <w:jc w:val="left"/>
         <w:rPr/>
       </w:pPr>
-      <w:bookmarkStart w:id="18" w:name="measured-against-the-real-vault_opspy-re"/>
-      <w:bookmarkEnd w:id="18"/>
+      <w:bookmarkStart w:id="19" w:name="measured-against-the-real-vault_opspy-re"/>
+      <w:bookmarkEnd w:id="19"/>
       <w:r>
         <w:rPr/>
         <w:t xml:space="preserve">Measured against the real </w:t>
@@ -5945,8 +7092,8 @@
         <w:jc w:val="left"/>
         <w:rPr/>
       </w:pPr>
-      <w:bookmarkStart w:id="19" w:name="reading-stats"/>
-      <w:bookmarkEnd w:id="19"/>
+      <w:bookmarkStart w:id="20" w:name="reading-stats"/>
+      <w:bookmarkEnd w:id="20"/>
       <w:r>
         <w:rPr/>
         <w:t xml:space="preserve">Reading </w:t>

</xml_diff>

<commit_message>
L-0677 review round 2: docs say what the save lock protects, and what it does not
README section 14, the crew-memory skill and the memory guide (rebuilt):
same-user same-machine saves only, not another machine syncing the vault
nor Claude Code or Obsidian; "never interleave" corrected; lock failed
and another save is running now listed; MEMORY.md as kept-full-text.
Codemap re-cited, rules regenerated, verify why re-timed, CHANGELOG.

Claude-Session: https://claude.ai/code/session_016wQA2o38aSB65bpjaGpMVJ
</commit_message>
<xml_diff>
--- a/docs/guides/crew/crew-1.0-memory-and-obsidian.docx
+++ b/docs/guides/crew/crew-1.0-memory-and-obsidian.docx
@@ -4438,8 +4438,8 @@
         </w:tblCellMar>
       </w:tblPr>
       <w:tblGrid>
-        <w:gridCol w:w="2892"/>
-        <w:gridCol w:w="1504"/>
+        <w:gridCol w:w="2896"/>
+        <w:gridCol w:w="1500"/>
         <w:gridCol w:w="752"/>
       </w:tblGrid>
       <w:tr>
@@ -4448,7 +4448,7 @@
         </w:trPr>
         <w:tc>
           <w:tcPr>
-            <w:tcW w:w="2892" w:type="dxa"/>
+            <w:tcW w:w="2896" w:type="dxa"/>
             <w:tcBorders/>
             <w:vAlign w:val="center"/>
           </w:tcPr>
@@ -4470,7 +4470,7 @@
         </w:tc>
         <w:tc>
           <w:tcPr>
-            <w:tcW w:w="1504" w:type="dxa"/>
+            <w:tcW w:w="1500" w:type="dxa"/>
             <w:tcBorders/>
             <w:vAlign w:val="center"/>
           </w:tcPr>
@@ -4517,7 +4517,7 @@
         <w:trPr/>
         <w:tc>
           <w:tcPr>
-            <w:tcW w:w="2892" w:type="dxa"/>
+            <w:tcW w:w="2896" w:type="dxa"/>
             <w:tcBorders/>
             <w:vAlign w:val="center"/>
           </w:tcPr>
@@ -4540,7 +4540,7 @@
         </w:tc>
         <w:tc>
           <w:tcPr>
-            <w:tcW w:w="1504" w:type="dxa"/>
+            <w:tcW w:w="1500" w:type="dxa"/>
             <w:tcBorders/>
             <w:vAlign w:val="center"/>
           </w:tcPr>
@@ -4585,7 +4585,7 @@
         <w:trPr/>
         <w:tc>
           <w:tcPr>
-            <w:tcW w:w="2892" w:type="dxa"/>
+            <w:tcW w:w="2896" w:type="dxa"/>
             <w:tcBorders/>
             <w:vAlign w:val="center"/>
           </w:tcPr>
@@ -4608,7 +4608,7 @@
         </w:tc>
         <w:tc>
           <w:tcPr>
-            <w:tcW w:w="1504" w:type="dxa"/>
+            <w:tcW w:w="1500" w:type="dxa"/>
             <w:tcBorders/>
             <w:vAlign w:val="center"/>
           </w:tcPr>
@@ -4653,7 +4653,7 @@
         <w:trPr/>
         <w:tc>
           <w:tcPr>
-            <w:tcW w:w="2892" w:type="dxa"/>
+            <w:tcW w:w="2896" w:type="dxa"/>
             <w:tcBorders/>
             <w:vAlign w:val="center"/>
           </w:tcPr>
@@ -4676,7 +4676,7 @@
         </w:tc>
         <w:tc>
           <w:tcPr>
-            <w:tcW w:w="1504" w:type="dxa"/>
+            <w:tcW w:w="1500" w:type="dxa"/>
             <w:tcBorders/>
             <w:vAlign w:val="center"/>
           </w:tcPr>
@@ -4721,7 +4721,7 @@
         <w:trPr/>
         <w:tc>
           <w:tcPr>
-            <w:tcW w:w="2892" w:type="dxa"/>
+            <w:tcW w:w="2896" w:type="dxa"/>
             <w:tcBorders/>
             <w:vAlign w:val="center"/>
           </w:tcPr>
@@ -4784,7 +4784,7 @@
         </w:tc>
         <w:tc>
           <w:tcPr>
-            <w:tcW w:w="1504" w:type="dxa"/>
+            <w:tcW w:w="1500" w:type="dxa"/>
             <w:tcBorders/>
             <w:vAlign w:val="center"/>
           </w:tcPr>
@@ -4829,7 +4829,7 @@
         <w:trPr/>
         <w:tc>
           <w:tcPr>
-            <w:tcW w:w="2892" w:type="dxa"/>
+            <w:tcW w:w="2896" w:type="dxa"/>
             <w:tcBorders/>
             <w:vAlign w:val="center"/>
           </w:tcPr>
@@ -4892,7 +4892,7 @@
         </w:tc>
         <w:tc>
           <w:tcPr>
-            <w:tcW w:w="1504" w:type="dxa"/>
+            <w:tcW w:w="1500" w:type="dxa"/>
             <w:tcBorders/>
             <w:vAlign w:val="center"/>
           </w:tcPr>
@@ -4937,7 +4937,7 @@
         <w:trPr/>
         <w:tc>
           <w:tcPr>
-            <w:tcW w:w="2892" w:type="dxa"/>
+            <w:tcW w:w="2896" w:type="dxa"/>
             <w:tcBorders/>
             <w:vAlign w:val="center"/>
           </w:tcPr>
@@ -4980,7 +4980,7 @@
         </w:tc>
         <w:tc>
           <w:tcPr>
-            <w:tcW w:w="1504" w:type="dxa"/>
+            <w:tcW w:w="1500" w:type="dxa"/>
             <w:tcBorders/>
             <w:vAlign w:val="center"/>
           </w:tcPr>
@@ -5025,7 +5025,7 @@
         <w:trPr/>
         <w:tc>
           <w:tcPr>
-            <w:tcW w:w="2892" w:type="dxa"/>
+            <w:tcW w:w="2896" w:type="dxa"/>
             <w:tcBorders/>
             <w:vAlign w:val="center"/>
           </w:tcPr>
@@ -5042,7 +5042,17 @@
               <w:rPr>
                 <w:rStyle w:val="SourceText"/>
               </w:rPr>
-              <w:t>kept-full-text: another save is in progress</w:t>
+              <w:t>kept-full-text: another save is running now</w:t>
+            </w:r>
+            <w:r>
+              <w:rPr/>
+              <w:t xml:space="preserve">, </w:t>
+            </w:r>
+            <w:r>
+              <w:rPr>
+                <w:rStyle w:val="SourceText"/>
+              </w:rPr>
+              <w:t>lock failed</w:t>
             </w:r>
             <w:r>
               <w:rPr/>
@@ -5108,7 +5118,7 @@
         </w:tc>
         <w:tc>
           <w:tcPr>
-            <w:tcW w:w="1504" w:type="dxa"/>
+            <w:tcW w:w="1500" w:type="dxa"/>
             <w:tcBorders/>
             <w:vAlign w:val="center"/>
           </w:tcPr>
@@ -5169,17 +5179,57 @@
       </w:r>
       <w:r>
         <w:rPr/>
-        <w:t xml:space="preserve"> runs never interleave: each holds a lock file beside the note and beside the memory (</w:t>
-      </w:r>
-      <w:r>
-        <w:rPr>
-          <w:rStyle w:val="SourceText"/>
-        </w:rPr>
-        <w:t>.&lt;name&gt;.crew-save.lock</w:t>
-      </w:r>
-      <w:r>
-        <w:rPr/>
-        <w:t xml:space="preserve">; one older than 10 minutes is removed as left by a save that died). The memory and an existing note are compared again right before each rename. An edit by another program in the instant between that compare and the rename is not detected: a rename cannot compare and swap. An existing note keeps every byte, a BOM and CRLF line endings included; only its </w:t>
+        <w:t xml:space="preserve"> runs by the same user on the same machine do not interleave: each holds two kernel locks, one for the note and one for the memory, on files in </w:t>
+      </w:r>
+      <w:r>
+        <w:rPr>
+          <w:rStyle w:val="SourceText"/>
+        </w:rPr>
+        <w:t>~/.cache/crew/memory-locks</w:t>
+      </w:r>
+      <w:r>
+        <w:rPr/>
+        <w:t xml:space="preserve"> (</w:t>
+      </w:r>
+      <w:r>
+        <w:rPr>
+          <w:rStyle w:val="SourceText"/>
+        </w:rPr>
+        <w:t>$XDG_CACHE_HOME</w:t>
+      </w:r>
+      <w:r>
+        <w:rPr/>
+        <w:t xml:space="preserve"> when set; </w:t>
+      </w:r>
+      <w:r>
+        <w:rPr>
+          <w:rStyle w:val="SourceText"/>
+        </w:rPr>
+        <w:t>%LOCALAPPDATA%\crew\memory-locks</w:t>
+      </w:r>
+      <w:r>
+        <w:rPr/>
+        <w:t xml:space="preserve"> on Windows), never in the vault. The operating system drops a lock when its save exits or is killed, so </w:t>
+      </w:r>
+      <w:r>
+        <w:rPr>
+          <w:rStyle w:val="SourceText"/>
+        </w:rPr>
+        <w:t>another save is running now</w:t>
+      </w:r>
+      <w:r>
+        <w:rPr/>
+        <w:t xml:space="preserve"> means one is running; a lock that cannot be taken at all (an unwritable cache, a full disk) is </w:t>
+      </w:r>
+      <w:r>
+        <w:rPr>
+          <w:rStyle w:val="SourceText"/>
+        </w:rPr>
+        <w:t>lock failed</w:t>
+      </w:r>
+      <w:r>
+        <w:rPr/>
+        <w:t xml:space="preserve">. The lock does not cover a save on another machine that syncs the same vault, or an edit by Claude Code, Obsidian or any other program, none of which take it. For those, the memory and an existing note are compared again right before each rename. An edit by another program in the instant between that compare and the rename is not detected: a rename cannot compare and swap. An existing note keeps every byte, a BOM and CRLF line endings included; only its </w:t>
       </w:r>
       <w:r>
         <w:rPr>

</xml_diff>

<commit_message>
L-0677 review round 3: docs say how the lock keys a file and when it fails
Skill paragraph rewrapped (NIT 2) and states the no-cache-folder case and
that every spelling of a file takes the same lock; README, memory guide
(rebuilt), CHANGELOG, codemap re-cited, rules regenerated, verify why
re-timed.

Claude-Session: https://claude.ai/code/session_016wQA2o38aSB65bpjaGpMVJ
</commit_message>
<xml_diff>
--- a/docs/guides/crew/crew-1.0-memory-and-obsidian.docx
+++ b/docs/guides/crew/crew-1.0-memory-and-obsidian.docx
@@ -5179,7 +5179,7 @@
       </w:r>
       <w:r>
         <w:rPr/>
-        <w:t xml:space="preserve"> runs by the same user on the same machine do not interleave: each holds two kernel locks, one for the note and one for the memory, on files in </w:t>
+        <w:t xml:space="preserve"> runs by the same user on the same machine do not interleave: each holds kernel locks for the note and for the memory, on files in </w:t>
       </w:r>
       <w:r>
         <w:rPr>
@@ -5219,7 +5219,17 @@
       </w:r>
       <w:r>
         <w:rPr/>
-        <w:t xml:space="preserve"> means one is running; a lock that cannot be taken at all (an unwritable cache, a full disk) is </w:t>
+        <w:t xml:space="preserve"> means one is running; a lock that cannot be taken at all (an unwritable cache, a full disk, or no absolute cache folder because </w:t>
+      </w:r>
+      <w:r>
+        <w:rPr>
+          <w:rStyle w:val="SourceText"/>
+        </w:rPr>
+        <w:t>HOME</w:t>
+      </w:r>
+      <w:r>
+        <w:rPr/>
+        <w:t xml:space="preserve"> is unset) is </w:t>
       </w:r>
       <w:r>
         <w:rPr>
@@ -5229,7 +5239,17 @@
       </w:r>
       <w:r>
         <w:rPr/>
-        <w:t xml:space="preserve">. The lock does not cover a save on another machine that syncs the same vault, or an edit by Claude Code, Obsidian or any other program, none of which take it. For those, the memory and an existing note are compared again right before each rename. An edit by another program in the instant between that compare and the rename is not detected: a rename cannot compare and swap. An existing note keeps every byte, a BOM and CRLF line endings included; only its </w:t>
+        <w:t xml:space="preserve">. A file is locked by its real path, case-folded, and by its inode, so a symlinked folder, </w:t>
+      </w:r>
+      <w:r>
+        <w:rPr>
+          <w:rStyle w:val="SourceText"/>
+        </w:rPr>
+        <w:t>..</w:t>
+      </w:r>
+      <w:r>
+        <w:rPr/>
+        <w:t xml:space="preserve">, a case variant and a hard link all meet the same lock. The lock does not cover a save on another machine that syncs the same vault, or an edit by Claude Code, Obsidian or any other program, none of which take it. For those, the memory and an existing note are compared again right before each rename. An edit by another program in the instant between that compare and the rename is not detected: a rename cannot compare and swap. An existing note keeps every byte, a BOM and CRLF line endings included; only its </w:t>
       </w:r>
       <w:r>
         <w:rPr>

</xml_diff>

<commit_message>
L-0678: crew_memory.py migrate and restore - convert a memory folder, previewed and opt-in, and undo one
migrate plans save for every memory in one native memory directory (never
MEMORY.md), refuses unportable titles and duplicate note paths, and with
--apply runs save's apply per row in name order; one failure never stops or
undoes the others. restore turns one resolving pointer back into full text
from its note; the note is never edited. No state file; a re-run is a no-op.

Tests: plugin/crew/tests/test_crew_memory_migrate.py (40 cases).
Docs: crew-memory skill, crew README, memory guide chapter (rebuilt),
codemap, verify.json rule, CHANGELOG (versionless: batch PR carries the bump).

Claude-Session: https://claude.ai/code/session_016wQA2o38aSB65bpjaGpMVJ
</commit_message>
<xml_diff>
--- a/docs/guides/crew/crew-1.0-memory-and-obsidian.docx
+++ b/docs/guides/crew/crew-1.0-memory-and-obsidian.docx
@@ -5382,7 +5382,674 @@
       </w:r>
       <w:r>
         <w:rPr/>
-        <w:t xml:space="preserve"> again. Converting existing memories in bulk arrives in a later version.</w:t>
+        <w:t xml:space="preserve"> again.</w:t>
+      </w:r>
+    </w:p>
+    <w:p>
+      <w:pPr>
+        <w:pStyle w:val="Heading3"/>
+        <w:bidi w:val="0"/>
+        <w:ind w:hanging="0" w:left="0" w:right="0"/>
+        <w:jc w:val="left"/>
+        <w:rPr/>
+      </w:pPr>
+      <w:bookmarkStart w:id="13" w:name="converting-existing-memories"/>
+      <w:bookmarkEnd w:id="13"/>
+      <w:r>
+        <w:rPr/>
+        <w:t>Converting Existing Memories</w:t>
+      </w:r>
+    </w:p>
+    <w:p>
+      <w:pPr>
+        <w:pStyle w:val="BodyText"/>
+        <w:bidi w:val="0"/>
+        <w:jc w:val="left"/>
+        <w:rPr/>
+      </w:pPr>
+      <w:r>
+        <w:rPr>
+          <w:rStyle w:val="SourceText"/>
+        </w:rPr>
+        <w:t>migrate</w:t>
+      </w:r>
+      <w:r>
+        <w:rPr/>
+        <w:t xml:space="preserve"> runs </w:t>
+      </w:r>
+      <w:r>
+        <w:rPr>
+          <w:rStyle w:val="SourceText"/>
+        </w:rPr>
+        <w:t>save</w:t>
+      </w:r>
+      <w:r>
+        <w:rPr/>
+        <w:t xml:space="preserve"> over every memory in one folder. It never runs by itself, and without </w:t>
+      </w:r>
+      <w:r>
+        <w:rPr>
+          <w:rStyle w:val="SourceText"/>
+        </w:rPr>
+        <w:t>--apply</w:t>
+      </w:r>
+      <w:r>
+        <w:rPr/>
+        <w:t xml:space="preserve"> it writes nothing:</w:t>
+      </w:r>
+    </w:p>
+    <w:p>
+      <w:pPr>
+        <w:pStyle w:val="PreformattedText"/>
+        <w:bidi w:val="0"/>
+        <w:jc w:val="left"/>
+        <w:rPr/>
+      </w:pPr>
+      <w:r>
+        <w:rPr>
+          <w:rStyle w:val="SourceText"/>
+        </w:rPr>
+        <w:t>python3 plugin/crew/hooks/scripts/crew_memory.py migrate --memory-dir &lt;memory dir&gt; --tag &lt;tag&gt;</w:t>
+      </w:r>
+    </w:p>
+    <w:p>
+      <w:pPr>
+        <w:pStyle w:val="PreformattedText"/>
+        <w:bidi w:val="0"/>
+        <w:jc w:val="left"/>
+        <w:rPr/>
+      </w:pPr>
+      <w:r>
+        <w:rPr>
+          <w:rStyle w:val="SourceText"/>
+        </w:rPr>
+        <w:t>python3 plugin/crew/hooks/scripts/crew_memory.py migrate --memory-dir &lt;memory dir&gt; --tag &lt;tag&gt; --apply</w:t>
+      </w:r>
+    </w:p>
+    <w:p>
+      <w:pPr>
+        <w:pStyle w:val="BodyText"/>
+        <w:bidi w:val="0"/>
+        <w:jc w:val="left"/>
+        <w:rPr/>
+      </w:pPr>
+      <w:r>
+        <w:rPr/>
+        <w:t xml:space="preserve">The preview has one row per memory file, in name order; </w:t>
+      </w:r>
+      <w:r>
+        <w:rPr>
+          <w:rStyle w:val="SourceText"/>
+        </w:rPr>
+        <w:t>MEMORY.md</w:t>
+      </w:r>
+      <w:r>
+        <w:rPr/>
+        <w:t xml:space="preserve"> is never a row and never edited:</w:t>
+      </w:r>
+    </w:p>
+    <w:tbl>
+      <w:tblPr>
+        <w:tblW w:w="5148" w:type="dxa"/>
+        <w:jc w:val="left"/>
+        <w:tblInd w:w="0" w:type="dxa"/>
+        <w:tblLayout w:type="fixed"/>
+        <w:tblCellMar>
+          <w:top w:w="28" w:type="dxa"/>
+          <w:left w:w="28" w:type="dxa"/>
+          <w:bottom w:w="28" w:type="dxa"/>
+          <w:right w:w="28" w:type="dxa"/>
+        </w:tblCellMar>
+      </w:tblPr>
+      <w:tblGrid>
+        <w:gridCol w:w="1221"/>
+        <w:gridCol w:w="3927"/>
+      </w:tblGrid>
+      <w:tr>
+        <w:trPr>
+          <w:tblHeader w:val="true"/>
+        </w:trPr>
+        <w:tc>
+          <w:tcPr>
+            <w:tcW w:w="1221" w:type="dxa"/>
+            <w:tcBorders/>
+            <w:vAlign w:val="center"/>
+          </w:tcPr>
+          <w:p>
+            <w:pPr>
+              <w:pStyle w:val="TableHeading"/>
+              <w:suppressLineNumbers/>
+              <w:shd w:fill="434C5E" w:val="clear"/>
+              <w:bidi w:val="0"/>
+              <w:spacing w:before="120" w:after="120"/>
+              <w:jc w:val="left"/>
+              <w:rPr/>
+            </w:pPr>
+            <w:r>
+              <w:rPr/>
+              <w:t>action</w:t>
+            </w:r>
+          </w:p>
+        </w:tc>
+        <w:tc>
+          <w:tcPr>
+            <w:tcW w:w="3927" w:type="dxa"/>
+            <w:tcBorders/>
+            <w:vAlign w:val="center"/>
+          </w:tcPr>
+          <w:p>
+            <w:pPr>
+              <w:pStyle w:val="TableHeading"/>
+              <w:suppressLineNumbers/>
+              <w:shd w:fill="434C5E" w:val="clear"/>
+              <w:bidi w:val="0"/>
+              <w:spacing w:before="120" w:after="120"/>
+              <w:jc w:val="left"/>
+              <w:rPr/>
+            </w:pPr>
+            <w:r>
+              <w:rPr/>
+              <w:t>meaning</w:t>
+            </w:r>
+          </w:p>
+        </w:tc>
+      </w:tr>
+      <w:tr>
+        <w:trPr/>
+        <w:tc>
+          <w:tcPr>
+            <w:tcW w:w="1221" w:type="dxa"/>
+            <w:tcBorders/>
+            <w:vAlign w:val="center"/>
+          </w:tcPr>
+          <w:p>
+            <w:pPr>
+              <w:pStyle w:val="TableContents"/>
+              <w:shd w:fill="2E3440" w:val="clear"/>
+              <w:bidi w:val="0"/>
+              <w:spacing w:before="120" w:after="120"/>
+              <w:jc w:val="left"/>
+              <w:rPr/>
+            </w:pPr>
+            <w:r>
+              <w:rPr>
+                <w:rStyle w:val="SourceText"/>
+              </w:rPr>
+              <w:t>convert</w:t>
+            </w:r>
+          </w:p>
+        </w:tc>
+        <w:tc>
+          <w:tcPr>
+            <w:tcW w:w="3927" w:type="dxa"/>
+            <w:tcBorders/>
+            <w:vAlign w:val="center"/>
+          </w:tcPr>
+          <w:p>
+            <w:pPr>
+              <w:pStyle w:val="TableContents"/>
+              <w:shd w:fill="2E3440" w:val="clear"/>
+              <w:bidi w:val="0"/>
+              <w:spacing w:before="120" w:after="120"/>
+              <w:jc w:val="left"/>
+              <w:rPr/>
+            </w:pPr>
+            <w:r>
+              <w:rPr>
+                <w:rStyle w:val="SourceText"/>
+              </w:rPr>
+              <w:t>save</w:t>
+            </w:r>
+            <w:r>
+              <w:rPr/>
+              <w:t xml:space="preserve"> would create the note shown</w:t>
+            </w:r>
+          </w:p>
+        </w:tc>
+      </w:tr>
+      <w:tr>
+        <w:trPr/>
+        <w:tc>
+          <w:tcPr>
+            <w:tcW w:w="1221" w:type="dxa"/>
+            <w:tcBorders/>
+            <w:vAlign w:val="center"/>
+          </w:tcPr>
+          <w:p>
+            <w:pPr>
+              <w:pStyle w:val="TableContents"/>
+              <w:shd w:fill="2E3440" w:val="clear"/>
+              <w:bidi w:val="0"/>
+              <w:spacing w:before="120" w:after="120"/>
+              <w:jc w:val="left"/>
+              <w:rPr/>
+            </w:pPr>
+            <w:r>
+              <w:rPr>
+                <w:rStyle w:val="SourceText"/>
+              </w:rPr>
+              <w:t>append</w:t>
+            </w:r>
+          </w:p>
+        </w:tc>
+        <w:tc>
+          <w:tcPr>
+            <w:tcW w:w="3927" w:type="dxa"/>
+            <w:tcBorders/>
+            <w:vAlign w:val="center"/>
+          </w:tcPr>
+          <w:p>
+            <w:pPr>
+              <w:pStyle w:val="TableContents"/>
+              <w:shd w:fill="2E3440" w:val="clear"/>
+              <w:bidi w:val="0"/>
+              <w:spacing w:before="120" w:after="120"/>
+              <w:jc w:val="left"/>
+              <w:rPr/>
+            </w:pPr>
+            <w:r>
+              <w:rPr/>
+              <w:t xml:space="preserve">a note with this </w:t>
+            </w:r>
+            <w:r>
+              <w:rPr>
+                <w:rStyle w:val="SourceText"/>
+              </w:rPr>
+              <w:t>memory_id</w:t>
+            </w:r>
+            <w:r>
+              <w:rPr/>
+              <w:t xml:space="preserve"> already exists; </w:t>
+            </w:r>
+            <w:r>
+              <w:rPr>
+                <w:rStyle w:val="SourceText"/>
+              </w:rPr>
+              <w:t>save</w:t>
+            </w:r>
+            <w:r>
+              <w:rPr/>
+              <w:t xml:space="preserve"> would add to it</w:t>
+            </w:r>
+          </w:p>
+        </w:tc>
+      </w:tr>
+      <w:tr>
+        <w:trPr/>
+        <w:tc>
+          <w:tcPr>
+            <w:tcW w:w="1221" w:type="dxa"/>
+            <w:tcBorders/>
+            <w:vAlign w:val="center"/>
+          </w:tcPr>
+          <w:p>
+            <w:pPr>
+              <w:pStyle w:val="TableContents"/>
+              <w:shd w:fill="2E3440" w:val="clear"/>
+              <w:bidi w:val="0"/>
+              <w:spacing w:before="120" w:after="120"/>
+              <w:jc w:val="left"/>
+              <w:rPr/>
+            </w:pPr>
+            <w:r>
+              <w:rPr>
+                <w:rStyle w:val="SourceText"/>
+              </w:rPr>
+              <w:t>skip: already a pointer</w:t>
+            </w:r>
+          </w:p>
+        </w:tc>
+        <w:tc>
+          <w:tcPr>
+            <w:tcW w:w="3927" w:type="dxa"/>
+            <w:tcBorders/>
+            <w:vAlign w:val="center"/>
+          </w:tcPr>
+          <w:p>
+            <w:pPr>
+              <w:pStyle w:val="TableContents"/>
+              <w:shd w:fill="2E3440" w:val="clear"/>
+              <w:bidi w:val="0"/>
+              <w:spacing w:before="120" w:after="120"/>
+              <w:jc w:val="left"/>
+              <w:rPr/>
+            </w:pPr>
+            <w:r>
+              <w:rPr/>
+              <w:t>nothing to do</w:t>
+            </w:r>
+          </w:p>
+        </w:tc>
+      </w:tr>
+      <w:tr>
+        <w:trPr/>
+        <w:tc>
+          <w:tcPr>
+            <w:tcW w:w="1221" w:type="dxa"/>
+            <w:tcBorders/>
+            <w:vAlign w:val="center"/>
+          </w:tcPr>
+          <w:p>
+            <w:pPr>
+              <w:pStyle w:val="TableContents"/>
+              <w:shd w:fill="2E3440" w:val="clear"/>
+              <w:bidi w:val="0"/>
+              <w:spacing w:before="120" w:after="120"/>
+              <w:jc w:val="left"/>
+              <w:rPr/>
+            </w:pPr>
+            <w:r>
+              <w:rPr>
+                <w:rStyle w:val="SourceText"/>
+              </w:rPr>
+              <w:t>skip: &lt;state&gt;</w:t>
+            </w:r>
+          </w:p>
+        </w:tc>
+        <w:tc>
+          <w:tcPr>
+            <w:tcW w:w="3927" w:type="dxa"/>
+            <w:tcBorders/>
+            <w:vAlign w:val="center"/>
+          </w:tcPr>
+          <w:p>
+            <w:pPr>
+              <w:pStyle w:val="TableContents"/>
+              <w:shd w:fill="2E3440" w:val="clear"/>
+              <w:bidi w:val="0"/>
+              <w:spacing w:before="120" w:after="120"/>
+              <w:jc w:val="left"/>
+              <w:rPr/>
+            </w:pPr>
+            <w:r>
+              <w:rPr/>
+              <w:t xml:space="preserve">a pointer that does not resolve, or a </w:t>
+            </w:r>
+            <w:r>
+              <w:rPr>
+                <w:rStyle w:val="SourceText"/>
+              </w:rPr>
+              <w:t>malformed</w:t>
+            </w:r>
+            <w:r>
+              <w:rPr/>
+              <w:t xml:space="preserve"> one</w:t>
+            </w:r>
+          </w:p>
+        </w:tc>
+      </w:tr>
+      <w:tr>
+        <w:trPr/>
+        <w:tc>
+          <w:tcPr>
+            <w:tcW w:w="1221" w:type="dxa"/>
+            <w:tcBorders/>
+            <w:vAlign w:val="center"/>
+          </w:tcPr>
+          <w:p>
+            <w:pPr>
+              <w:pStyle w:val="TableContents"/>
+              <w:shd w:fill="2E3440" w:val="clear"/>
+              <w:bidi w:val="0"/>
+              <w:spacing w:before="120" w:after="120"/>
+              <w:jc w:val="left"/>
+              <w:rPr/>
+            </w:pPr>
+            <w:r>
+              <w:rPr>
+                <w:rStyle w:val="SourceText"/>
+              </w:rPr>
+              <w:t>refuse: &lt;reason&gt;</w:t>
+            </w:r>
+          </w:p>
+        </w:tc>
+        <w:tc>
+          <w:tcPr>
+            <w:tcW w:w="3927" w:type="dxa"/>
+            <w:tcBorders/>
+            <w:vAlign w:val="center"/>
+          </w:tcPr>
+          <w:p>
+            <w:pPr>
+              <w:pStyle w:val="TableContents"/>
+              <w:shd w:fill="2E3440" w:val="clear"/>
+              <w:bidi w:val="0"/>
+              <w:spacing w:before="120" w:after="120"/>
+              <w:jc w:val="left"/>
+              <w:rPr/>
+            </w:pPr>
+            <w:r>
+              <w:rPr/>
+              <w:t xml:space="preserve">anything </w:t>
+            </w:r>
+            <w:r>
+              <w:rPr>
+                <w:rStyle w:val="SourceText"/>
+              </w:rPr>
+              <w:t>save</w:t>
+            </w:r>
+            <w:r>
+              <w:rPr/>
+              <w:t xml:space="preserve"> refuses, a title that is not a portable file name (</w:t>
+            </w:r>
+            <w:r>
+              <w:rPr>
+                <w:rStyle w:val="SourceText"/>
+              </w:rPr>
+              <w:t>: ? * &lt; &gt; \| " \</w:t>
+            </w:r>
+            <w:r>
+              <w:rPr/>
+              <w:t xml:space="preserve">, a trailing dot or space, a device name such as </w:t>
+            </w:r>
+            <w:r>
+              <w:rPr>
+                <w:rStyle w:val="SourceText"/>
+              </w:rPr>
+              <w:t>CON</w:t>
+            </w:r>
+            <w:r>
+              <w:rPr/>
+              <w:t>), or two files that would write one note (</w:t>
+            </w:r>
+            <w:r>
+              <w:rPr>
+                <w:rStyle w:val="SourceText"/>
+              </w:rPr>
+              <w:t>duplicate note path</w:t>
+            </w:r>
+            <w:r>
+              <w:rPr/>
+              <w:t>)</w:t>
+            </w:r>
+          </w:p>
+        </w:tc>
+      </w:tr>
+    </w:tbl>
+    <w:p>
+      <w:pPr>
+        <w:pStyle w:val="BodyText"/>
+        <w:bidi w:val="0"/>
+        <w:jc w:val="left"/>
+        <w:rPr/>
+      </w:pPr>
+      <w:r>
+        <w:rPr/>
+        <w:t xml:space="preserve">With </w:t>
+      </w:r>
+      <w:r>
+        <w:rPr>
+          <w:rStyle w:val="SourceText"/>
+        </w:rPr>
+        <w:t>--apply</w:t>
+      </w:r>
+      <w:r>
+        <w:rPr/>
+        <w:t xml:space="preserve">, each </w:t>
+      </w:r>
+      <w:r>
+        <w:rPr>
+          <w:rStyle w:val="SourceText"/>
+        </w:rPr>
+        <w:t>convert</w:t>
+      </w:r>
+      <w:r>
+        <w:rPr/>
+        <w:t xml:space="preserve"> and </w:t>
+      </w:r>
+      <w:r>
+        <w:rPr>
+          <w:rStyle w:val="SourceText"/>
+        </w:rPr>
+        <w:t>append</w:t>
+      </w:r>
+      <w:r>
+        <w:rPr/>
+        <w:t xml:space="preserve"> row is saved one file at a time. A file whose save fails is shown as </w:t>
+      </w:r>
+      <w:r>
+        <w:rPr>
+          <w:rStyle w:val="SourceText"/>
+        </w:rPr>
+        <w:t>failed</w:t>
+      </w:r>
+      <w:r>
+        <w:rPr/>
+        <w:t xml:space="preserve"> with </w:t>
+      </w:r>
+      <w:r>
+        <w:rPr>
+          <w:rStyle w:val="SourceText"/>
+        </w:rPr>
+        <w:t>save</w:t>
+      </w:r>
+      <w:r>
+        <w:rPr/>
+        <w:t xml:space="preserve">'s </w:t>
+      </w:r>
+      <w:r>
+        <w:rPr>
+          <w:rStyle w:val="SourceText"/>
+        </w:rPr>
+        <w:t>kept-full-text</w:t>
+      </w:r>
+      <w:r>
+        <w:rPr/>
+        <w:t xml:space="preserve"> reason, and the others still go ahead. One </w:t>
+      </w:r>
+      <w:r>
+        <w:rPr>
+          <w:rStyle w:val="SourceText"/>
+        </w:rPr>
+        <w:t>--tag</w:t>
+      </w:r>
+      <w:r>
+        <w:rPr/>
+        <w:t xml:space="preserve"> set covers the run; use </w:t>
+      </w:r>
+      <w:r>
+        <w:rPr>
+          <w:rStyle w:val="SourceText"/>
+        </w:rPr>
+        <w:t>--only &lt;file name&gt;</w:t>
+      </w:r>
+      <w:r>
+        <w:rPr/>
+        <w:t xml:space="preserve"> to run batches with different tags. </w:t>
+      </w:r>
+      <w:r>
+        <w:rPr>
+          <w:rStyle w:val="SourceText"/>
+        </w:rPr>
+        <w:t>--note-dir</w:t>
+      </w:r>
+      <w:r>
+        <w:rPr/>
+        <w:t xml:space="preserve">, </w:t>
+      </w:r>
+      <w:r>
+        <w:rPr>
+          <w:rStyle w:val="SourceText"/>
+        </w:rPr>
+        <w:t>--type</w:t>
+      </w:r>
+      <w:r>
+        <w:rPr/>
+        <w:t xml:space="preserve"> and </w:t>
+      </w:r>
+      <w:r>
+        <w:rPr>
+          <w:rStyle w:val="SourceText"/>
+        </w:rPr>
+        <w:t>--project</w:t>
+      </w:r>
+      <w:r>
+        <w:rPr/>
+        <w:t xml:space="preserve"> work as they do for </w:t>
+      </w:r>
+      <w:r>
+        <w:rPr>
+          <w:rStyle w:val="SourceText"/>
+        </w:rPr>
+        <w:t>save</w:t>
+      </w:r>
+      <w:r>
+        <w:rPr/>
+        <w:t>. Nothing is recorded between runs, so running it again converts nothing twice.</w:t>
+      </w:r>
+    </w:p>
+    <w:p>
+      <w:pPr>
+        <w:pStyle w:val="BodyText"/>
+        <w:bidi w:val="0"/>
+        <w:jc w:val="left"/>
+        <w:rPr/>
+      </w:pPr>
+      <w:r>
+        <w:rPr>
+          <w:rStyle w:val="SourceText"/>
+        </w:rPr>
+        <w:t>restore</w:t>
+      </w:r>
+      <w:r>
+        <w:rPr/>
+        <w:t xml:space="preserve"> is the way back for one memory:</w:t>
+      </w:r>
+    </w:p>
+    <w:p>
+      <w:pPr>
+        <w:pStyle w:val="PreformattedText"/>
+        <w:bidi w:val="0"/>
+        <w:jc w:val="left"/>
+        <w:rPr/>
+      </w:pPr>
+      <w:r>
+        <w:rPr>
+          <w:rStyle w:val="SourceText"/>
+        </w:rPr>
+        <w:t>python3 plugin/crew/hooks/scripts/crew_memory.py restore --file &lt;memory file&gt; --apply</w:t>
+      </w:r>
+    </w:p>
+    <w:p>
+      <w:pPr>
+        <w:pStyle w:val="BodyText"/>
+        <w:bidi w:val="0"/>
+        <w:jc w:val="left"/>
+        <w:rPr/>
+      </w:pPr>
+      <w:r>
+        <w:rPr/>
+        <w:t xml:space="preserve">It puts the note's text back as the memory's body (frontmatter kept) and leaves the note alone. Without </w:t>
+      </w:r>
+      <w:r>
+        <w:rPr>
+          <w:rStyle w:val="SourceText"/>
+        </w:rPr>
+        <w:t>--apply</w:t>
+      </w:r>
+      <w:r>
+        <w:rPr/>
+        <w:t xml:space="preserve"> it shows the first line and the line count. A pointer that does not resolve is reported and nothing is written.</w:t>
       </w:r>
     </w:p>
     <w:p>
@@ -5393,8 +6060,8 @@
         <w:jc w:val="left"/>
         <w:rPr/>
       </w:pPr>
-      <w:bookmarkStart w:id="13" w:name="confirming-recall-reaches-your-sessions"/>
-      <w:bookmarkEnd w:id="13"/>
+      <w:bookmarkStart w:id="14" w:name="confirming-recall-reaches-your-sessions"/>
+      <w:bookmarkEnd w:id="14"/>
       <w:r>
         <w:rPr/>
         <w:t>Confirming Recall Reaches Your Sessions</w:t>
@@ -5420,8 +6087,8 @@
         <w:jc w:val="left"/>
         <w:rPr/>
       </w:pPr>
-      <w:bookmarkStart w:id="14" w:name="path-scoped-rules-from-the-code-map"/>
-      <w:bookmarkEnd w:id="14"/>
+      <w:bookmarkStart w:id="15" w:name="path-scoped-rules-from-the-code-map"/>
+      <w:bookmarkEnd w:id="15"/>
       <w:r>
         <w:rPr/>
         <w:t>Path-Scoped Rules from the Code Map</w:t>
@@ -5674,8 +6341,8 @@
         <w:jc w:val="left"/>
         <w:rPr/>
       </w:pPr>
-      <w:bookmarkStart w:id="15" w:name="confirming-recall-reaches-your-sessions_"/>
-      <w:bookmarkEnd w:id="15"/>
+      <w:bookmarkStart w:id="16" w:name="confirming-recall-reaches-your-sessions_"/>
+      <w:bookmarkEnd w:id="16"/>
       <w:r>
         <w:rPr/>
         <w:t>Confirming Recall Reaches Your Sessions</w:t>
@@ -5823,8 +6490,8 @@
         <w:jc w:val="left"/>
         <w:rPr/>
       </w:pPr>
-      <w:bookmarkStart w:id="16" w:name="which-channel-reaches-which-agent"/>
-      <w:bookmarkEnd w:id="16"/>
+      <w:bookmarkStart w:id="17" w:name="which-channel-reaches-which-agent"/>
+      <w:bookmarkEnd w:id="17"/>
       <w:r>
         <w:rPr/>
         <w:t>Which Channel Reaches Which Agent</w:t>
@@ -6296,8 +6963,8 @@
         <w:jc w:val="left"/>
         <w:rPr/>
       </w:pPr>
-      <w:bookmarkStart w:id="17" w:name="where-recall-comes-from"/>
-      <w:bookmarkEnd w:id="17"/>
+      <w:bookmarkStart w:id="18" w:name="where-recall-comes-from"/>
+      <w:bookmarkEnd w:id="18"/>
       <w:r>
         <w:rPr/>
         <w:t>Where Recall Comes From</w:t>
@@ -6501,12 +7168,64 @@
           <w:tab w:val="left" w:pos="829" w:leader="none"/>
         </w:tabs>
         <w:bidi w:val="0"/>
+        <w:spacing w:before="120" w:after="0"/>
         <w:ind w:hanging="283" w:left="829"/>
         <w:jc w:val="left"/>
         <w:rPr/>
       </w:pPr>
       <w:r>
         <w:rPr/>
+        <w:t xml:space="preserve">An empty recall can be the CLI working as meant: it skips stop words, needs more than one matching word for a query of three or more words, matches whole words only, and never reads </w:t>
+      </w:r>
+      <w:r>
+        <w:rPr>
+          <w:rStyle w:val="SourceText"/>
+        </w:rPr>
+        <w:t>wiki/sessions/archive/</w:t>
+      </w:r>
+      <w:r>
+        <w:rPr/>
+        <w:t xml:space="preserve">. To check whether a note is there but held back, run the CLI with </w:t>
+      </w:r>
+      <w:r>
+        <w:rPr>
+          <w:rStyle w:val="SourceText"/>
+        </w:rPr>
+        <w:t>--min-terms 1</w:t>
+      </w:r>
+      <w:r>
+        <w:rPr/>
+        <w:t xml:space="preserve"> (no floor) and </w:t>
+      </w:r>
+      <w:r>
+        <w:rPr>
+          <w:rStyle w:val="SourceText"/>
+        </w:rPr>
+        <w:t>--include-excluded</w:t>
+      </w:r>
+      <w:r>
+        <w:rPr/>
+        <w:t xml:space="preserve"> (the archive too). </w:t>
+      </w:r>
+    </w:p>
+    <w:p>
+      <w:pPr>
+        <w:pStyle w:val="BodyText"/>
+        <w:numPr>
+          <w:ilvl w:val="0"/>
+          <w:numId w:val="4"/>
+        </w:numPr>
+        <w:tabs>
+          <w:tab w:val="clear" w:pos="1134"/>
+          <w:tab w:val="left" w:pos="829" w:leader="none"/>
+        </w:tabs>
+        <w:bidi w:val="0"/>
+        <w:ind w:hanging="283" w:left="829"/>
+        <w:jc w:val="left"/>
+        <w:rPr/>
+      </w:pPr>
+      <w:r>
+        <w:rPr/>
         <w:t xml:space="preserve">Every recall line starts with the vault's name: </w:t>
       </w:r>
       <w:r>
@@ -6528,8 +7247,8 @@
         <w:jc w:val="left"/>
         <w:rPr/>
       </w:pPr>
-      <w:bookmarkStart w:id="18" w:name="the-seeded-note-proof"/>
-      <w:bookmarkEnd w:id="18"/>
+      <w:bookmarkStart w:id="19" w:name="the-seeded-note-proof"/>
+      <w:bookmarkEnd w:id="19"/>
       <w:r>
         <w:rPr/>
         <w:t>The Seeded-Note Proof</w:t>
@@ -6975,8 +7694,8 @@
         <w:jc w:val="left"/>
         <w:rPr/>
       </w:pPr>
-      <w:bookmarkStart w:id="19" w:name="measured-against-the-real-vault_opspy-re"/>
-      <w:bookmarkEnd w:id="19"/>
+      <w:bookmarkStart w:id="20" w:name="measured-against-the-real-vault_opspy-re"/>
+      <w:bookmarkEnd w:id="20"/>
       <w:r>
         <w:rPr/>
         <w:t xml:space="preserve">Measured against the real </w:t>
@@ -7243,8 +7962,8 @@
         <w:jc w:val="left"/>
         <w:rPr/>
       </w:pPr>
-      <w:bookmarkStart w:id="20" w:name="reading-stats"/>
-      <w:bookmarkEnd w:id="20"/>
+      <w:bookmarkStart w:id="21" w:name="reading-stats"/>
+      <w:bookmarkEnd w:id="21"/>
       <w:r>
         <w:rPr/>
         <w:t xml:space="preserve">Reading </w:t>

</xml_diff>

<commit_message>
L-0678: review round 1 - a second project's folder never appends to the first's note
FIX 1: an existing note joins a migrate row as `append` only when its
frontmatter project: is this run's; else `refuse: note belongs to another
project (<project>/<memory_id>)`. The default project is <slug> for
~/.claude/projects/<slug>/memory, else --root's basename; --project with
'/' is a usage error. FIX 2: test the restore re-compare under the lock.
FIX 3: the failed file stays byte-identical. NITs: COM0/LPT0 and the
superscript device names, a vanished file is a refuse row, a folder named
x.md is `refuse: not a file`.

Claude-Session: https://claude.ai/code/session_016wQA2o38aSB65bpjaGpMVJ
</commit_message>
<xml_diff>
--- a/docs/guides/crew/crew-1.0-memory-and-obsidian.docx
+++ b/docs/guides/crew/crew-1.0-memory-and-obsidian.docx
@@ -5502,8 +5502,8 @@
         </w:tblCellMar>
       </w:tblPr>
       <w:tblGrid>
-        <w:gridCol w:w="1221"/>
-        <w:gridCol w:w="3927"/>
+        <w:gridCol w:w="1156"/>
+        <w:gridCol w:w="3992"/>
       </w:tblGrid>
       <w:tr>
         <w:trPr>
@@ -5511,7 +5511,7 @@
         </w:trPr>
         <w:tc>
           <w:tcPr>
-            <w:tcW w:w="1221" w:type="dxa"/>
+            <w:tcW w:w="1156" w:type="dxa"/>
             <w:tcBorders/>
             <w:vAlign w:val="center"/>
           </w:tcPr>
@@ -5533,7 +5533,7 @@
         </w:tc>
         <w:tc>
           <w:tcPr>
-            <w:tcW w:w="3927" w:type="dxa"/>
+            <w:tcW w:w="3992" w:type="dxa"/>
             <w:tcBorders/>
             <w:vAlign w:val="center"/>
           </w:tcPr>
@@ -5558,7 +5558,7 @@
         <w:trPr/>
         <w:tc>
           <w:tcPr>
-            <w:tcW w:w="1221" w:type="dxa"/>
+            <w:tcW w:w="1156" w:type="dxa"/>
             <w:tcBorders/>
             <w:vAlign w:val="center"/>
           </w:tcPr>
@@ -5581,7 +5581,7 @@
         </w:tc>
         <w:tc>
           <w:tcPr>
-            <w:tcW w:w="3927" w:type="dxa"/>
+            <w:tcW w:w="3992" w:type="dxa"/>
             <w:tcBorders/>
             <w:vAlign w:val="center"/>
           </w:tcPr>
@@ -5611,7 +5611,7 @@
         <w:trPr/>
         <w:tc>
           <w:tcPr>
-            <w:tcW w:w="1221" w:type="dxa"/>
+            <w:tcW w:w="1156" w:type="dxa"/>
             <w:tcBorders/>
             <w:vAlign w:val="center"/>
           </w:tcPr>
@@ -5634,7 +5634,7 @@
         </w:tc>
         <w:tc>
           <w:tcPr>
-            <w:tcW w:w="3927" w:type="dxa"/>
+            <w:tcW w:w="3992" w:type="dxa"/>
             <w:tcBorders/>
             <w:vAlign w:val="center"/>
           </w:tcPr>
@@ -5678,7 +5678,7 @@
         <w:trPr/>
         <w:tc>
           <w:tcPr>
-            <w:tcW w:w="1221" w:type="dxa"/>
+            <w:tcW w:w="1156" w:type="dxa"/>
             <w:tcBorders/>
             <w:vAlign w:val="center"/>
           </w:tcPr>
@@ -5701,7 +5701,7 @@
         </w:tc>
         <w:tc>
           <w:tcPr>
-            <w:tcW w:w="3927" w:type="dxa"/>
+            <w:tcW w:w="3992" w:type="dxa"/>
             <w:tcBorders/>
             <w:vAlign w:val="center"/>
           </w:tcPr>
@@ -5725,7 +5725,7 @@
         <w:trPr/>
         <w:tc>
           <w:tcPr>
-            <w:tcW w:w="1221" w:type="dxa"/>
+            <w:tcW w:w="1156" w:type="dxa"/>
             <w:tcBorders/>
             <w:vAlign w:val="center"/>
           </w:tcPr>
@@ -5748,7 +5748,7 @@
         </w:tc>
         <w:tc>
           <w:tcPr>
-            <w:tcW w:w="3927" w:type="dxa"/>
+            <w:tcW w:w="3992" w:type="dxa"/>
             <w:tcBorders/>
             <w:vAlign w:val="center"/>
           </w:tcPr>
@@ -5782,7 +5782,7 @@
         <w:trPr/>
         <w:tc>
           <w:tcPr>
-            <w:tcW w:w="1221" w:type="dxa"/>
+            <w:tcW w:w="1156" w:type="dxa"/>
             <w:tcBorders/>
             <w:vAlign w:val="center"/>
           </w:tcPr>
@@ -5805,7 +5805,7 @@
         </w:tc>
         <w:tc>
           <w:tcPr>
-            <w:tcW w:w="3927" w:type="dxa"/>
+            <w:tcW w:w="3992" w:type="dxa"/>
             <w:tcBorders/>
             <w:vAlign w:val="center"/>
           </w:tcPr>
@@ -5850,7 +5850,7 @@
             </w:r>
             <w:r>
               <w:rPr/>
-              <w:t>), or two files that would write one note (</w:t>
+              <w:t>), two files that would write one note (</w:t>
             </w:r>
             <w:r>
               <w:rPr>
@@ -5860,6 +5860,26 @@
             </w:r>
             <w:r>
               <w:rPr/>
+              <w:t>), a note that belongs to another project (</w:t>
+            </w:r>
+            <w:r>
+              <w:rPr>
+                <w:rStyle w:val="SourceText"/>
+              </w:rPr>
+              <w:t>note belongs to another project</w:t>
+            </w:r>
+            <w:r>
+              <w:rPr/>
+              <w:t>), or a folder named like a memory (</w:t>
+            </w:r>
+            <w:r>
+              <w:rPr>
+                <w:rStyle w:val="SourceText"/>
+              </w:rPr>
+              <w:t>not a file</w:t>
+            </w:r>
+            <w:r>
+              <w:rPr/>
               <w:t>)</w:t>
             </w:r>
           </w:p>
@@ -5995,7 +6015,37 @@
       </w:r>
       <w:r>
         <w:rPr/>
-        <w:t>. Nothing is recorded between runs, so running it again converts nothing twice.</w:t>
+        <w:t xml:space="preserve">; without </w:t>
+      </w:r>
+      <w:r>
+        <w:rPr>
+          <w:rStyle w:val="SourceText"/>
+        </w:rPr>
+        <w:t>--project</w:t>
+      </w:r>
+      <w:r>
+        <w:rPr/>
+        <w:t xml:space="preserve">, a folder </w:t>
+      </w:r>
+      <w:r>
+        <w:rPr>
+          <w:rStyle w:val="SourceText"/>
+        </w:rPr>
+        <w:t>~/.claude/projects/&lt;slug&gt;/memory</w:t>
+      </w:r>
+      <w:r>
+        <w:rPr/>
+        <w:t xml:space="preserve"> uses </w:t>
+      </w:r>
+      <w:r>
+        <w:rPr>
+          <w:rStyle w:val="SourceText"/>
+        </w:rPr>
+        <w:t>&lt;slug&gt;</w:t>
+      </w:r>
+      <w:r>
+        <w:rPr/>
+        <w:t xml:space="preserve"> as the project, so two projects' memories never land in one note. Nothing is recorded between runs, so running it again converts nothing twice.</w:t>
       </w:r>
     </w:p>
     <w:p>

</xml_diff>